<commit_message>
docs: add college and university logos and page borders
</commit_message>
<xml_diff>
--- a/ChainGuard_v2_Technical_Seminar_Report.docx
+++ b/ChainGuard_v2_Technical_Seminar_Report.docx
@@ -2,54 +2,202 @@
 <file path=word/document.xml><?xml version="1.0" encoding="utf-8"?>
 <w:document xmlns:wpc="http://schemas.microsoft.com/office/word/2010/wordprocessingCanvas" xmlns:cx="http://schemas.microsoft.com/office/drawing/2014/chartex" xmlns:cx1="http://schemas.microsoft.com/office/drawing/2015/9/8/chartex" xmlns:cx2="http://schemas.microsoft.com/office/drawing/2015/10/21/chartex" xmlns:cx3="http://schemas.microsoft.com/office/drawing/2016/5/9/chartex" xmlns:cx4="http://schemas.microsoft.com/office/drawing/2016/5/10/chartex" xmlns:cx5="http://schemas.microsoft.com/office/drawing/2016/5/11/chartex" xmlns:cx6="http://schemas.microsoft.com/office/drawing/2016/5/12/chartex" xmlns:cx7="http://schemas.microsoft.com/office/drawing/2016/5/13/chartex" xmlns:cx8="http://schemas.microsoft.com/office/drawing/2016/5/14/chartex" xmlns:mc="http://schemas.openxmlformats.org/markup-compatibility/2006" xmlns:aink="http://schemas.microsoft.com/office/drawing/2016/ink" xmlns:am3d="http://schemas.microsoft.com/office/drawing/2017/model3d" xmlns:o="urn:schemas-microsoft-com:office:office" xmlns:oel="http://schemas.microsoft.com/office/2019/extlst" xmlns:r="http://schemas.openxmlformats.org/officeDocument/2006/relationships" xmlns:m="http://schemas.openxmlformats.org/officeDocument/2006/math" xmlns:v="urn:schemas-microsoft-com:vml" xmlns:wp14="http://schemas.microsoft.com/office/word/2010/wordprocessingDrawing" xmlns:wp="http://schemas.openxmlformats.org/drawingml/2006/wordprocessingDrawing" xmlns:w10="urn:schemas-microsoft-com:office:word" xmlns:w="http://schemas.openxmlformats.org/wordprocessingml/2006/main" xmlns:w14="http://schemas.microsoft.com/office/word/2010/wordml" xmlns:w15="http://schemas.microsoft.com/office/word/2012/wordml" xmlns:w16cex="http://schemas.microsoft.com/office/word/2018/wordml/cex" xmlns:w16cid="http://schemas.microsoft.com/office/word/2016/wordml/cid" xmlns:w16="http://schemas.microsoft.com/office/word/2018/wordml" xmlns:w16du="http://schemas.microsoft.com/office/word/2023/wordml/word16du" xmlns:w16sdtdh="http://schemas.microsoft.com/office/word/2020/wordml/sdtdatahash" xmlns:w16sdtfl="http://schemas.microsoft.com/office/word/2024/wordml/sdtformatlock" xmlns:w16se="http://schemas.microsoft.com/office/word/2015/wordml/symex" xmlns:wpg="http://schemas.microsoft.com/office/word/2010/wordprocessingGroup" xmlns:wpi="http://schemas.microsoft.com/office/word/2010/wordprocessingInk" xmlns:wne="http://schemas.microsoft.com/office/word/2006/wordml" xmlns:wps="http://schemas.microsoft.com/office/word/2010/wordprocessingShape" mc:Ignorable="w14 w15 w16se w16cid w16 w16cex w16sdtdh w16sdtfl w16du wp14">
   <w:body>
-    <w:p>
-      <w:pPr>
-        <w:spacing w:before="80" w:line="240" w:lineRule="auto"/>
+    <w:tbl>
+      <w:tblPr>
+        <w:tblW w:w="0" w:type="auto"/>
         <w:jc w:val="center"/>
-      </w:pPr>
-      <w:r>
-        <w:rPr>
-          <w:b/>
-        </w:rPr>
-        <w:t>Nutan Maharashtra Vidya Prasarak Mandal’s (NMVPM’s)</w:t>
-      </w:r>
-    </w:p>
-    <w:p>
-      <w:pPr>
-        <w:spacing w:line="240" w:lineRule="auto"/>
-        <w:jc w:val="center"/>
-      </w:pPr>
-      <w:r>
-        <w:rPr>
-          <w:b/>
-          <w:sz w:val="27"/>
-        </w:rPr>
-        <w:t>NUTAN MAHARASHTRA INSTITUTE OF ENGINEERING AND TECHNOLOGY (NMIET)</w:t>
-      </w:r>
-    </w:p>
-    <w:p>
-      <w:pPr>
-        <w:spacing w:line="240" w:lineRule="auto"/>
-        <w:jc w:val="center"/>
-      </w:pPr>
-      <w:r>
-        <w:rPr>
-          <w:sz w:val="22"/>
-        </w:rPr>
-        <w:t>Under Administrative Support - Pimpri Chinchwad Education Trust (PCET)</w:t>
-      </w:r>
-    </w:p>
-    <w:p>
-      <w:pPr>
-        <w:spacing w:after="680" w:line="240" w:lineRule="auto"/>
-        <w:jc w:val="center"/>
-      </w:pPr>
-      <w:r>
-        <w:rPr>
-          <w:b/>
-        </w:rPr>
-        <w:t>Computer Science and Engineering Department</w:t>
-      </w:r>
+        <w:tblBorders>
+          <w:top w:val="nil"/>
+          <w:left w:val="nil"/>
+          <w:bottom w:val="nil"/>
+          <w:right w:val="nil"/>
+          <w:insideH w:val="nil"/>
+          <w:insideV w:val="nil"/>
+        </w:tblBorders>
+        <w:tblLayout w:type="fixed"/>
+        <w:tblCellMar>
+          <w:left w:w="28" w:type="dxa"/>
+          <w:right w:w="28" w:type="dxa"/>
+        </w:tblCellMar>
+        <w:tblLook w:val="04A0" w:firstRow="1" w:lastRow="0" w:firstColumn="1" w:lastColumn="0" w:noHBand="0" w:noVBand="1"/>
+      </w:tblPr>
+      <w:tblGrid>
+        <w:gridCol w:w="1296"/>
+        <w:gridCol w:w="6480"/>
+        <w:gridCol w:w="1296"/>
+      </w:tblGrid>
+      <w:tr>
+        <w:trPr>
+          <w:cantSplit/>
+          <w:jc w:val="center"/>
+        </w:trPr>
+        <w:tc>
+          <w:tcPr>
+            <w:tcW w:w="1296" w:type="dxa"/>
+            <w:vAlign w:val="center"/>
+          </w:tcPr>
+          <w:p>
+            <w:pPr>
+              <w:spacing w:after="0" w:line="240" w:lineRule="auto"/>
+              <w:jc w:val="center"/>
+            </w:pPr>
+            <w:r>
+              <w:rPr>
+                <w:noProof/>
+              </w:rPr>
+              <w:drawing>
+                <wp:inline distT="0" distB="0" distL="0" distR="0" wp14:anchorId="5F1F2C7D" wp14:editId="49FA9EF6">
+                  <wp:extent cx="676656" cy="676656"/>
+                  <wp:effectExtent l="0" t="0" r="0" b="0"/>
+                  <wp:docPr id="1" name="Picture 1"/>
+                  <wp:cNvGraphicFramePr>
+                    <a:graphicFrameLocks xmlns:a="http://schemas.openxmlformats.org/drawingml/2006/main" noChangeAspect="1"/>
+                  </wp:cNvGraphicFramePr>
+                  <a:graphic xmlns:a="http://schemas.openxmlformats.org/drawingml/2006/main">
+                    <a:graphicData uri="http://schemas.openxmlformats.org/drawingml/2006/picture">
+                      <pic:pic xmlns:pic="http://schemas.openxmlformats.org/drawingml/2006/picture">
+                        <pic:nvPicPr>
+                          <pic:cNvPr id="0" name="logo_college.png"/>
+                          <pic:cNvPicPr/>
+                        </pic:nvPicPr>
+                        <pic:blipFill>
+                          <a:blip r:embed="rId8"/>
+                          <a:stretch>
+                            <a:fillRect/>
+                          </a:stretch>
+                        </pic:blipFill>
+                        <pic:spPr>
+                          <a:xfrm>
+                            <a:off x="0" y="0"/>
+                            <a:ext cx="676656" cy="676656"/>
+                          </a:xfrm>
+                          <a:prstGeom prst="rect">
+                            <a:avLst/>
+                          </a:prstGeom>
+                        </pic:spPr>
+                      </pic:pic>
+                    </a:graphicData>
+                  </a:graphic>
+                </wp:inline>
+              </w:drawing>
+            </w:r>
+          </w:p>
+        </w:tc>
+        <w:tc>
+          <w:tcPr>
+            <w:tcW w:w="6480" w:type="dxa"/>
+            <w:vAlign w:val="center"/>
+          </w:tcPr>
+          <w:p>
+            <w:pPr>
+              <w:spacing w:after="20" w:line="240" w:lineRule="auto"/>
+              <w:jc w:val="center"/>
+            </w:pPr>
+            <w:r>
+              <w:rPr>
+                <w:b/>
+                <w:sz w:val="20"/>
+              </w:rPr>
+              <w:t>Nutan Maharashtra Vidya Prasarak Mandal’s (NMVPM’s)</w:t>
+            </w:r>
+          </w:p>
+          <w:p>
+            <w:pPr>
+              <w:spacing w:after="20" w:line="240" w:lineRule="auto"/>
+              <w:jc w:val="center"/>
+            </w:pPr>
+            <w:r>
+              <w:rPr>
+                <w:b/>
+                <w:sz w:val="21"/>
+              </w:rPr>
+              <w:t>NUTAN MAHARASHTRA INSTITUTE OF ENGINEERING AND TECHNOLOGY (NMIET)</w:t>
+            </w:r>
+          </w:p>
+          <w:p>
+            <w:pPr>
+              <w:spacing w:after="20" w:line="240" w:lineRule="auto"/>
+              <w:jc w:val="center"/>
+            </w:pPr>
+            <w:r>
+              <w:rPr>
+                <w:sz w:val="17"/>
+              </w:rPr>
+              <w:t>Under Administrative Support - Pimpri Chinchwad Education Trust (PCET)</w:t>
+            </w:r>
+          </w:p>
+          <w:p>
+            <w:pPr>
+              <w:spacing w:after="0" w:line="240" w:lineRule="auto"/>
+              <w:jc w:val="center"/>
+            </w:pPr>
+            <w:r>
+              <w:rPr>
+                <w:b/>
+                <w:sz w:val="20"/>
+              </w:rPr>
+              <w:t>Computer Science and Engineering Department</w:t>
+            </w:r>
+          </w:p>
+        </w:tc>
+        <w:tc>
+          <w:tcPr>
+            <w:tcW w:w="1296" w:type="dxa"/>
+            <w:vAlign w:val="center"/>
+          </w:tcPr>
+          <w:p>
+            <w:pPr>
+              <w:spacing w:after="0" w:line="240" w:lineRule="auto"/>
+              <w:jc w:val="center"/>
+            </w:pPr>
+            <w:r>
+              <w:rPr>
+                <w:noProof/>
+              </w:rPr>
+              <w:drawing>
+                <wp:inline distT="0" distB="0" distL="0" distR="0" wp14:anchorId="2EB11E42" wp14:editId="5BE28A1D">
+                  <wp:extent cx="621792" cy="692304"/>
+                  <wp:effectExtent l="0" t="0" r="0" b="0"/>
+                  <wp:docPr id="2" name="Picture 2"/>
+                  <wp:cNvGraphicFramePr>
+                    <a:graphicFrameLocks xmlns:a="http://schemas.openxmlformats.org/drawingml/2006/main" noChangeAspect="1"/>
+                  </wp:cNvGraphicFramePr>
+                  <a:graphic xmlns:a="http://schemas.openxmlformats.org/drawingml/2006/main">
+                    <a:graphicData uri="http://schemas.openxmlformats.org/drawingml/2006/picture">
+                      <pic:pic xmlns:pic="http://schemas.openxmlformats.org/drawingml/2006/picture">
+                        <pic:nvPicPr>
+                          <pic:cNvPr id="0" name="logo_university.png"/>
+                          <pic:cNvPicPr/>
+                        </pic:nvPicPr>
+                        <pic:blipFill>
+                          <a:blip r:embed="rId9"/>
+                          <a:stretch>
+                            <a:fillRect/>
+                          </a:stretch>
+                        </pic:blipFill>
+                        <pic:spPr>
+                          <a:xfrm>
+                            <a:off x="0" y="0"/>
+                            <a:ext cx="621792" cy="692304"/>
+                          </a:xfrm>
+                          <a:prstGeom prst="rect">
+                            <a:avLst/>
+                          </a:prstGeom>
+                        </pic:spPr>
+                      </pic:pic>
+                    </a:graphicData>
+                  </a:graphic>
+                </wp:inline>
+              </w:drawing>
+            </w:r>
+          </w:p>
+        </w:tc>
+      </w:tr>
+    </w:tbl>
+    <w:p>
+      <w:pPr>
+        <w:spacing w:after="280" w:line="240" w:lineRule="auto"/>
+      </w:pPr>
     </w:p>
     <w:p>
       <w:pPr>
@@ -636,7 +784,7 @@
           <w:noProof/>
           <w:webHidden/>
         </w:rPr>
-        <w:instrText xml:space="preserve"> PAGEREF _Toc244115850 \h </w:instrText>
+        <w:instrText xml:space="preserve"> PAGEREF _Toc244116336 \h </w:instrText>
       </w:r>
       <w:r>
         <w:rPr>
@@ -708,7 +856,7 @@
           <w:noProof/>
           <w:webHidden/>
         </w:rPr>
-        <w:instrText xml:space="preserve"> PAGEREF _Toc244115851 \h </w:instrText>
+        <w:instrText xml:space="preserve"> PAGEREF _Toc244116337 \h </w:instrText>
       </w:r>
       <w:r>
         <w:rPr>
@@ -780,7 +928,7 @@
           <w:noProof/>
           <w:webHidden/>
         </w:rPr>
-        <w:instrText xml:space="preserve"> PAGEREF _Toc244115852 \h </w:instrText>
+        <w:instrText xml:space="preserve"> PAGEREF _Toc244116338 \h </w:instrText>
       </w:r>
       <w:r>
         <w:rPr>
@@ -852,7 +1000,7 @@
           <w:noProof/>
           <w:webHidden/>
         </w:rPr>
-        <w:instrText xml:space="preserve"> PAGEREF _Toc244115853 \h </w:instrText>
+        <w:instrText xml:space="preserve"> PAGEREF _Toc244116339 \h </w:instrText>
       </w:r>
       <w:r>
         <w:rPr>
@@ -924,7 +1072,7 @@
           <w:noProof/>
           <w:webHidden/>
         </w:rPr>
-        <w:instrText xml:space="preserve"> PAGEREF _Toc244115854 \h </w:instrText>
+        <w:instrText xml:space="preserve"> PAGEREF _Toc244116340 \h </w:instrText>
       </w:r>
       <w:r>
         <w:rPr>
@@ -996,7 +1144,7 @@
           <w:noProof/>
           <w:webHidden/>
         </w:rPr>
-        <w:instrText xml:space="preserve"> PAGEREF _Toc244115855 \h </w:instrText>
+        <w:instrText xml:space="preserve"> PAGEREF _Toc244116341 \h </w:instrText>
       </w:r>
       <w:r>
         <w:rPr>
@@ -1068,7 +1216,7 @@
           <w:noProof/>
           <w:webHidden/>
         </w:rPr>
-        <w:instrText xml:space="preserve"> PAGEREF _Toc244115856 \h </w:instrText>
+        <w:instrText xml:space="preserve"> PAGEREF _Toc244116342 \h </w:instrText>
       </w:r>
       <w:r>
         <w:rPr>
@@ -1140,7 +1288,7 @@
           <w:noProof/>
           <w:webHidden/>
         </w:rPr>
-        <w:instrText xml:space="preserve"> PAGEREF _Toc244115857 \h </w:instrText>
+        <w:instrText xml:space="preserve"> PAGEREF _Toc244116343 \h </w:instrText>
       </w:r>
       <w:r>
         <w:rPr>
@@ -1212,7 +1360,7 @@
           <w:noProof/>
           <w:webHidden/>
         </w:rPr>
-        <w:instrText xml:space="preserve"> PAGEREF _Toc244115858 \h </w:instrText>
+        <w:instrText xml:space="preserve"> PAGEREF _Toc244116344 \h </w:instrText>
       </w:r>
       <w:r>
         <w:rPr>
@@ -1284,7 +1432,7 @@
           <w:noProof/>
           <w:webHidden/>
         </w:rPr>
-        <w:instrText xml:space="preserve"> PAGEREF _Toc244115859 \h </w:instrText>
+        <w:instrText xml:space="preserve"> PAGEREF _Toc244116345 \h </w:instrText>
       </w:r>
       <w:r>
         <w:rPr>
@@ -1356,7 +1504,7 @@
           <w:noProof/>
           <w:webHidden/>
         </w:rPr>
-        <w:instrText xml:space="preserve"> PAGEREF _Toc244115860 \h </w:instrText>
+        <w:instrText xml:space="preserve"> PAGEREF _Toc244116346 \h </w:instrText>
       </w:r>
       <w:r>
         <w:rPr>
@@ -1428,7 +1576,7 @@
           <w:noProof/>
           <w:webHidden/>
         </w:rPr>
-        <w:instrText xml:space="preserve"> PAGEREF _Toc244115861 \h </w:instrText>
+        <w:instrText xml:space="preserve"> PAGEREF _Toc244116347 \h </w:instrText>
       </w:r>
       <w:r>
         <w:rPr>
@@ -1500,7 +1648,7 @@
           <w:noProof/>
           <w:webHidden/>
         </w:rPr>
-        <w:instrText xml:space="preserve"> PAGEREF _Toc244115862 \h </w:instrText>
+        <w:instrText xml:space="preserve"> PAGEREF _Toc244116348 \h </w:instrText>
       </w:r>
       <w:r>
         <w:rPr>
@@ -1572,7 +1720,7 @@
           <w:noProof/>
           <w:webHidden/>
         </w:rPr>
-        <w:instrText xml:space="preserve"> PAGEREF _Toc244115863 \h </w:instrText>
+        <w:instrText xml:space="preserve"> PAGEREF _Toc244116349 \h </w:instrText>
       </w:r>
       <w:r>
         <w:rPr>
@@ -1644,7 +1792,7 @@
           <w:noProof/>
           <w:webHidden/>
         </w:rPr>
-        <w:instrText xml:space="preserve"> PAGEREF _Toc244115864 \h </w:instrText>
+        <w:instrText xml:space="preserve"> PAGEREF _Toc244116350 \h </w:instrText>
       </w:r>
       <w:r>
         <w:rPr>
@@ -1716,7 +1864,7 @@
           <w:noProof/>
           <w:webHidden/>
         </w:rPr>
-        <w:instrText xml:space="preserve"> PAGEREF _Toc244115865 \h </w:instrText>
+        <w:instrText xml:space="preserve"> PAGEREF _Toc244116351 \h </w:instrText>
       </w:r>
       <w:r>
         <w:rPr>
@@ -1788,7 +1936,7 @@
           <w:noProof/>
           <w:webHidden/>
         </w:rPr>
-        <w:instrText xml:space="preserve"> PAGEREF _Toc244115866 \h </w:instrText>
+        <w:instrText xml:space="preserve"> PAGEREF _Toc244116352 \h </w:instrText>
       </w:r>
       <w:r>
         <w:rPr>
@@ -1860,7 +2008,7 @@
           <w:noProof/>
           <w:webHidden/>
         </w:rPr>
-        <w:instrText xml:space="preserve"> PAGEREF _Toc244115867 \h </w:instrText>
+        <w:instrText xml:space="preserve"> PAGEREF _Toc244116353 \h </w:instrText>
       </w:r>
       <w:r>
         <w:rPr>
@@ -1932,7 +2080,7 @@
           <w:noProof/>
           <w:webHidden/>
         </w:rPr>
-        <w:instrText xml:space="preserve"> PAGEREF _Toc244115868 \h </w:instrText>
+        <w:instrText xml:space="preserve"> PAGEREF _Toc244116354 \h </w:instrText>
       </w:r>
       <w:r>
         <w:rPr>
@@ -2004,7 +2152,7 @@
           <w:noProof/>
           <w:webHidden/>
         </w:rPr>
-        <w:instrText xml:space="preserve"> PAGEREF _Toc244115869 \h </w:instrText>
+        <w:instrText xml:space="preserve"> PAGEREF _Toc244116355 \h </w:instrText>
       </w:r>
       <w:r>
         <w:rPr>
@@ -2076,7 +2224,7 @@
           <w:noProof/>
           <w:webHidden/>
         </w:rPr>
-        <w:instrText xml:space="preserve"> PAGEREF _Toc244115870 \h </w:instrText>
+        <w:instrText xml:space="preserve"> PAGEREF _Toc244116356 \h </w:instrText>
       </w:r>
       <w:r>
         <w:rPr>
@@ -2148,7 +2296,7 @@
           <w:noProof/>
           <w:webHidden/>
         </w:rPr>
-        <w:instrText xml:space="preserve"> PAGEREF _Toc244115871 \h </w:instrText>
+        <w:instrText xml:space="preserve"> PAGEREF _Toc244116357 \h </w:instrText>
       </w:r>
       <w:r>
         <w:rPr>
@@ -2220,7 +2368,7 @@
           <w:noProof/>
           <w:webHidden/>
         </w:rPr>
-        <w:instrText xml:space="preserve"> PAGEREF _Toc244115872 \h </w:instrText>
+        <w:instrText xml:space="preserve"> PAGEREF _Toc244116358 \h </w:instrText>
       </w:r>
       <w:r>
         <w:rPr>
@@ -2292,7 +2440,7 @@
           <w:noProof/>
           <w:webHidden/>
         </w:rPr>
-        <w:instrText xml:space="preserve"> PAGEREF _Toc244115873 \h </w:instrText>
+        <w:instrText xml:space="preserve"> PAGEREF _Toc244116359 \h </w:instrText>
       </w:r>
       <w:r>
         <w:rPr>
@@ -2364,7 +2512,7 @@
           <w:noProof/>
           <w:webHidden/>
         </w:rPr>
-        <w:instrText xml:space="preserve"> PAGEREF _Toc244115874 \h </w:instrText>
+        <w:instrText xml:space="preserve"> PAGEREF _Toc244116360 \h </w:instrText>
       </w:r>
       <w:r>
         <w:rPr>
@@ -2436,7 +2584,7 @@
           <w:noProof/>
           <w:webHidden/>
         </w:rPr>
-        <w:instrText xml:space="preserve"> PAGEREF _Toc244115875 \h </w:instrText>
+        <w:instrText xml:space="preserve"> PAGEREF _Toc244116361 \h </w:instrText>
       </w:r>
       <w:r>
         <w:rPr>
@@ -2508,7 +2656,7 @@
           <w:noProof/>
           <w:webHidden/>
         </w:rPr>
-        <w:instrText xml:space="preserve"> PAGEREF _Toc244115876 \h </w:instrText>
+        <w:instrText xml:space="preserve"> PAGEREF _Toc244116362 \h </w:instrText>
       </w:r>
       <w:r>
         <w:rPr>
@@ -2580,7 +2728,7 @@
           <w:noProof/>
           <w:webHidden/>
         </w:rPr>
-        <w:instrText xml:space="preserve"> PAGEREF _Toc244115877 \h </w:instrText>
+        <w:instrText xml:space="preserve"> PAGEREF _Toc244116363 \h </w:instrText>
       </w:r>
       <w:r>
         <w:rPr>
@@ -5009,7 +5157,7 @@
         <w:pStyle w:val="Heading1"/>
         <w:pageBreakBefore/>
       </w:pPr>
-      <w:bookmarkStart w:id="0" w:name="_Toc244115850"/>
+      <w:bookmarkStart w:id="0" w:name="_Toc244116336"/>
       <w:r>
         <w:lastRenderedPageBreak/>
         <w:t>1. INTRODUCTION</w:t>
@@ -5020,7 +5168,7 @@
       <w:pPr>
         <w:pStyle w:val="Heading2"/>
       </w:pPr>
-      <w:bookmarkStart w:id="1" w:name="_Toc244115851"/>
+      <w:bookmarkStart w:id="1" w:name="_Toc244116337"/>
       <w:r>
         <w:t>1.1 Background</w:t>
       </w:r>
@@ -5043,7 +5191,7 @@
       <w:pPr>
         <w:pStyle w:val="Heading2"/>
       </w:pPr>
-      <w:bookmarkStart w:id="2" w:name="_Toc244115852"/>
+      <w:bookmarkStart w:id="2" w:name="_Toc244116338"/>
       <w:r>
         <w:t>1.2 Motivation</w:t>
       </w:r>
@@ -5138,7 +5286,7 @@
       <w:pPr>
         <w:pStyle w:val="Heading2"/>
       </w:pPr>
-      <w:bookmarkStart w:id="3" w:name="_Toc244115853"/>
+      <w:bookmarkStart w:id="3" w:name="_Toc244116339"/>
       <w:r>
         <w:t>1.3 Problem Statement</w:t>
       </w:r>
@@ -5245,7 +5393,7 @@
       <w:pPr>
         <w:pStyle w:val="Heading2"/>
       </w:pPr>
-      <w:bookmarkStart w:id="4" w:name="_Toc244115854"/>
+      <w:bookmarkStart w:id="4" w:name="_Toc244116340"/>
       <w:r>
         <w:t>1.4 Objectives</w:t>
       </w:r>
@@ -5361,7 +5509,7 @@
       <w:pPr>
         <w:pStyle w:val="Heading2"/>
       </w:pPr>
-      <w:bookmarkStart w:id="5" w:name="_Toc244115855"/>
+      <w:bookmarkStart w:id="5" w:name="_Toc244116341"/>
       <w:r>
         <w:t>1.5 Scope of the Seminar</w:t>
       </w:r>
@@ -5401,7 +5549,7 @@
       <w:pPr>
         <w:pStyle w:val="Heading1"/>
       </w:pPr>
-      <w:bookmarkStart w:id="6" w:name="_Toc244115856"/>
+      <w:bookmarkStart w:id="6" w:name="_Toc244116342"/>
       <w:r>
         <w:t>2. LITERATURE SURVEY</w:t>
       </w:r>
@@ -5411,7 +5559,7 @@
       <w:pPr>
         <w:pStyle w:val="Heading2"/>
       </w:pPr>
-      <w:bookmarkStart w:id="7" w:name="_Toc244115857"/>
+      <w:bookmarkStart w:id="7" w:name="_Toc244116343"/>
       <w:r>
         <w:t>2.1 Existing Work and Related Studies</w:t>
       </w:r>
@@ -5456,7 +5604,7 @@
       <w:pPr>
         <w:pStyle w:val="Heading2"/>
       </w:pPr>
-      <w:bookmarkStart w:id="8" w:name="_Toc244115858"/>
+      <w:bookmarkStart w:id="8" w:name="_Toc244116344"/>
       <w:r>
         <w:t>2.2 Summary of Research Papers</w:t>
       </w:r>
@@ -6425,7 +6573,7 @@
       <w:pPr>
         <w:pStyle w:val="Heading2"/>
       </w:pPr>
-      <w:bookmarkStart w:id="9" w:name="_Toc244115859"/>
+      <w:bookmarkStart w:id="9" w:name="_Toc244116345"/>
       <w:r>
         <w:t>2.3 Research Gaps</w:t>
       </w:r>
@@ -6540,7 +6688,7 @@
       <w:pPr>
         <w:pStyle w:val="Heading1"/>
       </w:pPr>
-      <w:bookmarkStart w:id="10" w:name="_Toc244115860"/>
+      <w:bookmarkStart w:id="10" w:name="_Toc244116346"/>
       <w:r>
         <w:t>3. OVERVIEW OF THE CHAINGUARD V2 CONTROL PLANE</w:t>
       </w:r>
@@ -6550,7 +6698,7 @@
       <w:pPr>
         <w:pStyle w:val="Heading2"/>
       </w:pPr>
-      <w:bookmarkStart w:id="11" w:name="_Toc244115861"/>
+      <w:bookmarkStart w:id="11" w:name="_Toc244116347"/>
       <w:r>
         <w:t>3.1 Definition and Concept</w:t>
       </w:r>
@@ -6731,7 +6879,7 @@
       <w:pPr>
         <w:pStyle w:val="Heading2"/>
       </w:pPr>
-      <w:bookmarkStart w:id="12" w:name="_Toc244115862"/>
+      <w:bookmarkStart w:id="12" w:name="_Toc244116348"/>
       <w:r>
         <w:t>3.2 Architecture / Block Diagram</w:t>
       </w:r>
@@ -6748,10 +6896,10 @@
           <w:noProof/>
         </w:rPr>
         <w:drawing>
-          <wp:inline distT="0" distB="0" distL="0" distR="0" wp14:anchorId="36A13A4F" wp14:editId="6246B559">
+          <wp:inline distT="0" distB="0" distL="0" distR="0" wp14:anchorId="1CD966F5" wp14:editId="5B4F9879">
             <wp:extent cx="4572000" cy="3304515"/>
             <wp:effectExtent l="0" t="0" r="0" b="0"/>
-            <wp:docPr id="1" name="Picture 1"/>
+            <wp:docPr id="3" name="Picture 3"/>
             <wp:cNvGraphicFramePr>
               <a:graphicFrameLocks xmlns:a="http://schemas.openxmlformats.org/drawingml/2006/main" noChangeAspect="1"/>
             </wp:cNvGraphicFramePr>
@@ -6763,7 +6911,7 @@
                     <pic:cNvPicPr/>
                   </pic:nvPicPr>
                   <pic:blipFill>
-                    <a:blip r:embed="rId8"/>
+                    <a:blip r:embed="rId10"/>
                     <a:stretch>
                       <a:fillRect/>
                     </a:stretch>
@@ -6921,7 +7069,7 @@
       <w:pPr>
         <w:pStyle w:val="Heading2"/>
       </w:pPr>
-      <w:bookmarkStart w:id="13" w:name="_Toc244115863"/>
+      <w:bookmarkStart w:id="13" w:name="_Toc244116349"/>
       <w:r>
         <w:t>3.3 Key Components and Technologies</w:t>
       </w:r>
@@ -7128,10 +7276,10 @@
           <w:noProof/>
         </w:rPr>
         <w:drawing>
-          <wp:inline distT="0" distB="0" distL="0" distR="0" wp14:anchorId="4DA81091" wp14:editId="43906078">
+          <wp:inline distT="0" distB="0" distL="0" distR="0" wp14:anchorId="17994123" wp14:editId="6D6493C2">
             <wp:extent cx="4572000" cy="2942376"/>
             <wp:effectExtent l="0" t="0" r="0" b="0"/>
-            <wp:docPr id="2" name="Picture 2"/>
+            <wp:docPr id="4" name="Picture 4"/>
             <wp:cNvGraphicFramePr>
               <a:graphicFrameLocks xmlns:a="http://schemas.openxmlformats.org/drawingml/2006/main" noChangeAspect="1"/>
             </wp:cNvGraphicFramePr>
@@ -7143,7 +7291,7 @@
                     <pic:cNvPicPr/>
                   </pic:nvPicPr>
                   <pic:blipFill>
-                    <a:blip r:embed="rId9"/>
+                    <a:blip r:embed="rId11"/>
                     <a:stretch>
                       <a:fillRect/>
                     </a:stretch>
@@ -8046,7 +8194,7 @@
       <w:pPr>
         <w:pStyle w:val="Heading1"/>
       </w:pPr>
-      <w:bookmarkStart w:id="14" w:name="_Toc244115864"/>
+      <w:bookmarkStart w:id="14" w:name="_Toc244116350"/>
       <w:r>
         <w:t>4. WORKING / METHODOLOGY</w:t>
       </w:r>
@@ -8056,7 +8204,7 @@
       <w:pPr>
         <w:pStyle w:val="Heading2"/>
       </w:pPr>
-      <w:bookmarkStart w:id="15" w:name="_Toc244115865"/>
+      <w:bookmarkStart w:id="15" w:name="_Toc244116351"/>
       <w:r>
         <w:t>4.1 Working Principle</w:t>
       </w:r>
@@ -8078,10 +8226,10 @@
           <w:noProof/>
         </w:rPr>
         <w:drawing>
-          <wp:inline distT="0" distB="0" distL="0" distR="0" wp14:anchorId="14D1B49D" wp14:editId="4C0A966B">
+          <wp:inline distT="0" distB="0" distL="0" distR="0" wp14:anchorId="46857495" wp14:editId="08D662C1">
             <wp:extent cx="4572000" cy="3213980"/>
             <wp:effectExtent l="0" t="0" r="0" b="0"/>
-            <wp:docPr id="3" name="Picture 3"/>
+            <wp:docPr id="5" name="Picture 5"/>
             <wp:cNvGraphicFramePr>
               <a:graphicFrameLocks xmlns:a="http://schemas.openxmlformats.org/drawingml/2006/main" noChangeAspect="1"/>
             </wp:cNvGraphicFramePr>
@@ -8093,7 +8241,7 @@
                     <pic:cNvPicPr/>
                   </pic:nvPicPr>
                   <pic:blipFill>
-                    <a:blip r:embed="rId10"/>
+                    <a:blip r:embed="rId12"/>
                     <a:stretch>
                       <a:fillRect/>
                     </a:stretch>
@@ -8352,7 +8500,7 @@
       <w:pPr>
         <w:pStyle w:val="Heading2"/>
       </w:pPr>
-      <w:bookmarkStart w:id="16" w:name="_Toc244115866"/>
+      <w:bookmarkStart w:id="16" w:name="_Toc244116352"/>
       <w:r>
         <w:t>4.2 Algorithms / Techniques Used</w:t>
       </w:r>
@@ -8738,10 +8886,10 @@
           <w:noProof/>
         </w:rPr>
         <w:drawing>
-          <wp:inline distT="0" distB="0" distL="0" distR="0" wp14:anchorId="4D39673A" wp14:editId="2E3A0C8A">
+          <wp:inline distT="0" distB="0" distL="0" distR="0" wp14:anchorId="23974BCC" wp14:editId="7E43A819">
             <wp:extent cx="4572000" cy="3224463"/>
             <wp:effectExtent l="0" t="0" r="0" b="0"/>
-            <wp:docPr id="4" name="Picture 4"/>
+            <wp:docPr id="6" name="Picture 6"/>
             <wp:cNvGraphicFramePr>
               <a:graphicFrameLocks xmlns:a="http://schemas.openxmlformats.org/drawingml/2006/main" noChangeAspect="1"/>
             </wp:cNvGraphicFramePr>
@@ -8753,7 +8901,7 @@
                     <pic:cNvPicPr/>
                   </pic:nvPicPr>
                   <pic:blipFill>
-                    <a:blip r:embed="rId11"/>
+                    <a:blip r:embed="rId13"/>
                     <a:stretch>
                       <a:fillRect/>
                     </a:stretch>
@@ -9121,7 +9269,7 @@
       <w:pPr>
         <w:pStyle w:val="Heading2"/>
       </w:pPr>
-      <w:bookmarkStart w:id="17" w:name="_Toc244115867"/>
+      <w:bookmarkStart w:id="17" w:name="_Toc244116353"/>
       <w:r>
         <w:t>4.3 Tools and Platforms</w:t>
       </w:r>
@@ -10584,7 +10732,7 @@
       <w:pPr>
         <w:pStyle w:val="Heading1"/>
       </w:pPr>
-      <w:bookmarkStart w:id="18" w:name="_Toc244115868"/>
+      <w:bookmarkStart w:id="18" w:name="_Toc244116354"/>
       <w:r>
         <w:t>5. APPLICATIONS</w:t>
       </w:r>
@@ -10594,7 +10742,7 @@
       <w:pPr>
         <w:pStyle w:val="Heading2"/>
       </w:pPr>
-      <w:bookmarkStart w:id="19" w:name="_Toc244115869"/>
+      <w:bookmarkStart w:id="19" w:name="_Toc244116355"/>
       <w:r>
         <w:t>5.1 Real-World Use Cases</w:t>
       </w:r>
@@ -10734,7 +10882,7 @@
       <w:pPr>
         <w:pStyle w:val="Heading2"/>
       </w:pPr>
-      <w:bookmarkStart w:id="20" w:name="_Toc244115870"/>
+      <w:bookmarkStart w:id="20" w:name="_Toc244116356"/>
       <w:r>
         <w:t>5.2 Case Study</w:t>
       </w:r>
@@ -10807,7 +10955,7 @@
       <w:pPr>
         <w:pStyle w:val="Heading1"/>
       </w:pPr>
-      <w:bookmarkStart w:id="21" w:name="_Toc244115871"/>
+      <w:bookmarkStart w:id="21" w:name="_Toc244116357"/>
       <w:r>
         <w:t>6. ADVANTAGES AND LIMITATIONS</w:t>
       </w:r>
@@ -10817,7 +10965,7 @@
       <w:pPr>
         <w:pStyle w:val="Heading2"/>
       </w:pPr>
-      <w:bookmarkStart w:id="22" w:name="_Toc244115872"/>
+      <w:bookmarkStart w:id="22" w:name="_Toc244116358"/>
       <w:r>
         <w:t>6.1 Advantages</w:t>
       </w:r>
@@ -11008,7 +11156,7 @@
       <w:pPr>
         <w:pStyle w:val="Heading2"/>
       </w:pPr>
-      <w:bookmarkStart w:id="23" w:name="_Toc244115873"/>
+      <w:bookmarkStart w:id="23" w:name="_Toc244116359"/>
       <w:r>
         <w:t>6.2 Limitations / Challenges</w:t>
       </w:r>
@@ -11283,7 +11431,7 @@
       <w:pPr>
         <w:pStyle w:val="Heading1"/>
       </w:pPr>
-      <w:bookmarkStart w:id="24" w:name="_Toc244115874"/>
+      <w:bookmarkStart w:id="24" w:name="_Toc244116360"/>
       <w:r>
         <w:lastRenderedPageBreak/>
         <w:t>7. COMPARISON WITH EXISTING TECHNOLOGIES</w:t>
@@ -12369,7 +12517,7 @@
       <w:pPr>
         <w:pStyle w:val="Heading1"/>
       </w:pPr>
-      <w:bookmarkStart w:id="25" w:name="_Toc244115875"/>
+      <w:bookmarkStart w:id="25" w:name="_Toc244116361"/>
       <w:r>
         <w:t>8. FUTURE SCOPE</w:t>
       </w:r>
@@ -12544,7 +12692,7 @@
       <w:pPr>
         <w:pStyle w:val="Heading1"/>
       </w:pPr>
-      <w:bookmarkStart w:id="26" w:name="_Toc244115876"/>
+      <w:bookmarkStart w:id="26" w:name="_Toc244116362"/>
       <w:r>
         <w:t>9. CONCLUSION</w:t>
       </w:r>
@@ -12569,7 +12717,7 @@
       <w:pPr>
         <w:pStyle w:val="Heading1"/>
       </w:pPr>
-      <w:bookmarkStart w:id="27" w:name="_Toc244115877"/>
+      <w:bookmarkStart w:id="27" w:name="_Toc244116363"/>
       <w:r>
         <w:t>10. REFERENCES</w:t>
       </w:r>
@@ -13056,9 +13204,15 @@
       </w:r>
     </w:p>
     <w:sectPr>
-      <w:footerReference w:type="default" r:id="rId12"/>
+      <w:footerReference w:type="default" r:id="rId14"/>
       <w:pgSz w:w="12240" w:h="15840"/>
       <w:pgMar w:top="1296" w:right="1584" w:bottom="1296" w:left="1584" w:header="720" w:footer="648" w:gutter="0"/>
+      <w:pgBorders w:offsetFrom="page">
+        <w:top w:val="double" w:sz="8" w:space="18" w:color="404040"/>
+        <w:left w:val="double" w:sz="8" w:space="18" w:color="404040"/>
+        <w:bottom w:val="double" w:sz="8" w:space="18" w:color="404040"/>
+        <w:right w:val="double" w:sz="8" w:space="18" w:color="404040"/>
+      </w:pgBorders>
       <w:cols w:space="720"/>
       <w:docGrid w:linePitch="360"/>
     </w:sectPr>
@@ -13315,31 +13469,31 @@
       </w:rPr>
     </w:lvl>
   </w:abstractNum>
-  <w:num w:numId="1" w16cid:durableId="247544749">
+  <w:num w:numId="1" w16cid:durableId="1974677159">
     <w:abstractNumId w:val="8"/>
   </w:num>
-  <w:num w:numId="2" w16cid:durableId="1139372918">
+  <w:num w:numId="2" w16cid:durableId="1758209517">
     <w:abstractNumId w:val="6"/>
   </w:num>
-  <w:num w:numId="3" w16cid:durableId="1168717918">
+  <w:num w:numId="3" w16cid:durableId="764959534">
     <w:abstractNumId w:val="5"/>
   </w:num>
-  <w:num w:numId="4" w16cid:durableId="890531369">
+  <w:num w:numId="4" w16cid:durableId="1108544228">
     <w:abstractNumId w:val="4"/>
   </w:num>
-  <w:num w:numId="5" w16cid:durableId="690496637">
+  <w:num w:numId="5" w16cid:durableId="1118914203">
     <w:abstractNumId w:val="7"/>
   </w:num>
-  <w:num w:numId="6" w16cid:durableId="1758476451">
+  <w:num w:numId="6" w16cid:durableId="1302687192">
     <w:abstractNumId w:val="3"/>
   </w:num>
-  <w:num w:numId="7" w16cid:durableId="632638110">
+  <w:num w:numId="7" w16cid:durableId="493374788">
     <w:abstractNumId w:val="2"/>
   </w:num>
-  <w:num w:numId="8" w16cid:durableId="274753581">
+  <w:num w:numId="8" w16cid:durableId="349529240">
     <w:abstractNumId w:val="1"/>
   </w:num>
-  <w:num w:numId="9" w16cid:durableId="1029988847">
+  <w:num w:numId="9" w16cid:durableId="972557705">
     <w:abstractNumId w:val="0"/>
   </w:num>
 </w:numbering>
@@ -24744,7 +24898,7 @@
     <w:autoRedefine/>
     <w:uiPriority w:val="39"/>
     <w:unhideWhenUsed/>
-    <w:rsid w:val="007C76D6"/>
+    <w:rsid w:val="00F217A6"/>
     <w:pPr>
       <w:spacing w:after="40" w:line="240" w:lineRule="auto"/>
     </w:pPr>
@@ -24760,7 +24914,7 @@
     <w:autoRedefine/>
     <w:uiPriority w:val="39"/>
     <w:unhideWhenUsed/>
-    <w:rsid w:val="007C76D6"/>
+    <w:rsid w:val="00F217A6"/>
     <w:pPr>
       <w:spacing w:after="40" w:line="240" w:lineRule="auto"/>
       <w:ind w:left="240"/>

</xml_diff>

<commit_message>
docs: adopt NMIET front-page layout and fix abbreviation header
Rebuild the title, certificate and acknowledgement pages with the department letterhead, logos, student and signature tables. Add the running header above the List of Abbreviations page without changing pagination.
</commit_message>
<xml_diff>
--- a/ChainGuard_v2_Technical_Seminar_Report.docx
+++ b/ChainGuard_v2_Technical_Seminar_Report.docx
@@ -2,201 +2,6 @@
 <file path=word/document.xml><?xml version="1.0" encoding="utf-8"?>
 <w:document xmlns:wpc="http://schemas.microsoft.com/office/word/2010/wordprocessingCanvas" xmlns:cx="http://schemas.microsoft.com/office/drawing/2014/chartex" xmlns:cx1="http://schemas.microsoft.com/office/drawing/2015/9/8/chartex" xmlns:cx2="http://schemas.microsoft.com/office/drawing/2015/10/21/chartex" xmlns:cx3="http://schemas.microsoft.com/office/drawing/2016/5/9/chartex" xmlns:cx4="http://schemas.microsoft.com/office/drawing/2016/5/10/chartex" xmlns:cx5="http://schemas.microsoft.com/office/drawing/2016/5/11/chartex" xmlns:cx6="http://schemas.microsoft.com/office/drawing/2016/5/12/chartex" xmlns:cx7="http://schemas.microsoft.com/office/drawing/2016/5/13/chartex" xmlns:cx8="http://schemas.microsoft.com/office/drawing/2016/5/14/chartex" xmlns:mc="http://schemas.openxmlformats.org/markup-compatibility/2006" xmlns:aink="http://schemas.microsoft.com/office/drawing/2016/ink" xmlns:am3d="http://schemas.microsoft.com/office/drawing/2017/model3d" xmlns:o="urn:schemas-microsoft-com:office:office" xmlns:oel="http://schemas.microsoft.com/office/2019/extlst" xmlns:r="http://schemas.openxmlformats.org/officeDocument/2006/relationships" xmlns:m="http://schemas.openxmlformats.org/officeDocument/2006/math" xmlns:v="urn:schemas-microsoft-com:vml" xmlns:wp14="http://schemas.microsoft.com/office/word/2010/wordprocessingDrawing" xmlns:wp="http://schemas.openxmlformats.org/drawingml/2006/wordprocessingDrawing" xmlns:w10="urn:schemas-microsoft-com:office:word" xmlns:w="http://schemas.openxmlformats.org/wordprocessingml/2006/main" xmlns:w14="http://schemas.microsoft.com/office/word/2010/wordml" xmlns:w15="http://schemas.microsoft.com/office/word/2012/wordml" xmlns:w16cex="http://schemas.microsoft.com/office/word/2018/wordml/cex" xmlns:w16cid="http://schemas.microsoft.com/office/word/2016/wordml/cid" xmlns:w16="http://schemas.microsoft.com/office/word/2018/wordml" xmlns:w16du="http://schemas.microsoft.com/office/word/2023/wordml/word16du" xmlns:w16sdtdh="http://schemas.microsoft.com/office/word/2020/wordml/sdtdatahash" xmlns:w16sdtfl="http://schemas.microsoft.com/office/word/2024/wordml/sdtformatlock" xmlns:w16se="http://schemas.microsoft.com/office/word/2015/wordml/symex" xmlns:wpg="http://schemas.microsoft.com/office/word/2010/wordprocessingGroup" xmlns:wpi="http://schemas.microsoft.com/office/word/2010/wordprocessingInk" xmlns:wne="http://schemas.microsoft.com/office/word/2006/wordml" xmlns:wps="http://schemas.microsoft.com/office/word/2010/wordprocessingShape" mc:Ignorable="w14 w15 w16se w16cid w16 w16cex w16sdtdh w16sdtfl w16du wp14">
   <w:body>
-    <w:p>
-      <w:pPr>
-        <w:spacing w:line="240" w:lineRule="auto"/>
-        <w:jc w:val="center"/>
-      </w:pPr>
-      <w:r>
-        <w:rPr>
-          <w:b/>
-          <w:sz w:val="24"/>
-        </w:rPr>
-        <w:t>A SEMINAR REPORT</w:t>
-      </w:r>
-    </w:p>
-    <w:p>
-      <w:pPr>
-        <w:spacing w:after="100" w:line="240" w:lineRule="auto"/>
-        <w:jc w:val="center"/>
-      </w:pPr>
-      <w:r>
-        <w:rPr>
-          <w:sz w:val="24"/>
-        </w:rPr>
-        <w:t>ON</w:t>
-      </w:r>
-    </w:p>
-    <w:p>
-      <w:pPr>
-        <w:spacing w:after="200" w:line="269" w:lineRule="auto"/>
-        <w:jc w:val="center"/>
-      </w:pPr>
-      <w:r>
-        <w:rPr>
-          <w:b/>
-          <w:sz w:val="28"/>
-        </w:rPr>
-        <w:t>CHAINGUARD V2: A TAMPER-EVIDENT LAST-MILE LOGISTICS CONTROL PLANE FOR SEALED DISPATCH, CUSTOMER-AUTHORISED CUSTODY BREAKS AND UNIT-EXACT SHRINKAGE RECONCILIATION</w:t>
-      </w:r>
-    </w:p>
-    <w:p>
-      <w:pPr>
-        <w:spacing w:after="240" w:line="240" w:lineRule="auto"/>
-        <w:jc w:val="center"/>
-      </w:pPr>
-      <w:r>
-        <w:rPr>
-          <w:b/>
-        </w:rPr>
-        <w:t>Project Reference: ChainGuard v2.4</w:t>
-      </w:r>
-    </w:p>
-    <w:p>
-      <w:pPr>
-        <w:spacing w:line="240" w:lineRule="auto"/>
-        <w:jc w:val="center"/>
-      </w:pPr>
-      <w:r>
-        <w:rPr>
-          <w:b/>
-          <w:sz w:val="24"/>
-        </w:rPr>
-        <w:t>SUBMITTED TO THE</w:t>
-      </w:r>
-    </w:p>
-    <w:p>
-      <w:pPr>
-        <w:spacing w:after="140" w:line="240" w:lineRule="auto"/>
-        <w:jc w:val="center"/>
-      </w:pPr>
-      <w:r>
-        <w:rPr>
-          <w:b/>
-          <w:sz w:val="24"/>
-        </w:rPr>
-        <w:t>SAVITRIBAI PHULE PUNE UNIVERSITY, PUNE</w:t>
-      </w:r>
-    </w:p>
-    <w:p>
-      <w:pPr>
-        <w:spacing w:after="20" w:line="240" w:lineRule="auto"/>
-        <w:jc w:val="center"/>
-      </w:pPr>
-      <w:r>
-        <w:rPr>
-          <w:sz w:val="19"/>
-        </w:rPr>
-        <w:t>IN THE PARTIAL FULFILLMENT OF THE REQUIREMENTS FOR THE AWARD OF</w:t>
-      </w:r>
-    </w:p>
-    <w:p>
-      <w:pPr>
-        <w:spacing w:after="20" w:line="240" w:lineRule="auto"/>
-        <w:jc w:val="center"/>
-      </w:pPr>
-      <w:r>
-        <w:rPr>
-          <w:sz w:val="19"/>
-        </w:rPr>
-        <w:t>THE DEGREE OF</w:t>
-      </w:r>
-    </w:p>
-    <w:p>
-      <w:pPr>
-        <w:spacing w:after="220" w:line="240" w:lineRule="auto"/>
-        <w:jc w:val="center"/>
-      </w:pPr>
-      <w:r>
-        <w:rPr>
-          <w:b/>
-          <w:sz w:val="24"/>
-        </w:rPr>
-        <w:t>THIRD YEAR COMPUTER SCIENCE AND ENGINEERING</w:t>
-      </w:r>
-    </w:p>
-    <w:p>
-      <w:pPr>
-        <w:spacing w:after="80" w:line="240" w:lineRule="auto"/>
-        <w:jc w:val="center"/>
-      </w:pPr>
-      <w:r>
-        <w:rPr>
-          <w:b/>
-          <w:sz w:val="24"/>
-        </w:rPr>
-        <w:t>BY</w:t>
-      </w:r>
-    </w:p>
-    <w:p>
-      <w:pPr>
-        <w:spacing w:after="40" w:line="240" w:lineRule="auto"/>
-        <w:jc w:val="center"/>
-      </w:pPr>
-      <w:r>
-        <w:rPr>
-          <w:sz w:val="24"/>
-        </w:rPr>
-        <w:t>Ms. Pallavi Kokate (B34)  •  Mr. Anil Kewat (B45)  •  Ms. Nikita Sagar (B50)</w:t>
-      </w:r>
-    </w:p>
-    <w:p>
-      <w:pPr>
-        <w:spacing w:after="480" w:line="240" w:lineRule="auto"/>
-        <w:jc w:val="center"/>
-      </w:pPr>
-      <w:r>
-        <w:t>Roll No: B34 / B45 / B50</w:t>
-      </w:r>
-    </w:p>
-    <w:p>
-      <w:pPr>
-        <w:spacing w:after="80" w:line="240" w:lineRule="auto"/>
-        <w:jc w:val="center"/>
-      </w:pPr>
-      <w:r>
-        <w:rPr>
-          <w:b/>
-          <w:sz w:val="24"/>
-        </w:rPr>
-        <w:t>UNDER THE GUIDANCE OF</w:t>
-      </w:r>
-    </w:p>
-    <w:p>
-      <w:pPr>
-        <w:spacing w:after="400" w:line="240" w:lineRule="auto"/>
-        <w:jc w:val="center"/>
-      </w:pPr>
-      <w:r>
-        <w:rPr>
-          <w:b/>
-          <w:sz w:val="24"/>
-        </w:rPr>
-        <w:t>Miss. Sakshi Ambadkar</w:t>
-      </w:r>
-    </w:p>
-    <w:p>
-      <w:pPr>
-        <w:spacing w:after="40" w:line="240" w:lineRule="auto"/>
-        <w:jc w:val="center"/>
-      </w:pPr>
-      <w:r>
-        <w:t>Nutan Maharashtra Vidya Prasarak Mandal’s</w:t>
-      </w:r>
-    </w:p>
-    <w:p>
-      <w:pPr>
-        <w:spacing w:after="40" w:line="252" w:lineRule="auto"/>
-        <w:jc w:val="center"/>
-      </w:pPr>
-      <w:r>
-        <w:rPr>
-          <w:b/>
-          <w:sz w:val="24"/>
-        </w:rPr>
-        <w:t>NUTAN MAHARASHTRA INSTITUTE OF ENGINEERING &amp; TECHNOLOGY, PUNE</w:t>
-      </w:r>
-    </w:p>
     <w:tbl>
       <w:tblPr>
         <w:tblW w:w="0" w:type="auto"/>
@@ -217,8 +22,9 @@
         <w:tblLook w:val="04A0" w:firstRow="1" w:lastRow="0" w:firstColumn="1" w:lastColumn="0" w:noHBand="0" w:noVBand="1"/>
       </w:tblPr>
       <w:tblGrid>
-        <w:gridCol w:w="1440"/>
-        <w:gridCol w:w="1440"/>
+        <w:gridCol w:w="979"/>
+        <w:gridCol w:w="6250"/>
+        <w:gridCol w:w="979"/>
       </w:tblGrid>
       <w:tr>
         <w:trPr>
@@ -226,7 +32,7 @@
         </w:trPr>
         <w:tc>
           <w:tcPr>
-            <w:tcW w:w="1440" w:type="dxa"/>
+            <w:tcW w:w="979" w:type="dxa"/>
             <w:vAlign w:val="center"/>
           </w:tcPr>
           <w:p>
@@ -239,8 +45,8 @@
                 <w:noProof/>
               </w:rPr>
               <w:drawing>
-                <wp:inline distT="0" distB="0" distL="0" distR="0" wp14:anchorId="1431CC00" wp14:editId="556BDDF0">
-                  <wp:extent cx="502920" cy="502920"/>
+                <wp:inline distT="0" distB="0" distL="0" distR="0" wp14:anchorId="0867CE22" wp14:editId="115BA2A8">
+                  <wp:extent cx="566928" cy="566928"/>
                   <wp:effectExtent l="0" t="0" r="0" b="0"/>
                   <wp:docPr id="1" name="Picture 1"/>
                   <wp:cNvGraphicFramePr>
@@ -262,7 +68,7 @@
                         <pic:spPr>
                           <a:xfrm>
                             <a:off x="0" y="0"/>
-                            <a:ext cx="502920" cy="502920"/>
+                            <a:ext cx="566928" cy="566928"/>
                           </a:xfrm>
                           <a:prstGeom prst="rect">
                             <a:avLst/>
@@ -278,7 +84,65 @@
         </w:tc>
         <w:tc>
           <w:tcPr>
-            <w:tcW w:w="1440" w:type="dxa"/>
+            <w:tcW w:w="6250" w:type="dxa"/>
+            <w:vAlign w:val="center"/>
+          </w:tcPr>
+          <w:p>
+            <w:pPr>
+              <w:spacing w:after="10" w:line="240" w:lineRule="auto"/>
+              <w:jc w:val="center"/>
+            </w:pPr>
+            <w:r>
+              <w:rPr>
+                <w:b/>
+                <w:sz w:val="18"/>
+              </w:rPr>
+              <w:t>Nutan Maharashtra Vidya Prasarak Mandal’s (NMVPM’s)</w:t>
+            </w:r>
+          </w:p>
+          <w:p>
+            <w:pPr>
+              <w:spacing w:after="10" w:line="240" w:lineRule="auto"/>
+              <w:jc w:val="center"/>
+            </w:pPr>
+            <w:r>
+              <w:rPr>
+                <w:b/>
+                <w:sz w:val="24"/>
+              </w:rPr>
+              <w:t>NUTAN MAHARASHTRA INSTITUTE OF ENGINEERING AND TECHNOLOGY (NMIET)</w:t>
+            </w:r>
+          </w:p>
+          <w:p>
+            <w:pPr>
+              <w:spacing w:after="10" w:line="240" w:lineRule="auto"/>
+              <w:jc w:val="center"/>
+            </w:pPr>
+            <w:r>
+              <w:rPr>
+                <w:b/>
+                <w:sz w:val="24"/>
+              </w:rPr>
+              <w:t>An Autonomous Institute</w:t>
+            </w:r>
+          </w:p>
+          <w:p>
+            <w:pPr>
+              <w:spacing w:after="10" w:line="240" w:lineRule="auto"/>
+              <w:jc w:val="center"/>
+            </w:pPr>
+            <w:r>
+              <w:rPr>
+                <w:b/>
+                <w:sz w:val="17"/>
+              </w:rPr>
+              <w:t>Under Administrative Support – Pimpri Chinchwad Education Trust (PCET)</w:t>
+            </w:r>
+          </w:p>
+        </w:tc>
+        <w:tc>
+          <w:tcPr>
+            <w:tcW w:w="979" w:type="dxa"/>
             <w:vAlign w:val="center"/>
           </w:tcPr>
           <w:p>
@@ -291,8 +155,8 @@
                 <w:noProof/>
               </w:rPr>
               <w:drawing>
-                <wp:inline distT="0" distB="0" distL="0" distR="0" wp14:anchorId="262E1409" wp14:editId="50C35A8F">
-                  <wp:extent cx="457200" cy="509047"/>
+                <wp:inline distT="0" distB="0" distL="0" distR="0" wp14:anchorId="037BB245" wp14:editId="3B72AD20">
+                  <wp:extent cx="530352" cy="590495"/>
                   <wp:effectExtent l="0" t="0" r="0" b="0"/>
                   <wp:docPr id="2" name="Picture 2"/>
                   <wp:cNvGraphicFramePr>
@@ -314,7 +178,7 @@
                         <pic:spPr>
                           <a:xfrm>
                             <a:off x="0" y="0"/>
-                            <a:ext cx="457200" cy="509047"/>
+                            <a:ext cx="530352" cy="590495"/>
                           </a:xfrm>
                           <a:prstGeom prst="rect">
                             <a:avLst/>
@@ -332,14 +196,66 @@
     </w:tbl>
     <w:p>
       <w:pPr>
-        <w:spacing w:before="80" w:after="40" w:line="240" w:lineRule="auto"/>
+        <w:tabs>
+          <w:tab w:val="center" w:pos="4104"/>
+          <w:tab w:val="right" w:pos="8208"/>
+        </w:tabs>
+        <w:spacing w:before="40" w:after="0" w:line="240" w:lineRule="auto"/>
+        <w:jc w:val="left"/>
+      </w:pPr>
+      <w:r>
+        <w:rPr>
+          <w:b/>
+          <w:sz w:val="17"/>
+        </w:rPr>
+        <w:t>Approved by AICTE</w:t>
+      </w:r>
+      <w:r>
+        <w:rPr>
+          <w:b/>
+          <w:sz w:val="17"/>
+        </w:rPr>
+        <w:tab/>
+        <w:t>Accredited by NAAC</w:t>
+      </w:r>
+      <w:r>
+        <w:rPr>
+          <w:b/>
+          <w:sz w:val="17"/>
+        </w:rPr>
+        <w:tab/>
+        <w:t>Affiliated to SPPU</w:t>
+      </w:r>
+    </w:p>
+    <w:p>
+      <w:pPr>
+        <w:spacing w:after="200" w:line="240" w:lineRule="auto"/>
+      </w:pPr>
+    </w:p>
+    <w:p>
+      <w:pPr>
+        <w:spacing w:after="200" w:line="240" w:lineRule="auto"/>
         <w:jc w:val="center"/>
       </w:pPr>
       <w:r>
         <w:rPr>
-          <w:sz w:val="19"/>
-        </w:rPr>
-        <w:t>Samarth Vidya Sankul, Vishnupuri, Talegaon Dabhade, Maharashtra 410507</w:t>
+          <w:b/>
+          <w:sz w:val="34"/>
+        </w:rPr>
+        <w:t>Technical Seminar Report on</w:t>
+      </w:r>
+    </w:p>
+    <w:p>
+      <w:pPr>
+        <w:spacing w:after="160" w:line="269" w:lineRule="auto"/>
+        <w:jc w:val="center"/>
+      </w:pPr>
+      <w:r>
+        <w:rPr>
+          <w:b/>
+          <w:sz w:val="30"/>
+        </w:rPr>
+        <w:t>CHAINGUARD V2: A TAMPER-EVIDENT LAST-MILE LOGISTICS CONTROL PLANE FOR SEALED DISPATCH, CUSTOMER-AUTHORISED CUSTODY BREAKS AND UNIT-EXACT SHRINKAGE RECONCILIATION</w:t>
       </w:r>
     </w:p>
     <w:p>
@@ -350,9 +266,282 @@
       <w:r>
         <w:rPr>
           <w:b/>
-          <w:sz w:val="20"/>
-        </w:rPr>
-        <w:t>Department of Computer Science and Engineering</w:t>
+        </w:rPr>
+        <w:t>Project Reference: ChainGuard v2.4</w:t>
+      </w:r>
+    </w:p>
+    <w:p>
+      <w:pPr>
+        <w:spacing w:after="40" w:line="240" w:lineRule="auto"/>
+        <w:jc w:val="center"/>
+      </w:pPr>
+      <w:r>
+        <w:rPr>
+          <w:b/>
+          <w:sz w:val="23"/>
+        </w:rPr>
+        <w:t>SUBMITTED TO THE DEPARTMENT OF</w:t>
+      </w:r>
+    </w:p>
+    <w:p>
+      <w:pPr>
+        <w:spacing w:after="560" w:line="240" w:lineRule="auto"/>
+        <w:jc w:val="center"/>
+      </w:pPr>
+      <w:r>
+        <w:rPr>
+          <w:b/>
+          <w:sz w:val="23"/>
+        </w:rPr>
+        <w:t>COMPUTER SCIENCE &amp; ENGINEERING</w:t>
+      </w:r>
+    </w:p>
+    <w:p>
+      <w:pPr>
+        <w:spacing w:after="200" w:line="240" w:lineRule="auto"/>
+        <w:jc w:val="center"/>
+      </w:pPr>
+      <w:r>
+        <w:rPr>
+          <w:b/>
+          <w:sz w:val="26"/>
+        </w:rPr>
+        <w:t>SUBMITTED BY</w:t>
+      </w:r>
+    </w:p>
+    <w:tbl>
+      <w:tblPr>
+        <w:tblW w:w="0" w:type="auto"/>
+        <w:jc w:val="center"/>
+        <w:tblBorders>
+          <w:top w:val="nil"/>
+          <w:left w:val="nil"/>
+          <w:bottom w:val="nil"/>
+          <w:right w:val="nil"/>
+          <w:insideH w:val="nil"/>
+          <w:insideV w:val="nil"/>
+        </w:tblBorders>
+        <w:tblLayout w:type="fixed"/>
+        <w:tblCellMar>
+          <w:top w:w="14" w:type="dxa"/>
+          <w:left w:w="72" w:type="dxa"/>
+          <w:bottom w:w="14" w:type="dxa"/>
+          <w:right w:w="72" w:type="dxa"/>
+        </w:tblCellMar>
+        <w:tblLook w:val="04A0" w:firstRow="1" w:lastRow="0" w:firstColumn="1" w:lastColumn="0" w:noHBand="0" w:noVBand="1"/>
+      </w:tblPr>
+      <w:tblGrid>
+        <w:gridCol w:w="3672"/>
+        <w:gridCol w:w="1656"/>
+      </w:tblGrid>
+      <w:tr>
+        <w:trPr>
+          <w:jc w:val="center"/>
+        </w:trPr>
+        <w:tc>
+          <w:tcPr>
+            <w:tcW w:w="3672" w:type="dxa"/>
+            <w:tcBorders>
+              <w:bottom w:val="single" w:sz="4" w:space="0" w:color="000000"/>
+            </w:tcBorders>
+          </w:tcPr>
+          <w:p>
+            <w:pPr>
+              <w:spacing w:after="40"/>
+              <w:jc w:val="left"/>
+            </w:pPr>
+            <w:r>
+              <w:rPr>
+                <w:b/>
+              </w:rPr>
+              <w:t>Student Name</w:t>
+            </w:r>
+          </w:p>
+        </w:tc>
+        <w:tc>
+          <w:tcPr>
+            <w:tcW w:w="1656" w:type="dxa"/>
+            <w:tcBorders>
+              <w:bottom w:val="single" w:sz="4" w:space="0" w:color="000000"/>
+            </w:tcBorders>
+          </w:tcPr>
+          <w:p>
+            <w:pPr>
+              <w:spacing w:after="40"/>
+              <w:jc w:val="left"/>
+            </w:pPr>
+            <w:r>
+              <w:rPr>
+                <w:b/>
+              </w:rPr>
+              <w:t>Roll No.</w:t>
+            </w:r>
+          </w:p>
+        </w:tc>
+      </w:tr>
+      <w:tr>
+        <w:trPr>
+          <w:cantSplit/>
+          <w:jc w:val="center"/>
+        </w:trPr>
+        <w:tc>
+          <w:tcPr>
+            <w:tcW w:w="3672" w:type="dxa"/>
+          </w:tcPr>
+          <w:p>
+            <w:pPr>
+              <w:spacing w:before="20" w:after="20" w:line="240" w:lineRule="auto"/>
+              <w:jc w:val="left"/>
+            </w:pPr>
+            <w:r>
+              <w:rPr>
+                <w:sz w:val="22"/>
+              </w:rPr>
+              <w:t>Ms. Pallavi Kokate</w:t>
+            </w:r>
+          </w:p>
+        </w:tc>
+        <w:tc>
+          <w:tcPr>
+            <w:tcW w:w="1656" w:type="dxa"/>
+          </w:tcPr>
+          <w:p>
+            <w:pPr>
+              <w:spacing w:before="20" w:after="20" w:line="240" w:lineRule="auto"/>
+              <w:jc w:val="left"/>
+            </w:pPr>
+            <w:r>
+              <w:rPr>
+                <w:sz w:val="22"/>
+              </w:rPr>
+              <w:t>B34</w:t>
+            </w:r>
+          </w:p>
+        </w:tc>
+      </w:tr>
+      <w:tr>
+        <w:trPr>
+          <w:cantSplit/>
+          <w:jc w:val="center"/>
+        </w:trPr>
+        <w:tc>
+          <w:tcPr>
+            <w:tcW w:w="3672" w:type="dxa"/>
+          </w:tcPr>
+          <w:p>
+            <w:pPr>
+              <w:spacing w:before="20" w:after="20" w:line="240" w:lineRule="auto"/>
+              <w:jc w:val="left"/>
+            </w:pPr>
+            <w:r>
+              <w:rPr>
+                <w:sz w:val="22"/>
+              </w:rPr>
+              <w:t>Mr. Anil Kewat</w:t>
+            </w:r>
+          </w:p>
+        </w:tc>
+        <w:tc>
+          <w:tcPr>
+            <w:tcW w:w="1656" w:type="dxa"/>
+          </w:tcPr>
+          <w:p>
+            <w:pPr>
+              <w:spacing w:before="20" w:after="20" w:line="240" w:lineRule="auto"/>
+              <w:jc w:val="left"/>
+            </w:pPr>
+            <w:r>
+              <w:rPr>
+                <w:sz w:val="22"/>
+              </w:rPr>
+              <w:t>B45</w:t>
+            </w:r>
+          </w:p>
+        </w:tc>
+      </w:tr>
+      <w:tr>
+        <w:trPr>
+          <w:cantSplit/>
+          <w:jc w:val="center"/>
+        </w:trPr>
+        <w:tc>
+          <w:tcPr>
+            <w:tcW w:w="3672" w:type="dxa"/>
+          </w:tcPr>
+          <w:p>
+            <w:pPr>
+              <w:spacing w:before="20" w:after="20" w:line="240" w:lineRule="auto"/>
+              <w:jc w:val="left"/>
+            </w:pPr>
+            <w:r>
+              <w:rPr>
+                <w:sz w:val="22"/>
+              </w:rPr>
+              <w:t>Ms. Nikita Sagar</w:t>
+            </w:r>
+          </w:p>
+        </w:tc>
+        <w:tc>
+          <w:tcPr>
+            <w:tcW w:w="1656" w:type="dxa"/>
+          </w:tcPr>
+          <w:p>
+            <w:pPr>
+              <w:spacing w:before="20" w:after="20" w:line="240" w:lineRule="auto"/>
+              <w:jc w:val="left"/>
+            </w:pPr>
+            <w:r>
+              <w:rPr>
+                <w:sz w:val="22"/>
+              </w:rPr>
+              <w:t>B50</w:t>
+            </w:r>
+          </w:p>
+        </w:tc>
+      </w:tr>
+    </w:tbl>
+    <w:p>
+      <w:pPr>
+        <w:spacing w:after="120" w:line="240" w:lineRule="auto"/>
+      </w:pPr>
+    </w:p>
+    <w:p>
+      <w:pPr>
+        <w:spacing w:before="520" w:after="80" w:line="240" w:lineRule="auto"/>
+        <w:jc w:val="center"/>
+      </w:pPr>
+      <w:r>
+        <w:rPr>
+          <w:b/>
+          <w:sz w:val="27"/>
+        </w:rPr>
+        <w:t>Under The Guidance of</w:t>
+      </w:r>
+    </w:p>
+    <w:p>
+      <w:pPr>
+        <w:spacing w:after="2000" w:line="240" w:lineRule="auto"/>
+        <w:jc w:val="center"/>
+      </w:pPr>
+      <w:r>
+        <w:rPr>
+          <w:b/>
+          <w:sz w:val="27"/>
+        </w:rPr>
+        <w:t>Miss. Sakshi Ambadkar</w:t>
+      </w:r>
+    </w:p>
+    <w:p>
+      <w:pPr>
+        <w:spacing w:after="200" w:line="240" w:lineRule="auto"/>
+        <w:jc w:val="center"/>
+      </w:pPr>
+      <w:r>
+        <w:rPr>
+          <w:b/>
+          <w:sz w:val="27"/>
+        </w:rPr>
+        <w:t>ACADEMIC YEAR : 2026–27</w:t>
       </w:r>
     </w:p>
     <w:p>
@@ -362,10 +551,9 @@
       </w:pPr>
       <w:r>
         <w:rPr>
-          <w:b/>
-          <w:sz w:val="22"/>
-        </w:rPr>
-        <w:t>ACADEMIC YEAR : 2026–27</w:t>
+          <w:sz w:val="17"/>
+        </w:rPr>
+        <w:t>Samarth Vidya Sankul, Vishnupuri, Talegaon Dabhade, Maharashtra 410507</w:t>
       </w:r>
     </w:p>
     <w:p>
@@ -386,54 +574,6 @@
         </w:sectPr>
       </w:pPr>
     </w:p>
-    <w:p>
-      <w:pPr>
-        <w:keepNext/>
-        <w:spacing w:after="440" w:line="240" w:lineRule="auto"/>
-        <w:jc w:val="center"/>
-      </w:pPr>
-      <w:bookmarkStart w:id="0" w:name="bm_cert"/>
-      <w:r>
-        <w:rPr>
-          <w:b/>
-          <w:sz w:val="30"/>
-        </w:rPr>
-        <w:lastRenderedPageBreak/>
-        <w:t>CERTIFICATE</w:t>
-      </w:r>
-      <w:bookmarkEnd w:id="0"/>
-    </w:p>
-    <w:p>
-      <w:pPr>
-        <w:keepNext/>
-        <w:spacing w:after="180"/>
-      </w:pPr>
-      <w:r>
-        <w:t xml:space="preserve">This is to certify that the seminar entitled </w:t>
-      </w:r>
-      <w:r>
-        <w:rPr>
-          <w:b/>
-        </w:rPr>
-        <w:t>“ChainGuard v2: A Tamper-Evident Last-Mile Logistics Control Plane for Sealed Dispatch, Customer-Authorised Custody Breaks and Unit-Exact Shrinkage Reconciliation”</w:t>
-      </w:r>
-      <w:r>
-        <w:t xml:space="preserve"> submitted by Ms. Pallavi Kokate (B34), Mr. Anil Kewat (B45) and Ms. Nikita Sagar (B50), students of Third Year Computer Science and Engineering, is a bonafide work carried out by them under the supervision of Miss. Sakshi Ambadkar, and it is approved for the partial fulfillment of the requirement of Savitribai Phule Pune University, Pune for the award of the degree of Third Year Computer Science and Engineering.</w:t>
-      </w:r>
-    </w:p>
-    <w:p>
-      <w:pPr>
-        <w:spacing w:after="360"/>
-      </w:pPr>
-      <w:r>
-        <w:t>The seminar work has not been earlier submitted to any other institute or university for the award of degree.</w:t>
-      </w:r>
-    </w:p>
-    <w:p>
-      <w:pPr>
-        <w:spacing w:after="1760" w:line="240" w:lineRule="auto"/>
-      </w:pPr>
-    </w:p>
     <w:tbl>
       <w:tblPr>
         <w:tblW w:w="0" w:type="auto"/>
@@ -447,6 +587,517 @@
           <w:insideV w:val="nil"/>
         </w:tblBorders>
         <w:tblLayout w:type="fixed"/>
+        <w:tblCellMar>
+          <w:left w:w="28" w:type="dxa"/>
+          <w:right w:w="28" w:type="dxa"/>
+        </w:tblCellMar>
+        <w:tblLook w:val="04A0" w:firstRow="1" w:lastRow="0" w:firstColumn="1" w:lastColumn="0" w:noHBand="0" w:noVBand="1"/>
+      </w:tblPr>
+      <w:tblGrid>
+        <w:gridCol w:w="979"/>
+        <w:gridCol w:w="6250"/>
+        <w:gridCol w:w="979"/>
+      </w:tblGrid>
+      <w:tr>
+        <w:trPr>
+          <w:jc w:val="center"/>
+        </w:trPr>
+        <w:tc>
+          <w:tcPr>
+            <w:tcW w:w="979" w:type="dxa"/>
+            <w:vAlign w:val="center"/>
+          </w:tcPr>
+          <w:p>
+            <w:pPr>
+              <w:spacing w:after="0" w:line="240" w:lineRule="auto"/>
+              <w:jc w:val="center"/>
+            </w:pPr>
+            <w:r>
+              <w:rPr>
+                <w:noProof/>
+              </w:rPr>
+              <w:lastRenderedPageBreak/>
+              <w:drawing>
+                <wp:inline distT="0" distB="0" distL="0" distR="0" wp14:anchorId="396876F9" wp14:editId="77A8F9D5">
+                  <wp:extent cx="566928" cy="566928"/>
+                  <wp:effectExtent l="0" t="0" r="0" b="0"/>
+                  <wp:docPr id="3" name="Picture 3"/>
+                  <wp:cNvGraphicFramePr>
+                    <a:graphicFrameLocks xmlns:a="http://schemas.openxmlformats.org/drawingml/2006/main" noChangeAspect="1"/>
+                  </wp:cNvGraphicFramePr>
+                  <a:graphic xmlns:a="http://schemas.openxmlformats.org/drawingml/2006/main">
+                    <a:graphicData uri="http://schemas.openxmlformats.org/drawingml/2006/picture">
+                      <pic:pic xmlns:pic="http://schemas.openxmlformats.org/drawingml/2006/picture">
+                        <pic:nvPicPr>
+                          <pic:cNvPr id="0" name="logo_college.png"/>
+                          <pic:cNvPicPr/>
+                        </pic:nvPicPr>
+                        <pic:blipFill>
+                          <a:blip r:embed="rId8"/>
+                          <a:stretch>
+                            <a:fillRect/>
+                          </a:stretch>
+                        </pic:blipFill>
+                        <pic:spPr>
+                          <a:xfrm>
+                            <a:off x="0" y="0"/>
+                            <a:ext cx="566928" cy="566928"/>
+                          </a:xfrm>
+                          <a:prstGeom prst="rect">
+                            <a:avLst/>
+                          </a:prstGeom>
+                        </pic:spPr>
+                      </pic:pic>
+                    </a:graphicData>
+                  </a:graphic>
+                </wp:inline>
+              </w:drawing>
+            </w:r>
+          </w:p>
+        </w:tc>
+        <w:tc>
+          <w:tcPr>
+            <w:tcW w:w="6250" w:type="dxa"/>
+            <w:vAlign w:val="center"/>
+          </w:tcPr>
+          <w:p>
+            <w:pPr>
+              <w:spacing w:after="10" w:line="240" w:lineRule="auto"/>
+              <w:jc w:val="center"/>
+            </w:pPr>
+            <w:r>
+              <w:rPr>
+                <w:b/>
+                <w:sz w:val="18"/>
+              </w:rPr>
+              <w:t>Nutan Maharashtra Vidya Prasarak Mandal’s (NMVPM’s)</w:t>
+            </w:r>
+          </w:p>
+          <w:p>
+            <w:pPr>
+              <w:spacing w:after="10" w:line="240" w:lineRule="auto"/>
+              <w:jc w:val="center"/>
+            </w:pPr>
+            <w:r>
+              <w:rPr>
+                <w:b/>
+                <w:sz w:val="24"/>
+              </w:rPr>
+              <w:t>NUTAN MAHARASHTRA INSTITUTE OF ENGINEERING AND TECHNOLOGY (NMIET)</w:t>
+            </w:r>
+          </w:p>
+          <w:p>
+            <w:pPr>
+              <w:spacing w:after="10" w:line="240" w:lineRule="auto"/>
+              <w:jc w:val="center"/>
+            </w:pPr>
+            <w:r>
+              <w:rPr>
+                <w:b/>
+                <w:sz w:val="24"/>
+              </w:rPr>
+              <w:t>An Autonomous Institute</w:t>
+            </w:r>
+          </w:p>
+          <w:p>
+            <w:pPr>
+              <w:spacing w:after="10" w:line="240" w:lineRule="auto"/>
+              <w:jc w:val="center"/>
+            </w:pPr>
+            <w:r>
+              <w:rPr>
+                <w:b/>
+                <w:sz w:val="17"/>
+              </w:rPr>
+              <w:t>Under Administrative Support – Pimpri Chinchwad Education Trust (PCET)</w:t>
+            </w:r>
+          </w:p>
+        </w:tc>
+        <w:tc>
+          <w:tcPr>
+            <w:tcW w:w="979" w:type="dxa"/>
+            <w:vAlign w:val="center"/>
+          </w:tcPr>
+          <w:p>
+            <w:pPr>
+              <w:spacing w:after="0" w:line="240" w:lineRule="auto"/>
+              <w:jc w:val="center"/>
+            </w:pPr>
+            <w:r>
+              <w:rPr>
+                <w:noProof/>
+              </w:rPr>
+              <w:drawing>
+                <wp:inline distT="0" distB="0" distL="0" distR="0" wp14:anchorId="2885563E" wp14:editId="1E4A57BA">
+                  <wp:extent cx="530352" cy="590495"/>
+                  <wp:effectExtent l="0" t="0" r="0" b="0"/>
+                  <wp:docPr id="4" name="Picture 4"/>
+                  <wp:cNvGraphicFramePr>
+                    <a:graphicFrameLocks xmlns:a="http://schemas.openxmlformats.org/drawingml/2006/main" noChangeAspect="1"/>
+                  </wp:cNvGraphicFramePr>
+                  <a:graphic xmlns:a="http://schemas.openxmlformats.org/drawingml/2006/main">
+                    <a:graphicData uri="http://schemas.openxmlformats.org/drawingml/2006/picture">
+                      <pic:pic xmlns:pic="http://schemas.openxmlformats.org/drawingml/2006/picture">
+                        <pic:nvPicPr>
+                          <pic:cNvPr id="0" name="logo_university.png"/>
+                          <pic:cNvPicPr/>
+                        </pic:nvPicPr>
+                        <pic:blipFill>
+                          <a:blip r:embed="rId9"/>
+                          <a:stretch>
+                            <a:fillRect/>
+                          </a:stretch>
+                        </pic:blipFill>
+                        <pic:spPr>
+                          <a:xfrm>
+                            <a:off x="0" y="0"/>
+                            <a:ext cx="530352" cy="590495"/>
+                          </a:xfrm>
+                          <a:prstGeom prst="rect">
+                            <a:avLst/>
+                          </a:prstGeom>
+                        </pic:spPr>
+                      </pic:pic>
+                    </a:graphicData>
+                  </a:graphic>
+                </wp:inline>
+              </w:drawing>
+            </w:r>
+          </w:p>
+        </w:tc>
+      </w:tr>
+    </w:tbl>
+    <w:p>
+      <w:pPr>
+        <w:tabs>
+          <w:tab w:val="center" w:pos="4104"/>
+          <w:tab w:val="right" w:pos="8208"/>
+        </w:tabs>
+        <w:spacing w:before="40" w:after="0" w:line="240" w:lineRule="auto"/>
+        <w:jc w:val="left"/>
+      </w:pPr>
+      <w:r>
+        <w:rPr>
+          <w:b/>
+          <w:sz w:val="17"/>
+        </w:rPr>
+        <w:t>Approved by AICTE</w:t>
+      </w:r>
+      <w:r>
+        <w:rPr>
+          <w:b/>
+          <w:sz w:val="17"/>
+        </w:rPr>
+        <w:tab/>
+        <w:t>Accredited by NAAC</w:t>
+      </w:r>
+      <w:r>
+        <w:rPr>
+          <w:b/>
+          <w:sz w:val="17"/>
+        </w:rPr>
+        <w:tab/>
+        <w:t>Affiliated to SPPU</w:t>
+      </w:r>
+    </w:p>
+    <w:p>
+      <w:pPr>
+        <w:spacing w:after="200" w:line="240" w:lineRule="auto"/>
+      </w:pPr>
+    </w:p>
+    <w:p>
+      <w:pPr>
+        <w:keepNext/>
+        <w:spacing w:after="320" w:line="240" w:lineRule="auto"/>
+        <w:jc w:val="center"/>
+      </w:pPr>
+      <w:bookmarkStart w:id="0" w:name="bm_cert"/>
+      <w:r>
+        <w:rPr>
+          <w:b/>
+          <w:sz w:val="36"/>
+        </w:rPr>
+        <w:t>CERTIFICATE</w:t>
+      </w:r>
+      <w:bookmarkEnd w:id="0"/>
+    </w:p>
+    <w:p>
+      <w:pPr>
+        <w:spacing w:after="140"/>
+        <w:jc w:val="center"/>
+      </w:pPr>
+      <w:r>
+        <w:rPr>
+          <w:sz w:val="23"/>
+        </w:rPr>
+        <w:t>This is to certify that the technical seminar report</w:t>
+      </w:r>
+    </w:p>
+    <w:p>
+      <w:pPr>
+        <w:spacing w:after="140" w:line="276" w:lineRule="auto"/>
+        <w:jc w:val="center"/>
+      </w:pPr>
+      <w:r>
+        <w:rPr>
+          <w:b/>
+          <w:sz w:val="24"/>
+        </w:rPr>
+        <w:t>“ChainGuard v2: A Tamper-Evident Last-Mile Logistics Control Plane for Sealed Dispatch, Customer-Authorised Custody Breaks and Unit-Exact Shrinkage Reconciliation”</w:t>
+      </w:r>
+    </w:p>
+    <w:p>
+      <w:pPr>
+        <w:spacing w:after="100"/>
+        <w:jc w:val="center"/>
+      </w:pPr>
+      <w:r>
+        <w:rPr>
+          <w:sz w:val="23"/>
+        </w:rPr>
+        <w:t>Submitted by</w:t>
+      </w:r>
+    </w:p>
+    <w:tbl>
+      <w:tblPr>
+        <w:tblW w:w="0" w:type="auto"/>
+        <w:jc w:val="center"/>
+        <w:tblBorders>
+          <w:top w:val="nil"/>
+          <w:left w:val="nil"/>
+          <w:bottom w:val="nil"/>
+          <w:right w:val="nil"/>
+          <w:insideH w:val="nil"/>
+          <w:insideV w:val="nil"/>
+        </w:tblBorders>
+        <w:tblLayout w:type="fixed"/>
+        <w:tblCellMar>
+          <w:top w:w="14" w:type="dxa"/>
+          <w:left w:w="72" w:type="dxa"/>
+          <w:bottom w:w="14" w:type="dxa"/>
+          <w:right w:w="72" w:type="dxa"/>
+        </w:tblCellMar>
+        <w:tblLook w:val="04A0" w:firstRow="1" w:lastRow="0" w:firstColumn="1" w:lastColumn="0" w:noHBand="0" w:noVBand="1"/>
+      </w:tblPr>
+      <w:tblGrid>
+        <w:gridCol w:w="3672"/>
+        <w:gridCol w:w="1656"/>
+      </w:tblGrid>
+      <w:tr>
+        <w:trPr>
+          <w:jc w:val="center"/>
+        </w:trPr>
+        <w:tc>
+          <w:tcPr>
+            <w:tcW w:w="3672" w:type="dxa"/>
+            <w:tcBorders>
+              <w:bottom w:val="single" w:sz="4" w:space="0" w:color="000000"/>
+            </w:tcBorders>
+          </w:tcPr>
+          <w:p>
+            <w:pPr>
+              <w:spacing w:after="40"/>
+              <w:jc w:val="left"/>
+            </w:pPr>
+            <w:r>
+              <w:rPr>
+                <w:b/>
+              </w:rPr>
+              <w:t>Student Name</w:t>
+            </w:r>
+          </w:p>
+        </w:tc>
+        <w:tc>
+          <w:tcPr>
+            <w:tcW w:w="1656" w:type="dxa"/>
+            <w:tcBorders>
+              <w:bottom w:val="single" w:sz="4" w:space="0" w:color="000000"/>
+            </w:tcBorders>
+          </w:tcPr>
+          <w:p>
+            <w:pPr>
+              <w:spacing w:after="40"/>
+              <w:jc w:val="left"/>
+            </w:pPr>
+            <w:r>
+              <w:rPr>
+                <w:b/>
+              </w:rPr>
+              <w:t>Roll No.</w:t>
+            </w:r>
+          </w:p>
+        </w:tc>
+      </w:tr>
+      <w:tr>
+        <w:trPr>
+          <w:cantSplit/>
+          <w:jc w:val="center"/>
+        </w:trPr>
+        <w:tc>
+          <w:tcPr>
+            <w:tcW w:w="3672" w:type="dxa"/>
+          </w:tcPr>
+          <w:p>
+            <w:pPr>
+              <w:spacing w:before="20" w:after="20" w:line="240" w:lineRule="auto"/>
+              <w:jc w:val="left"/>
+            </w:pPr>
+            <w:r>
+              <w:rPr>
+                <w:sz w:val="22"/>
+              </w:rPr>
+              <w:t>Ms. Pallavi Kokate</w:t>
+            </w:r>
+          </w:p>
+        </w:tc>
+        <w:tc>
+          <w:tcPr>
+            <w:tcW w:w="1656" w:type="dxa"/>
+          </w:tcPr>
+          <w:p>
+            <w:pPr>
+              <w:spacing w:before="20" w:after="20" w:line="240" w:lineRule="auto"/>
+              <w:jc w:val="left"/>
+            </w:pPr>
+            <w:r>
+              <w:rPr>
+                <w:sz w:val="22"/>
+              </w:rPr>
+              <w:t>B34</w:t>
+            </w:r>
+          </w:p>
+        </w:tc>
+      </w:tr>
+      <w:tr>
+        <w:trPr>
+          <w:cantSplit/>
+          <w:jc w:val="center"/>
+        </w:trPr>
+        <w:tc>
+          <w:tcPr>
+            <w:tcW w:w="3672" w:type="dxa"/>
+          </w:tcPr>
+          <w:p>
+            <w:pPr>
+              <w:spacing w:before="20" w:after="20" w:line="240" w:lineRule="auto"/>
+              <w:jc w:val="left"/>
+            </w:pPr>
+            <w:r>
+              <w:rPr>
+                <w:sz w:val="22"/>
+              </w:rPr>
+              <w:t>Mr. Anil Kewat</w:t>
+            </w:r>
+          </w:p>
+        </w:tc>
+        <w:tc>
+          <w:tcPr>
+            <w:tcW w:w="1656" w:type="dxa"/>
+          </w:tcPr>
+          <w:p>
+            <w:pPr>
+              <w:spacing w:before="20" w:after="20" w:line="240" w:lineRule="auto"/>
+              <w:jc w:val="left"/>
+            </w:pPr>
+            <w:r>
+              <w:rPr>
+                <w:sz w:val="22"/>
+              </w:rPr>
+              <w:t>B45</w:t>
+            </w:r>
+          </w:p>
+        </w:tc>
+      </w:tr>
+      <w:tr>
+        <w:trPr>
+          <w:cantSplit/>
+          <w:jc w:val="center"/>
+        </w:trPr>
+        <w:tc>
+          <w:tcPr>
+            <w:tcW w:w="3672" w:type="dxa"/>
+          </w:tcPr>
+          <w:p>
+            <w:pPr>
+              <w:spacing w:before="20" w:after="20" w:line="240" w:lineRule="auto"/>
+              <w:jc w:val="left"/>
+            </w:pPr>
+            <w:r>
+              <w:rPr>
+                <w:sz w:val="22"/>
+              </w:rPr>
+              <w:t>Ms. Nikita Sagar</w:t>
+            </w:r>
+          </w:p>
+        </w:tc>
+        <w:tc>
+          <w:tcPr>
+            <w:tcW w:w="1656" w:type="dxa"/>
+          </w:tcPr>
+          <w:p>
+            <w:pPr>
+              <w:spacing w:before="20" w:after="20" w:line="240" w:lineRule="auto"/>
+              <w:jc w:val="left"/>
+            </w:pPr>
+            <w:r>
+              <w:rPr>
+                <w:sz w:val="22"/>
+              </w:rPr>
+              <w:t>B50</w:t>
+            </w:r>
+          </w:p>
+        </w:tc>
+      </w:tr>
+    </w:tbl>
+    <w:p>
+      <w:pPr>
+        <w:spacing w:after="120" w:line="240" w:lineRule="auto"/>
+      </w:pPr>
+    </w:p>
+    <w:p>
+      <w:pPr>
+        <w:spacing w:after="120"/>
+      </w:pPr>
+      <w:r>
+        <w:rPr>
+          <w:sz w:val="22"/>
+        </w:rPr>
+        <w:t>Has completed the technical seminar report satisfactorily in the subject of Technical Seminar (ELC342CSE) for the academic year 2026–2027 as prescribed in the syllabus of Savitribai Phule Pune University, Pune.</w:t>
+      </w:r>
+    </w:p>
+    <w:p>
+      <w:pPr>
+        <w:spacing w:after="0"/>
+      </w:pPr>
+      <w:r>
+        <w:rPr>
+          <w:sz w:val="22"/>
+        </w:rPr>
+        <w:t>The work was carried out under the guidance of Miss. Sakshi Ambadkar and has not been submitted earlier to any other institute or university for the award of a degree.</w:t>
+      </w:r>
+    </w:p>
+    <w:p>
+      <w:pPr>
+        <w:spacing w:after="2360" w:line="240" w:lineRule="auto"/>
+      </w:pPr>
+    </w:p>
+    <w:tbl>
+      <w:tblPr>
+        <w:tblW w:w="0" w:type="auto"/>
+        <w:jc w:val="center"/>
+        <w:tblBorders>
+          <w:top w:val="nil"/>
+          <w:left w:val="nil"/>
+          <w:bottom w:val="nil"/>
+          <w:right w:val="nil"/>
+          <w:insideH w:val="nil"/>
+          <w:insideV w:val="nil"/>
+        </w:tblBorders>
+        <w:tblLayout w:type="fixed"/>
+        <w:tblCellMar>
+          <w:left w:w="28" w:type="dxa"/>
+          <w:right w:w="28" w:type="dxa"/>
+        </w:tblCellMar>
         <w:tblLook w:val="04A0" w:firstRow="1" w:lastRow="0" w:firstColumn="1" w:lastColumn="0" w:noHBand="0" w:noVBand="1"/>
       </w:tblPr>
       <w:tblGrid>
@@ -469,20 +1120,33 @@
               <w:jc w:val="center"/>
             </w:pPr>
             <w:r>
+              <w:t>Miss. Sakshi Ambadkar</w:t>
+            </w:r>
+          </w:p>
+          <w:p>
+            <w:pPr>
+              <w:spacing w:before="20" w:after="0" w:line="240" w:lineRule="auto"/>
+              <w:jc w:val="center"/>
+            </w:pPr>
+            <w:r>
               <w:rPr>
                 <w:b/>
-                <w:sz w:val="22"/>
-              </w:rPr>
-              <w:t>Prof. Sakshi Ambadkar</w:t>
-            </w:r>
-          </w:p>
-          <w:p>
-            <w:pPr>
-              <w:spacing w:before="40" w:after="0"/>
+                <w:sz w:val="20"/>
+              </w:rPr>
+              <w:t>Seminar Guide</w:t>
+            </w:r>
+          </w:p>
+          <w:p>
+            <w:pPr>
+              <w:spacing w:before="20" w:after="0" w:line="240" w:lineRule="auto"/>
               <w:jc w:val="center"/>
             </w:pPr>
             <w:r>
-              <w:t>(Seminar Guide)</w:t>
+              <w:rPr>
+                <w:b/>
+                <w:sz w:val="20"/>
+              </w:rPr>
+              <w:t>Dept. of CSE</w:t>
             </w:r>
           </w:p>
         </w:tc>
@@ -497,20 +1161,33 @@
               <w:jc w:val="center"/>
             </w:pPr>
             <w:r>
+              <w:t>Dr. Mahesh Wankhede</w:t>
+            </w:r>
+          </w:p>
+          <w:p>
+            <w:pPr>
+              <w:spacing w:before="20" w:after="0" w:line="240" w:lineRule="auto"/>
+              <w:jc w:val="center"/>
+            </w:pPr>
+            <w:r>
               <w:rPr>
                 <w:b/>
-                <w:sz w:val="22"/>
-              </w:rPr>
-              <w:t>Dr. Mahesh Wankhede</w:t>
-            </w:r>
-          </w:p>
-          <w:p>
-            <w:pPr>
-              <w:spacing w:before="40" w:after="0"/>
+                <w:sz w:val="20"/>
+              </w:rPr>
+              <w:t>HOD</w:t>
+            </w:r>
+          </w:p>
+          <w:p>
+            <w:pPr>
+              <w:spacing w:before="20" w:after="0" w:line="240" w:lineRule="auto"/>
               <w:jc w:val="center"/>
             </w:pPr>
             <w:r>
-              <w:t>HOD</w:t>
+              <w:rPr>
+                <w:b/>
+                <w:sz w:val="20"/>
+              </w:rPr>
+              <w:t>Dept. of CSE</w:t>
             </w:r>
           </w:p>
         </w:tc>
@@ -525,20 +1202,33 @@
               <w:jc w:val="center"/>
             </w:pPr>
             <w:r>
+              <w:t>Dr. Pramod Patil</w:t>
+            </w:r>
+          </w:p>
+          <w:p>
+            <w:pPr>
+              <w:spacing w:before="20" w:after="0" w:line="240" w:lineRule="auto"/>
+              <w:jc w:val="center"/>
+            </w:pPr>
+            <w:r>
               <w:rPr>
                 <w:b/>
-                <w:sz w:val="22"/>
-              </w:rPr>
-              <w:t>Dr. Pramod Patil</w:t>
-            </w:r>
-          </w:p>
-          <w:p>
-            <w:pPr>
-              <w:spacing w:before="40" w:after="0"/>
+                <w:sz w:val="20"/>
+              </w:rPr>
+              <w:t>Principal</w:t>
+            </w:r>
+          </w:p>
+          <w:p>
+            <w:pPr>
+              <w:spacing w:before="20" w:after="0" w:line="240" w:lineRule="auto"/>
               <w:jc w:val="center"/>
             </w:pPr>
             <w:r>
-              <w:t>Principal</w:t>
+              <w:rPr>
+                <w:b/>
+                <w:sz w:val="20"/>
+              </w:rPr>
+              <w:t>NMIET Pune</w:t>
             </w:r>
           </w:p>
         </w:tc>
@@ -546,30 +1236,24 @@
     </w:tbl>
     <w:p>
       <w:pPr>
-        <w:spacing w:after="1600" w:line="240" w:lineRule="auto"/>
-      </w:pPr>
-    </w:p>
-    <w:p>
-      <w:pPr>
-        <w:spacing w:after="40" w:line="288" w:lineRule="auto"/>
+        <w:spacing w:after="440" w:line="240" w:lineRule="auto"/>
+      </w:pPr>
+    </w:p>
+    <w:p>
+      <w:pPr>
+        <w:spacing w:after="20" w:line="264" w:lineRule="auto"/>
         <w:jc w:val="left"/>
       </w:pPr>
       <w:r>
-        <w:rPr>
-          <w:sz w:val="22"/>
-        </w:rPr>
         <w:t>Place : Pune</w:t>
       </w:r>
     </w:p>
     <w:p>
       <w:pPr>
-        <w:spacing w:after="0" w:line="288" w:lineRule="auto"/>
+        <w:spacing w:after="0" w:line="264" w:lineRule="auto"/>
         <w:jc w:val="left"/>
       </w:pPr>
       <w:r>
-        <w:rPr>
-          <w:sz w:val="22"/>
-        </w:rPr>
         <w:t>Date : ____________________</w:t>
       </w:r>
     </w:p>
@@ -593,7 +1277,7 @@
     </w:p>
     <w:p>
       <w:pPr>
-        <w:spacing w:after="160"/>
+        <w:spacing w:after="200"/>
       </w:pPr>
       <w:r>
         <w:t>I would like to express my sincere gratitude to our seminar guide, Miss. Sakshi Ambadkar, for her continuous guidance, patient review and constructive criticism throughout the preparation of this report. Her questions repeatedly pushed us to separate what the prototype actually demonstrates from what we hoped it would demonstrate.</w:t>
@@ -601,7 +1285,7 @@
     </w:p>
     <w:p>
       <w:pPr>
-        <w:spacing w:after="160"/>
+        <w:spacing w:after="200"/>
       </w:pPr>
       <w:r>
         <w:t>I am thankful to the faculty members and the Department of Computer Science and Engineering at NMIET for providing the infrastructure, laboratory access and academic freedom needed to design, build and deploy this project. I also acknowledge the open-source communities behind React, TypeScript, Vite, Tailwind CSS, Zustand and the Python libraries used to prepare this document; their documentation made a small, independent implementation possible.</w:t>
@@ -609,10 +1293,46 @@
     </w:p>
     <w:p>
       <w:pPr>
-        <w:spacing w:after="400"/>
+        <w:spacing w:after="560"/>
       </w:pPr>
       <w:r>
         <w:t>Finally, I extend my heartfelt thanks to my family, teammates and peers for their constant motivation, honest feedback and support during the completion of this seminar. The working prototype, the deployment and the demonstration dataset were built collaboratively, and the credit for anything that works belongs to the team.</w:t>
+      </w:r>
+    </w:p>
+    <w:p>
+      <w:pPr>
+        <w:spacing w:after="20" w:line="288" w:lineRule="auto"/>
+        <w:jc w:val="right"/>
+      </w:pPr>
+      <w:r>
+        <w:rPr>
+          <w:sz w:val="22"/>
+        </w:rPr>
+        <w:t>Pallavi Kokate (B34)</w:t>
+      </w:r>
+    </w:p>
+    <w:p>
+      <w:pPr>
+        <w:spacing w:after="20" w:line="288" w:lineRule="auto"/>
+        <w:jc w:val="right"/>
+      </w:pPr>
+      <w:r>
+        <w:rPr>
+          <w:sz w:val="22"/>
+        </w:rPr>
+        <w:t>Anil Kewat (B45)</w:t>
+      </w:r>
+    </w:p>
+    <w:p>
+      <w:pPr>
+        <w:spacing w:line="288" w:lineRule="auto"/>
+        <w:jc w:val="right"/>
+      </w:pPr>
+      <w:r>
+        <w:rPr>
+          <w:sz w:val="22"/>
+        </w:rPr>
+        <w:t>Nikita Sagar (B50)</w:t>
       </w:r>
     </w:p>
     <w:p>
@@ -625,7 +1345,7 @@
           <w:i/>
           <w:sz w:val="22"/>
         </w:rPr>
-        <w:t>Pallavi Kokate, Anil Kewat and Nikita Sagar</w:t>
+        <w:t>(T.Y. B.E., NMIET)</w:t>
       </w:r>
     </w:p>
     <w:p>
@@ -1202,7 +1922,7 @@
           <w:noProof/>
           <w:webHidden/>
         </w:rPr>
-        <w:instrText xml:space="preserve"> PAGEREF _Toc244292296 \h </w:instrText>
+        <w:instrText xml:space="preserve"> PAGEREF _Toc244293347 \h </w:instrText>
       </w:r>
       <w:r>
         <w:rPr>
@@ -1274,7 +1994,7 @@
           <w:noProof/>
           <w:webHidden/>
         </w:rPr>
-        <w:instrText xml:space="preserve"> PAGEREF _Toc244292297 \h </w:instrText>
+        <w:instrText xml:space="preserve"> PAGEREF _Toc244293348 \h </w:instrText>
       </w:r>
       <w:r>
         <w:rPr>
@@ -1346,7 +2066,7 @@
           <w:noProof/>
           <w:webHidden/>
         </w:rPr>
-        <w:instrText xml:space="preserve"> PAGEREF _Toc244292298 \h </w:instrText>
+        <w:instrText xml:space="preserve"> PAGEREF _Toc244293349 \h </w:instrText>
       </w:r>
       <w:r>
         <w:rPr>
@@ -1418,7 +2138,7 @@
           <w:noProof/>
           <w:webHidden/>
         </w:rPr>
-        <w:instrText xml:space="preserve"> PAGEREF _Toc244292299 \h </w:instrText>
+        <w:instrText xml:space="preserve"> PAGEREF _Toc244293350 \h </w:instrText>
       </w:r>
       <w:r>
         <w:rPr>
@@ -1490,7 +2210,7 @@
           <w:noProof/>
           <w:webHidden/>
         </w:rPr>
-        <w:instrText xml:space="preserve"> PAGEREF _Toc244292300 \h </w:instrText>
+        <w:instrText xml:space="preserve"> PAGEREF _Toc244293351 \h </w:instrText>
       </w:r>
       <w:r>
         <w:rPr>
@@ -1562,7 +2282,7 @@
           <w:noProof/>
           <w:webHidden/>
         </w:rPr>
-        <w:instrText xml:space="preserve"> PAGEREF _Toc244292301 \h </w:instrText>
+        <w:instrText xml:space="preserve"> PAGEREF _Toc244293352 \h </w:instrText>
       </w:r>
       <w:r>
         <w:rPr>
@@ -1634,7 +2354,7 @@
           <w:noProof/>
           <w:webHidden/>
         </w:rPr>
-        <w:instrText xml:space="preserve"> PAGEREF _Toc244292302 \h </w:instrText>
+        <w:instrText xml:space="preserve"> PAGEREF _Toc244293353 \h </w:instrText>
       </w:r>
       <w:r>
         <w:rPr>
@@ -1706,7 +2426,7 @@
           <w:noProof/>
           <w:webHidden/>
         </w:rPr>
-        <w:instrText xml:space="preserve"> PAGEREF _Toc244292303 \h </w:instrText>
+        <w:instrText xml:space="preserve"> PAGEREF _Toc244293354 \h </w:instrText>
       </w:r>
       <w:r>
         <w:rPr>
@@ -1778,7 +2498,7 @@
           <w:noProof/>
           <w:webHidden/>
         </w:rPr>
-        <w:instrText xml:space="preserve"> PAGEREF _Toc244292304 \h </w:instrText>
+        <w:instrText xml:space="preserve"> PAGEREF _Toc244293355 \h </w:instrText>
       </w:r>
       <w:r>
         <w:rPr>
@@ -1850,7 +2570,7 @@
           <w:noProof/>
           <w:webHidden/>
         </w:rPr>
-        <w:instrText xml:space="preserve"> PAGEREF _Toc244292305 \h </w:instrText>
+        <w:instrText xml:space="preserve"> PAGEREF _Toc244293356 \h </w:instrText>
       </w:r>
       <w:r>
         <w:rPr>
@@ -1922,7 +2642,7 @@
           <w:noProof/>
           <w:webHidden/>
         </w:rPr>
-        <w:instrText xml:space="preserve"> PAGEREF _Toc244292306 \h </w:instrText>
+        <w:instrText xml:space="preserve"> PAGEREF _Toc244293357 \h </w:instrText>
       </w:r>
       <w:r>
         <w:rPr>
@@ -1994,7 +2714,7 @@
           <w:noProof/>
           <w:webHidden/>
         </w:rPr>
-        <w:instrText xml:space="preserve"> PAGEREF _Toc244292307 \h </w:instrText>
+        <w:instrText xml:space="preserve"> PAGEREF _Toc244293358 \h </w:instrText>
       </w:r>
       <w:r>
         <w:rPr>
@@ -2066,7 +2786,7 @@
           <w:noProof/>
           <w:webHidden/>
         </w:rPr>
-        <w:instrText xml:space="preserve"> PAGEREF _Toc244292308 \h </w:instrText>
+        <w:instrText xml:space="preserve"> PAGEREF _Toc244293359 \h </w:instrText>
       </w:r>
       <w:r>
         <w:rPr>
@@ -2138,7 +2858,7 @@
           <w:noProof/>
           <w:webHidden/>
         </w:rPr>
-        <w:instrText xml:space="preserve"> PAGEREF _Toc244292309 \h </w:instrText>
+        <w:instrText xml:space="preserve"> PAGEREF _Toc244293360 \h </w:instrText>
       </w:r>
       <w:r>
         <w:rPr>
@@ -2210,7 +2930,7 @@
           <w:noProof/>
           <w:webHidden/>
         </w:rPr>
-        <w:instrText xml:space="preserve"> PAGEREF _Toc244292310 \h </w:instrText>
+        <w:instrText xml:space="preserve"> PAGEREF _Toc244293361 \h </w:instrText>
       </w:r>
       <w:r>
         <w:rPr>
@@ -2282,7 +3002,7 @@
           <w:noProof/>
           <w:webHidden/>
         </w:rPr>
-        <w:instrText xml:space="preserve"> PAGEREF _Toc244292311 \h </w:instrText>
+        <w:instrText xml:space="preserve"> PAGEREF _Toc244293362 \h </w:instrText>
       </w:r>
       <w:r>
         <w:rPr>
@@ -2354,7 +3074,7 @@
           <w:noProof/>
           <w:webHidden/>
         </w:rPr>
-        <w:instrText xml:space="preserve"> PAGEREF _Toc244292312 \h </w:instrText>
+        <w:instrText xml:space="preserve"> PAGEREF _Toc244293363 \h </w:instrText>
       </w:r>
       <w:r>
         <w:rPr>
@@ -2426,7 +3146,7 @@
           <w:noProof/>
           <w:webHidden/>
         </w:rPr>
-        <w:instrText xml:space="preserve"> PAGEREF _Toc244292313 \h </w:instrText>
+        <w:instrText xml:space="preserve"> PAGEREF _Toc244293364 \h </w:instrText>
       </w:r>
       <w:r>
         <w:rPr>
@@ -2498,7 +3218,7 @@
           <w:noProof/>
           <w:webHidden/>
         </w:rPr>
-        <w:instrText xml:space="preserve"> PAGEREF _Toc244292314 \h </w:instrText>
+        <w:instrText xml:space="preserve"> PAGEREF _Toc244293365 \h </w:instrText>
       </w:r>
       <w:r>
         <w:rPr>
@@ -2570,7 +3290,7 @@
           <w:noProof/>
           <w:webHidden/>
         </w:rPr>
-        <w:instrText xml:space="preserve"> PAGEREF _Toc244292315 \h </w:instrText>
+        <w:instrText xml:space="preserve"> PAGEREF _Toc244293366 \h </w:instrText>
       </w:r>
       <w:r>
         <w:rPr>
@@ -2642,7 +3362,7 @@
           <w:noProof/>
           <w:webHidden/>
         </w:rPr>
-        <w:instrText xml:space="preserve"> PAGEREF _Toc244292316 \h </w:instrText>
+        <w:instrText xml:space="preserve"> PAGEREF _Toc244293367 \h </w:instrText>
       </w:r>
       <w:r>
         <w:rPr>
@@ -2714,7 +3434,7 @@
           <w:noProof/>
           <w:webHidden/>
         </w:rPr>
-        <w:instrText xml:space="preserve"> PAGEREF _Toc244292317 \h </w:instrText>
+        <w:instrText xml:space="preserve"> PAGEREF _Toc244293368 \h </w:instrText>
       </w:r>
       <w:r>
         <w:rPr>
@@ -2786,7 +3506,7 @@
           <w:noProof/>
           <w:webHidden/>
         </w:rPr>
-        <w:instrText xml:space="preserve"> PAGEREF _Toc244292318 \h </w:instrText>
+        <w:instrText xml:space="preserve"> PAGEREF _Toc244293369 \h </w:instrText>
       </w:r>
       <w:r>
         <w:rPr>
@@ -2858,7 +3578,7 @@
           <w:noProof/>
           <w:webHidden/>
         </w:rPr>
-        <w:instrText xml:space="preserve"> PAGEREF _Toc244292319 \h </w:instrText>
+        <w:instrText xml:space="preserve"> PAGEREF _Toc244293370 \h </w:instrText>
       </w:r>
       <w:r>
         <w:rPr>
@@ -2930,7 +3650,7 @@
           <w:noProof/>
           <w:webHidden/>
         </w:rPr>
-        <w:instrText xml:space="preserve"> PAGEREF _Toc244292320 \h </w:instrText>
+        <w:instrText xml:space="preserve"> PAGEREF _Toc244293371 \h </w:instrText>
       </w:r>
       <w:r>
         <w:rPr>
@@ -3002,7 +3722,7 @@
           <w:noProof/>
           <w:webHidden/>
         </w:rPr>
-        <w:instrText xml:space="preserve"> PAGEREF _Toc244292321 \h </w:instrText>
+        <w:instrText xml:space="preserve"> PAGEREF _Toc244293372 \h </w:instrText>
       </w:r>
       <w:r>
         <w:rPr>
@@ -3074,7 +3794,7 @@
           <w:noProof/>
           <w:webHidden/>
         </w:rPr>
-        <w:instrText xml:space="preserve"> PAGEREF _Toc244292322 \h </w:instrText>
+        <w:instrText xml:space="preserve"> PAGEREF _Toc244293373 \h </w:instrText>
       </w:r>
       <w:r>
         <w:rPr>
@@ -3147,7 +3867,7 @@
           <w:noProof/>
           <w:webHidden/>
         </w:rPr>
-        <w:instrText xml:space="preserve"> PAGEREF _Toc244292323 \h </w:instrText>
+        <w:instrText xml:space="preserve"> PAGEREF _Toc244293374 \h </w:instrText>
       </w:r>
       <w:r>
         <w:rPr>
@@ -3968,8 +4688,26 @@
     </w:tbl>
     <w:p>
       <w:pPr>
+        <w:sectPr>
+          <w:headerReference w:type="default" r:id="rId12"/>
+          <w:footerReference w:type="default" r:id="rId13"/>
+          <w:pgSz w:w="12240" w:h="15840"/>
+          <w:pgMar w:top="1440" w:right="1944" w:bottom="1440" w:left="2088" w:header="144" w:footer="230" w:gutter="0"/>
+          <w:pgBorders w:offsetFrom="page">
+            <w:top w:val="thickThinMediumGap" w:sz="12" w:space="24" w:color="000000"/>
+            <w:left w:val="thickThinMediumGap" w:sz="12" w:space="31" w:color="000000"/>
+            <w:bottom w:val="thickThinMediumGap" w:sz="12" w:space="24" w:color="000000"/>
+            <w:right w:val="thickThinMediumGap" w:sz="12" w:space="31" w:color="000000"/>
+          </w:pgBorders>
+          <w:pgNumType w:fmt="upperRoman" w:start="1"/>
+          <w:cols w:space="720"/>
+          <w:docGrid w:linePitch="360"/>
+        </w:sectPr>
+      </w:pPr>
+    </w:p>
+    <w:p>
+      <w:pPr>
         <w:keepNext/>
-        <w:pageBreakBefore/>
         <w:spacing w:after="280" w:line="240" w:lineRule="auto"/>
         <w:jc w:val="center"/>
       </w:pPr>
@@ -5345,8 +6083,8 @@
     <w:p>
       <w:pPr>
         <w:sectPr>
-          <w:headerReference w:type="default" r:id="rId12"/>
-          <w:footerReference w:type="default" r:id="rId13"/>
+          <w:headerReference w:type="default" r:id="rId14"/>
+          <w:footerReference w:type="default" r:id="rId15"/>
           <w:pgSz w:w="12240" w:h="15840"/>
           <w:pgMar w:top="1440" w:right="1944" w:bottom="1440" w:left="2088" w:header="144" w:footer="230" w:gutter="0"/>
           <w:pgBorders w:offsetFrom="page">
@@ -5355,7 +6093,7 @@
             <w:bottom w:val="thickThinMediumGap" w:sz="12" w:space="24" w:color="000000"/>
             <w:right w:val="thickThinMediumGap" w:sz="12" w:space="31" w:color="000000"/>
           </w:pgBorders>
-          <w:pgNumType w:fmt="upperRoman" w:start="1"/>
+          <w:pgNumType w:fmt="upperRoman"/>
           <w:cols w:space="720"/>
           <w:docGrid w:linePitch="360"/>
         </w:sectPr>
@@ -5365,7 +6103,7 @@
       <w:pPr>
         <w:pStyle w:val="Heading1"/>
       </w:pPr>
-      <w:bookmarkStart w:id="7" w:name="_Toc244292296"/>
+      <w:bookmarkStart w:id="7" w:name="_Toc244293347"/>
       <w:r>
         <w:lastRenderedPageBreak/>
         <w:t>1. Introduction</w:t>
@@ -5376,7 +6114,7 @@
       <w:pPr>
         <w:pStyle w:val="Heading2"/>
       </w:pPr>
-      <w:bookmarkStart w:id="8" w:name="_Toc244292297"/>
+      <w:bookmarkStart w:id="8" w:name="_Toc244293348"/>
       <w:r>
         <w:t>1.1 Background</w:t>
       </w:r>
@@ -5399,7 +6137,7 @@
       <w:pPr>
         <w:pStyle w:val="Heading2"/>
       </w:pPr>
-      <w:bookmarkStart w:id="9" w:name="_Toc244292298"/>
+      <w:bookmarkStart w:id="9" w:name="_Toc244293349"/>
       <w:r>
         <w:t>1.2 Motivation</w:t>
       </w:r>
@@ -5494,7 +6232,7 @@
       <w:pPr>
         <w:pStyle w:val="Heading2"/>
       </w:pPr>
-      <w:bookmarkStart w:id="10" w:name="_Toc244292299"/>
+      <w:bookmarkStart w:id="10" w:name="_Toc244293350"/>
       <w:r>
         <w:t>1.3 Problem Statement</w:t>
       </w:r>
@@ -5601,7 +6339,7 @@
       <w:pPr>
         <w:pStyle w:val="Heading2"/>
       </w:pPr>
-      <w:bookmarkStart w:id="11" w:name="_Toc244292300"/>
+      <w:bookmarkStart w:id="11" w:name="_Toc244293351"/>
       <w:r>
         <w:t>1.4 Objectives</w:t>
       </w:r>
@@ -5716,7 +6454,7 @@
       <w:pPr>
         <w:pStyle w:val="Heading2"/>
       </w:pPr>
-      <w:bookmarkStart w:id="12" w:name="_Toc244292301"/>
+      <w:bookmarkStart w:id="12" w:name="_Toc244293352"/>
       <w:r>
         <w:t>1.5 Scope of the Seminar</w:t>
       </w:r>
@@ -5755,10 +6493,10 @@
     <w:p>
       <w:pPr>
         <w:sectPr>
-          <w:headerReference w:type="default" r:id="rId14"/>
-          <w:footerReference w:type="default" r:id="rId15"/>
-          <w:headerReference w:type="first" r:id="rId16"/>
-          <w:footerReference w:type="first" r:id="rId17"/>
+          <w:headerReference w:type="default" r:id="rId16"/>
+          <w:footerReference w:type="default" r:id="rId17"/>
+          <w:headerReference w:type="first" r:id="rId18"/>
+          <w:footerReference w:type="first" r:id="rId19"/>
           <w:pgSz w:w="12240" w:h="15840"/>
           <w:pgMar w:top="1440" w:right="1944" w:bottom="1440" w:left="2088" w:header="144" w:footer="230" w:gutter="0"/>
           <w:pgBorders w:offsetFrom="page">
@@ -5778,7 +6516,7 @@
       <w:pPr>
         <w:pStyle w:val="Heading1"/>
       </w:pPr>
-      <w:bookmarkStart w:id="13" w:name="_Toc244292302"/>
+      <w:bookmarkStart w:id="13" w:name="_Toc244293353"/>
       <w:r>
         <w:lastRenderedPageBreak/>
         <w:t>2. Literature Survey</w:t>
@@ -5789,7 +6527,7 @@
       <w:pPr>
         <w:pStyle w:val="Heading2"/>
       </w:pPr>
-      <w:bookmarkStart w:id="14" w:name="_Toc244292303"/>
+      <w:bookmarkStart w:id="14" w:name="_Toc244293354"/>
       <w:r>
         <w:t>2.1 Existing Work and Related Studies</w:t>
       </w:r>
@@ -5833,7 +6571,7 @@
       <w:pPr>
         <w:pStyle w:val="Heading2"/>
       </w:pPr>
-      <w:bookmarkStart w:id="15" w:name="_Toc244292304"/>
+      <w:bookmarkStart w:id="15" w:name="_Toc244293355"/>
       <w:r>
         <w:t>2.2 Summary of Research Papers</w:t>
       </w:r>
@@ -6773,7 +7511,7 @@
       <w:pPr>
         <w:pStyle w:val="Heading2"/>
       </w:pPr>
-      <w:bookmarkStart w:id="17" w:name="_Toc244292305"/>
+      <w:bookmarkStart w:id="17" w:name="_Toc244293356"/>
       <w:r>
         <w:t>2.3 Research Gaps</w:t>
       </w:r>
@@ -6887,10 +7625,10 @@
     <w:p>
       <w:pPr>
         <w:sectPr>
-          <w:headerReference w:type="default" r:id="rId18"/>
-          <w:footerReference w:type="default" r:id="rId19"/>
-          <w:headerReference w:type="first" r:id="rId20"/>
-          <w:footerReference w:type="first" r:id="rId21"/>
+          <w:headerReference w:type="default" r:id="rId20"/>
+          <w:footerReference w:type="default" r:id="rId21"/>
+          <w:headerReference w:type="first" r:id="rId22"/>
+          <w:footerReference w:type="first" r:id="rId23"/>
           <w:pgSz w:w="12240" w:h="15840"/>
           <w:pgMar w:top="1440" w:right="1944" w:bottom="1440" w:left="2088" w:header="144" w:footer="230" w:gutter="0"/>
           <w:pgBorders w:offsetFrom="page">
@@ -6909,7 +7647,7 @@
       <w:pPr>
         <w:pStyle w:val="Heading1"/>
       </w:pPr>
-      <w:bookmarkStart w:id="18" w:name="_Toc244292306"/>
+      <w:bookmarkStart w:id="18" w:name="_Toc244293357"/>
       <w:r>
         <w:lastRenderedPageBreak/>
         <w:t>3. Overview of the ChainGuard v2 Control Plane</w:t>
@@ -6920,7 +7658,7 @@
       <w:pPr>
         <w:pStyle w:val="Heading2"/>
       </w:pPr>
-      <w:bookmarkStart w:id="19" w:name="_Toc244292307"/>
+      <w:bookmarkStart w:id="19" w:name="_Toc244293358"/>
       <w:r>
         <w:t>3.1 Definition and Concept</w:t>
       </w:r>
@@ -7100,7 +7838,7 @@
       <w:pPr>
         <w:pStyle w:val="Heading2"/>
       </w:pPr>
-      <w:bookmarkStart w:id="20" w:name="_Toc244292308"/>
+      <w:bookmarkStart w:id="20" w:name="_Toc244293359"/>
       <w:r>
         <w:t>3.2 Architecture / Block Diagram</w:t>
       </w:r>
@@ -7117,10 +7855,10 @@
           <w:noProof/>
         </w:rPr>
         <w:drawing>
-          <wp:inline distT="0" distB="0" distL="0" distR="0" wp14:anchorId="7176101D" wp14:editId="59552584">
+          <wp:inline distT="0" distB="0" distL="0" distR="0" wp14:anchorId="25142DD3" wp14:editId="122EB46C">
             <wp:extent cx="4572000" cy="3304515"/>
             <wp:effectExtent l="0" t="0" r="0" b="0"/>
-            <wp:docPr id="3" name="Picture 3"/>
+            <wp:docPr id="5" name="Picture 5"/>
             <wp:cNvGraphicFramePr>
               <a:graphicFrameLocks xmlns:a="http://schemas.openxmlformats.org/drawingml/2006/main" noChangeAspect="1"/>
             </wp:cNvGraphicFramePr>
@@ -7132,7 +7870,7 @@
                     <pic:cNvPicPr/>
                   </pic:nvPicPr>
                   <pic:blipFill>
-                    <a:blip r:embed="rId22"/>
+                    <a:blip r:embed="rId24"/>
                     <a:stretch>
                       <a:fillRect/>
                     </a:stretch>
@@ -7289,7 +8027,7 @@
       <w:pPr>
         <w:pStyle w:val="Heading2"/>
       </w:pPr>
-      <w:bookmarkStart w:id="22" w:name="_Toc244292309"/>
+      <w:bookmarkStart w:id="22" w:name="_Toc244293360"/>
       <w:r>
         <w:t>3.3 Key Components and Technologies</w:t>
       </w:r>
@@ -7496,10 +8234,10 @@
           <w:noProof/>
         </w:rPr>
         <w:drawing>
-          <wp:inline distT="0" distB="0" distL="0" distR="0" wp14:anchorId="328D11E5" wp14:editId="68F448F8">
+          <wp:inline distT="0" distB="0" distL="0" distR="0" wp14:anchorId="24CC52A0" wp14:editId="4D8A913A">
             <wp:extent cx="4572000" cy="2942376"/>
             <wp:effectExtent l="0" t="0" r="0" b="0"/>
-            <wp:docPr id="4" name="Picture 4"/>
+            <wp:docPr id="6" name="Picture 6"/>
             <wp:cNvGraphicFramePr>
               <a:graphicFrameLocks xmlns:a="http://schemas.openxmlformats.org/drawingml/2006/main" noChangeAspect="1"/>
             </wp:cNvGraphicFramePr>
@@ -7511,7 +8249,7 @@
                     <pic:cNvPicPr/>
                   </pic:nvPicPr>
                   <pic:blipFill>
-                    <a:blip r:embed="rId23"/>
+                    <a:blip r:embed="rId25"/>
                     <a:stretch>
                       <a:fillRect/>
                     </a:stretch>
@@ -8389,10 +9127,10 @@
     <w:p>
       <w:pPr>
         <w:sectPr>
-          <w:headerReference w:type="default" r:id="rId24"/>
-          <w:footerReference w:type="default" r:id="rId25"/>
-          <w:headerReference w:type="first" r:id="rId26"/>
-          <w:footerReference w:type="first" r:id="rId27"/>
+          <w:headerReference w:type="default" r:id="rId26"/>
+          <w:footerReference w:type="default" r:id="rId27"/>
+          <w:headerReference w:type="first" r:id="rId28"/>
+          <w:footerReference w:type="first" r:id="rId29"/>
           <w:pgSz w:w="12240" w:h="15840"/>
           <w:pgMar w:top="1440" w:right="1944" w:bottom="1440" w:left="2088" w:header="144" w:footer="230" w:gutter="0"/>
           <w:pgBorders w:offsetFrom="page">
@@ -8411,7 +9149,7 @@
       <w:pPr>
         <w:pStyle w:val="Heading1"/>
       </w:pPr>
-      <w:bookmarkStart w:id="25" w:name="_Toc244292310"/>
+      <w:bookmarkStart w:id="25" w:name="_Toc244293361"/>
       <w:r>
         <w:lastRenderedPageBreak/>
         <w:t>4. Working / Methodology</w:t>
@@ -8422,7 +9160,7 @@
       <w:pPr>
         <w:pStyle w:val="Heading2"/>
       </w:pPr>
-      <w:bookmarkStart w:id="26" w:name="_Toc244292311"/>
+      <w:bookmarkStart w:id="26" w:name="_Toc244293362"/>
       <w:r>
         <w:t>4.1 Working Principle</w:t>
       </w:r>
@@ -8444,10 +9182,10 @@
           <w:noProof/>
         </w:rPr>
         <w:drawing>
-          <wp:inline distT="0" distB="0" distL="0" distR="0" wp14:anchorId="7EA03692" wp14:editId="635A6F21">
+          <wp:inline distT="0" distB="0" distL="0" distR="0" wp14:anchorId="57F23463" wp14:editId="01D09D66">
             <wp:extent cx="4572000" cy="3213980"/>
             <wp:effectExtent l="0" t="0" r="0" b="0"/>
-            <wp:docPr id="5" name="Picture 5"/>
+            <wp:docPr id="7" name="Picture 7"/>
             <wp:cNvGraphicFramePr>
               <a:graphicFrameLocks xmlns:a="http://schemas.openxmlformats.org/drawingml/2006/main" noChangeAspect="1"/>
             </wp:cNvGraphicFramePr>
@@ -8459,7 +9197,7 @@
                     <pic:cNvPicPr/>
                   </pic:nvPicPr>
                   <pic:blipFill>
-                    <a:blip r:embed="rId28"/>
+                    <a:blip r:embed="rId30"/>
                     <a:stretch>
                       <a:fillRect/>
                     </a:stretch>
@@ -8720,7 +9458,7 @@
       <w:pPr>
         <w:pStyle w:val="Heading2"/>
       </w:pPr>
-      <w:bookmarkStart w:id="28" w:name="_Toc244292312"/>
+      <w:bookmarkStart w:id="28" w:name="_Toc244293363"/>
       <w:r>
         <w:t>4.2 Algorithms / Techniques Used</w:t>
       </w:r>
@@ -9106,10 +9844,10 @@
         </w:rPr>
         <w:lastRenderedPageBreak/>
         <w:drawing>
-          <wp:inline distT="0" distB="0" distL="0" distR="0" wp14:anchorId="1F663B01" wp14:editId="2FF24C10">
+          <wp:inline distT="0" distB="0" distL="0" distR="0" wp14:anchorId="3B3306F4" wp14:editId="2F9EA1A0">
             <wp:extent cx="4572000" cy="3224463"/>
             <wp:effectExtent l="0" t="0" r="0" b="0"/>
-            <wp:docPr id="6" name="Picture 6"/>
+            <wp:docPr id="8" name="Picture 8"/>
             <wp:cNvGraphicFramePr>
               <a:graphicFrameLocks xmlns:a="http://schemas.openxmlformats.org/drawingml/2006/main" noChangeAspect="1"/>
             </wp:cNvGraphicFramePr>
@@ -9121,7 +9859,7 @@
                     <pic:cNvPicPr/>
                   </pic:nvPicPr>
                   <pic:blipFill>
-                    <a:blip r:embed="rId29"/>
+                    <a:blip r:embed="rId31"/>
                     <a:stretch>
                       <a:fillRect/>
                     </a:stretch>
@@ -9488,7 +10226,7 @@
       <w:pPr>
         <w:pStyle w:val="Heading2"/>
       </w:pPr>
-      <w:bookmarkStart w:id="30" w:name="_Toc244292313"/>
+      <w:bookmarkStart w:id="30" w:name="_Toc244293364"/>
       <w:r>
         <w:t>4.3 Tools and Platforms</w:t>
       </w:r>
@@ -10910,10 +11648,10 @@
     <w:p>
       <w:pPr>
         <w:sectPr>
-          <w:headerReference w:type="default" r:id="rId30"/>
-          <w:footerReference w:type="default" r:id="rId31"/>
-          <w:headerReference w:type="first" r:id="rId32"/>
-          <w:footerReference w:type="first" r:id="rId33"/>
+          <w:headerReference w:type="default" r:id="rId32"/>
+          <w:footerReference w:type="default" r:id="rId33"/>
+          <w:headerReference w:type="first" r:id="rId34"/>
+          <w:footerReference w:type="first" r:id="rId35"/>
           <w:pgSz w:w="12240" w:h="15840"/>
           <w:pgMar w:top="1440" w:right="1944" w:bottom="1440" w:left="2088" w:header="144" w:footer="230" w:gutter="0"/>
           <w:pgBorders w:offsetFrom="page">
@@ -10932,7 +11670,7 @@
       <w:pPr>
         <w:pStyle w:val="Heading1"/>
       </w:pPr>
-      <w:bookmarkStart w:id="33" w:name="_Toc244292314"/>
+      <w:bookmarkStart w:id="33" w:name="_Toc244293365"/>
       <w:r>
         <w:lastRenderedPageBreak/>
         <w:t>5. Applications</w:t>
@@ -10943,7 +11681,7 @@
       <w:pPr>
         <w:pStyle w:val="Heading2"/>
       </w:pPr>
-      <w:bookmarkStart w:id="34" w:name="_Toc244292315"/>
+      <w:bookmarkStart w:id="34" w:name="_Toc244293366"/>
       <w:r>
         <w:t>5.1 Real-World Use Cases</w:t>
       </w:r>
@@ -11083,7 +11821,7 @@
       <w:pPr>
         <w:pStyle w:val="Heading2"/>
       </w:pPr>
-      <w:bookmarkStart w:id="35" w:name="_Toc244292316"/>
+      <w:bookmarkStart w:id="35" w:name="_Toc244293367"/>
       <w:r>
         <w:t>5.2 Case Study</w:t>
       </w:r>
@@ -11155,10 +11893,10 @@
     <w:p>
       <w:pPr>
         <w:sectPr>
-          <w:headerReference w:type="default" r:id="rId34"/>
-          <w:footerReference w:type="default" r:id="rId35"/>
-          <w:headerReference w:type="first" r:id="rId36"/>
-          <w:footerReference w:type="first" r:id="rId37"/>
+          <w:headerReference w:type="default" r:id="rId36"/>
+          <w:footerReference w:type="default" r:id="rId37"/>
+          <w:headerReference w:type="first" r:id="rId38"/>
+          <w:footerReference w:type="first" r:id="rId39"/>
           <w:pgSz w:w="12240" w:h="15840"/>
           <w:pgMar w:top="1440" w:right="1944" w:bottom="1440" w:left="2088" w:header="144" w:footer="230" w:gutter="0"/>
           <w:pgBorders w:offsetFrom="page">
@@ -11177,7 +11915,7 @@
       <w:pPr>
         <w:pStyle w:val="Heading1"/>
       </w:pPr>
-      <w:bookmarkStart w:id="36" w:name="_Toc244292317"/>
+      <w:bookmarkStart w:id="36" w:name="_Toc244293368"/>
       <w:r>
         <w:lastRenderedPageBreak/>
         <w:t>6. Advantages and Limitations</w:t>
@@ -11188,7 +11926,7 @@
       <w:pPr>
         <w:pStyle w:val="Heading2"/>
       </w:pPr>
-      <w:bookmarkStart w:id="37" w:name="_Toc244292318"/>
+      <w:bookmarkStart w:id="37" w:name="_Toc244293369"/>
       <w:r>
         <w:t>6.1 Advantages</w:t>
       </w:r>
@@ -11378,7 +12116,7 @@
       <w:pPr>
         <w:pStyle w:val="Heading2"/>
       </w:pPr>
-      <w:bookmarkStart w:id="38" w:name="_Toc244292319"/>
+      <w:bookmarkStart w:id="38" w:name="_Toc244293370"/>
       <w:r>
         <w:t>6.2 Limitations / Challenges</w:t>
       </w:r>
@@ -11652,10 +12390,10 @@
     <w:p>
       <w:pPr>
         <w:sectPr>
-          <w:headerReference w:type="default" r:id="rId38"/>
-          <w:footerReference w:type="default" r:id="rId39"/>
-          <w:headerReference w:type="first" r:id="rId40"/>
-          <w:footerReference w:type="first" r:id="rId41"/>
+          <w:headerReference w:type="default" r:id="rId40"/>
+          <w:footerReference w:type="default" r:id="rId41"/>
+          <w:headerReference w:type="first" r:id="rId42"/>
+          <w:footerReference w:type="first" r:id="rId43"/>
           <w:pgSz w:w="12240" w:h="15840"/>
           <w:pgMar w:top="1440" w:right="1944" w:bottom="1440" w:left="2088" w:header="144" w:footer="230" w:gutter="0"/>
           <w:pgBorders w:offsetFrom="page">
@@ -11674,7 +12412,7 @@
       <w:pPr>
         <w:pStyle w:val="Heading1"/>
       </w:pPr>
-      <w:bookmarkStart w:id="39" w:name="_Toc244292320"/>
+      <w:bookmarkStart w:id="39" w:name="_Toc244293371"/>
       <w:r>
         <w:lastRenderedPageBreak/>
         <w:t>7. Comparison with Existing Technologies</w:t>
@@ -12724,10 +13462,10 @@
     <w:p>
       <w:pPr>
         <w:sectPr>
-          <w:headerReference w:type="default" r:id="rId42"/>
-          <w:footerReference w:type="default" r:id="rId43"/>
-          <w:headerReference w:type="first" r:id="rId44"/>
-          <w:footerReference w:type="first" r:id="rId45"/>
+          <w:headerReference w:type="default" r:id="rId44"/>
+          <w:footerReference w:type="default" r:id="rId45"/>
+          <w:headerReference w:type="first" r:id="rId46"/>
+          <w:footerReference w:type="first" r:id="rId47"/>
           <w:pgSz w:w="12240" w:h="15840"/>
           <w:pgMar w:top="1440" w:right="1944" w:bottom="1440" w:left="2088" w:header="144" w:footer="230" w:gutter="0"/>
           <w:pgBorders w:offsetFrom="page">
@@ -12746,7 +13484,7 @@
       <w:pPr>
         <w:pStyle w:val="Heading1"/>
       </w:pPr>
-      <w:bookmarkStart w:id="41" w:name="_Toc244292321"/>
+      <w:bookmarkStart w:id="41" w:name="_Toc244293372"/>
       <w:r>
         <w:lastRenderedPageBreak/>
         <w:t>8. Future Scope</w:t>
@@ -12921,10 +13659,10 @@
     <w:p>
       <w:pPr>
         <w:sectPr>
-          <w:headerReference w:type="default" r:id="rId46"/>
-          <w:footerReference w:type="default" r:id="rId47"/>
-          <w:headerReference w:type="first" r:id="rId48"/>
-          <w:footerReference w:type="first" r:id="rId49"/>
+          <w:headerReference w:type="default" r:id="rId48"/>
+          <w:footerReference w:type="default" r:id="rId49"/>
+          <w:headerReference w:type="first" r:id="rId50"/>
+          <w:footerReference w:type="first" r:id="rId51"/>
           <w:pgSz w:w="12240" w:h="15840"/>
           <w:pgMar w:top="1440" w:right="1944" w:bottom="1440" w:left="2088" w:header="144" w:footer="230" w:gutter="0"/>
           <w:pgBorders w:offsetFrom="page">
@@ -12943,7 +13681,7 @@
       <w:pPr>
         <w:pStyle w:val="Heading1"/>
       </w:pPr>
-      <w:bookmarkStart w:id="42" w:name="_Toc244292322"/>
+      <w:bookmarkStart w:id="42" w:name="_Toc244293373"/>
       <w:r>
         <w:lastRenderedPageBreak/>
         <w:t>9. Conclusion</w:t>
@@ -12968,10 +13706,10 @@
     <w:p>
       <w:pPr>
         <w:sectPr>
-          <w:headerReference w:type="default" r:id="rId50"/>
-          <w:footerReference w:type="default" r:id="rId51"/>
-          <w:headerReference w:type="first" r:id="rId52"/>
-          <w:footerReference w:type="first" r:id="rId53"/>
+          <w:headerReference w:type="default" r:id="rId52"/>
+          <w:footerReference w:type="default" r:id="rId53"/>
+          <w:headerReference w:type="first" r:id="rId54"/>
+          <w:footerReference w:type="first" r:id="rId55"/>
           <w:pgSz w:w="12240" w:h="15840"/>
           <w:pgMar w:top="1440" w:right="1944" w:bottom="1440" w:left="2088" w:header="144" w:footer="230" w:gutter="0"/>
           <w:pgBorders w:offsetFrom="page">
@@ -12992,7 +13730,7 @@
         <w:spacing w:after="360"/>
         <w:jc w:val="center"/>
       </w:pPr>
-      <w:bookmarkStart w:id="43" w:name="_Toc244292323"/>
+      <w:bookmarkStart w:id="43" w:name="_Toc244293374"/>
       <w:r>
         <w:rPr>
           <w:rFonts w:ascii="Times New Roman" w:eastAsia="Times New Roman" w:hAnsi="Times New Roman" w:cs="Times New Roman"/>
@@ -13404,8 +14142,8 @@
       </w:r>
     </w:p>
     <w:sectPr>
-      <w:headerReference w:type="default" r:id="rId54"/>
-      <w:footerReference w:type="default" r:id="rId55"/>
+      <w:headerReference w:type="default" r:id="rId56"/>
+      <w:footerReference w:type="default" r:id="rId57"/>
       <w:pgSz w:w="12240" w:h="15840"/>
       <w:pgMar w:top="1440" w:right="1944" w:bottom="1440" w:left="2088" w:header="144" w:footer="230" w:gutter="0"/>
       <w:pgBorders w:offsetFrom="page">
@@ -14145,6 +14883,59 @@
 </w:ftr>
 </file>
 
+<file path=word/footer22.xml><?xml version="1.0" encoding="utf-8"?>
+<w:ftr xmlns:wpc="http://schemas.microsoft.com/office/word/2010/wordprocessingCanvas" xmlns:cx="http://schemas.microsoft.com/office/drawing/2014/chartex" xmlns:cx1="http://schemas.microsoft.com/office/drawing/2015/9/8/chartex" xmlns:cx2="http://schemas.microsoft.com/office/drawing/2015/10/21/chartex" xmlns:cx3="http://schemas.microsoft.com/office/drawing/2016/5/9/chartex" xmlns:cx4="http://schemas.microsoft.com/office/drawing/2016/5/10/chartex" xmlns:cx5="http://schemas.microsoft.com/office/drawing/2016/5/11/chartex" xmlns:cx6="http://schemas.microsoft.com/office/drawing/2016/5/12/chartex" xmlns:cx7="http://schemas.microsoft.com/office/drawing/2016/5/13/chartex" xmlns:cx8="http://schemas.microsoft.com/office/drawing/2016/5/14/chartex" xmlns:mc="http://schemas.openxmlformats.org/markup-compatibility/2006" xmlns:aink="http://schemas.microsoft.com/office/drawing/2016/ink" xmlns:am3d="http://schemas.microsoft.com/office/drawing/2017/model3d" xmlns:o="urn:schemas-microsoft-com:office:office" xmlns:oel="http://schemas.microsoft.com/office/2019/extlst" xmlns:r="http://schemas.openxmlformats.org/officeDocument/2006/relationships" xmlns:m="http://schemas.openxmlformats.org/officeDocument/2006/math" xmlns:v="urn:schemas-microsoft-com:vml" xmlns:wp14="http://schemas.microsoft.com/office/word/2010/wordprocessingDrawing" xmlns:wp="http://schemas.openxmlformats.org/drawingml/2006/wordprocessingDrawing" xmlns:w10="urn:schemas-microsoft-com:office:word" xmlns:w="http://schemas.openxmlformats.org/wordprocessingml/2006/main" xmlns:w14="http://schemas.microsoft.com/office/word/2010/wordml" xmlns:w15="http://schemas.microsoft.com/office/word/2012/wordml" xmlns:w16cex="http://schemas.microsoft.com/office/word/2018/wordml/cex" xmlns:w16cid="http://schemas.microsoft.com/office/word/2016/wordml/cid" xmlns:w16="http://schemas.microsoft.com/office/word/2018/wordml" xmlns:w16du="http://schemas.microsoft.com/office/word/2023/wordml/word16du" xmlns:w16sdtdh="http://schemas.microsoft.com/office/word/2020/wordml/sdtdatahash" xmlns:w16sdtfl="http://schemas.microsoft.com/office/word/2024/wordml/sdtformatlock" xmlns:w16se="http://schemas.microsoft.com/office/word/2015/wordml/symex" xmlns:wpg="http://schemas.microsoft.com/office/word/2010/wordprocessingGroup" xmlns:wpi="http://schemas.microsoft.com/office/word/2010/wordprocessingInk" xmlns:wne="http://schemas.microsoft.com/office/word/2006/wordml" xmlns:wps="http://schemas.microsoft.com/office/word/2010/wordprocessingShape" mc:Ignorable="w14 w15 w16se w16cid w16 w16cex w16sdtdh w16sdtfl w16du wp14">
+  <w:p>
+    <w:pPr>
+      <w:pStyle w:val="Footer"/>
+      <w:jc w:val="left"/>
+    </w:pPr>
+    <w:r>
+      <w:rPr>
+        <w:sz w:val="20"/>
+      </w:rPr>
+      <w:t>NMIET, Computer Science and Engineering</w:t>
+    </w:r>
+    <w:r>
+      <w:rPr>
+        <w:sz w:val="20"/>
+      </w:rPr>
+      <w:tab/>
+    </w:r>
+    <w:r>
+      <w:rPr>
+        <w:sz w:val="20"/>
+      </w:rPr>
+      <w:fldChar w:fldCharType="begin"/>
+    </w:r>
+    <w:r>
+      <w:rPr>
+        <w:sz w:val="20"/>
+      </w:rPr>
+      <w:instrText xml:space="preserve"> PAGE </w:instrText>
+    </w:r>
+    <w:r>
+      <w:rPr>
+        <w:sz w:val="20"/>
+      </w:rPr>
+      <w:fldChar w:fldCharType="separate"/>
+    </w:r>
+    <w:r>
+      <w:rPr>
+        <w:sz w:val="20"/>
+      </w:rPr>
+      <w:t>1</w:t>
+    </w:r>
+    <w:r>
+      <w:rPr>
+        <w:sz w:val="20"/>
+      </w:rPr>
+      <w:fldChar w:fldCharType="end"/>
+    </w:r>
+  </w:p>
+</w:ftr>
+</file>
+
 <file path=word/footer3.xml><?xml version="1.0" encoding="utf-8"?>
 <w:ftr xmlns:wpc="http://schemas.microsoft.com/office/word/2010/wordprocessingCanvas" xmlns:cx="http://schemas.microsoft.com/office/drawing/2014/chartex" xmlns:cx1="http://schemas.microsoft.com/office/drawing/2015/9/8/chartex" xmlns:cx2="http://schemas.microsoft.com/office/drawing/2015/10/21/chartex" xmlns:cx3="http://schemas.microsoft.com/office/drawing/2016/5/9/chartex" xmlns:cx4="http://schemas.microsoft.com/office/drawing/2016/5/10/chartex" xmlns:cx5="http://schemas.microsoft.com/office/drawing/2016/5/11/chartex" xmlns:cx6="http://schemas.microsoft.com/office/drawing/2016/5/12/chartex" xmlns:cx7="http://schemas.microsoft.com/office/drawing/2016/5/13/chartex" xmlns:cx8="http://schemas.microsoft.com/office/drawing/2016/5/14/chartex" xmlns:mc="http://schemas.openxmlformats.org/markup-compatibility/2006" xmlns:aink="http://schemas.microsoft.com/office/drawing/2016/ink" xmlns:am3d="http://schemas.microsoft.com/office/drawing/2017/model3d" xmlns:o="urn:schemas-microsoft-com:office:office" xmlns:oel="http://schemas.microsoft.com/office/2019/extlst" xmlns:r="http://schemas.openxmlformats.org/officeDocument/2006/relationships" xmlns:m="http://schemas.openxmlformats.org/officeDocument/2006/math" xmlns:v="urn:schemas-microsoft-com:vml" xmlns:wp14="http://schemas.microsoft.com/office/word/2010/wordprocessingDrawing" xmlns:wp="http://schemas.openxmlformats.org/drawingml/2006/wordprocessingDrawing" xmlns:w10="urn:schemas-microsoft-com:office:word" xmlns:w="http://schemas.openxmlformats.org/wordprocessingml/2006/main" xmlns:w14="http://schemas.microsoft.com/office/word/2010/wordml" xmlns:w15="http://schemas.microsoft.com/office/word/2012/wordml" xmlns:w16cex="http://schemas.microsoft.com/office/word/2018/wordml/cex" xmlns:w16cid="http://schemas.microsoft.com/office/word/2016/wordml/cid" xmlns:w16="http://schemas.microsoft.com/office/word/2018/wordml" xmlns:w16du="http://schemas.microsoft.com/office/word/2023/wordml/word16du" xmlns:w16sdtdh="http://schemas.microsoft.com/office/word/2020/wordml/sdtdatahash" xmlns:w16sdtfl="http://schemas.microsoft.com/office/word/2024/wordml/sdtformatlock" xmlns:w16se="http://schemas.microsoft.com/office/word/2015/wordml/symex" xmlns:wpg="http://schemas.microsoft.com/office/word/2010/wordprocessingGroup" xmlns:wpi="http://schemas.microsoft.com/office/word/2010/wordprocessingInk" xmlns:wne="http://schemas.microsoft.com/office/word/2006/wordml" xmlns:wps="http://schemas.microsoft.com/office/word/2010/wordprocessingShape" mc:Ignorable="w14 w15 w16se w16cid w16 w16cex w16sdtdh w16sdtfl w16du wp14">
   <w:p>
@@ -14556,6 +15347,25 @@
   <w:p>
     <w:pPr>
       <w:pStyle w:val="Header"/>
+      <w:jc w:val="center"/>
+    </w:pPr>
+    <w:r>
+      <w:rPr>
+        <w:b/>
+        <w:caps/>
+        <w:sz w:val="19"/>
+      </w:rPr>
+      <w:t>CHAINGUARD V2: A TAMPER-EVIDENT LAST-MILE LOGISTICS CONTROL PLANE</w:t>
+    </w:r>
+  </w:p>
+</w:hdr>
+</file>
+
+<file path=word/header11.xml><?xml version="1.0" encoding="utf-8"?>
+<w:hdr xmlns:wpc="http://schemas.microsoft.com/office/word/2010/wordprocessingCanvas" xmlns:cx="http://schemas.microsoft.com/office/drawing/2014/chartex" xmlns:cx1="http://schemas.microsoft.com/office/drawing/2015/9/8/chartex" xmlns:cx2="http://schemas.microsoft.com/office/drawing/2015/10/21/chartex" xmlns:cx3="http://schemas.microsoft.com/office/drawing/2016/5/9/chartex" xmlns:cx4="http://schemas.microsoft.com/office/drawing/2016/5/10/chartex" xmlns:cx5="http://schemas.microsoft.com/office/drawing/2016/5/11/chartex" xmlns:cx6="http://schemas.microsoft.com/office/drawing/2016/5/12/chartex" xmlns:cx7="http://schemas.microsoft.com/office/drawing/2016/5/13/chartex" xmlns:cx8="http://schemas.microsoft.com/office/drawing/2016/5/14/chartex" xmlns:mc="http://schemas.openxmlformats.org/markup-compatibility/2006" xmlns:aink="http://schemas.microsoft.com/office/drawing/2016/ink" xmlns:am3d="http://schemas.microsoft.com/office/drawing/2017/model3d" xmlns:o="urn:schemas-microsoft-com:office:office" xmlns:oel="http://schemas.microsoft.com/office/2019/extlst" xmlns:r="http://schemas.openxmlformats.org/officeDocument/2006/relationships" xmlns:m="http://schemas.openxmlformats.org/officeDocument/2006/math" xmlns:v="urn:schemas-microsoft-com:vml" xmlns:wp14="http://schemas.microsoft.com/office/word/2010/wordprocessingDrawing" xmlns:wp="http://schemas.openxmlformats.org/drawingml/2006/wordprocessingDrawing" xmlns:w10="urn:schemas-microsoft-com:office:word" xmlns:w="http://schemas.openxmlformats.org/wordprocessingml/2006/main" xmlns:w14="http://schemas.microsoft.com/office/word/2010/wordml" xmlns:w15="http://schemas.microsoft.com/office/word/2012/wordml" xmlns:w16cex="http://schemas.microsoft.com/office/word/2018/wordml/cex" xmlns:w16cid="http://schemas.microsoft.com/office/word/2016/wordml/cid" xmlns:w16="http://schemas.microsoft.com/office/word/2018/wordml" xmlns:w16du="http://schemas.microsoft.com/office/word/2023/wordml/word16du" xmlns:w16sdtdh="http://schemas.microsoft.com/office/word/2020/wordml/sdtdatahash" xmlns:w16sdtfl="http://schemas.microsoft.com/office/word/2024/wordml/sdtformatlock" xmlns:w16se="http://schemas.microsoft.com/office/word/2015/wordml/symex" xmlns:wpg="http://schemas.microsoft.com/office/word/2010/wordprocessingGroup" xmlns:wpi="http://schemas.microsoft.com/office/word/2010/wordprocessingInk" xmlns:wne="http://schemas.microsoft.com/office/word/2006/wordml" xmlns:wps="http://schemas.microsoft.com/office/word/2010/wordprocessingShape" mc:Ignorable="w14 w15 w16se w16cid w16 w16cex w16sdtdh w16sdtfl w16du wp14">
+  <w:p>
+    <w:pPr>
+      <w:pStyle w:val="Header"/>
       <w:spacing w:after="280"/>
       <w:jc w:val="center"/>
     </w:pPr>
@@ -14585,7 +15395,7 @@
 </w:hdr>
 </file>
 
-<file path=word/header11.xml><?xml version="1.0" encoding="utf-8"?>
+<file path=word/header12.xml><?xml version="1.0" encoding="utf-8"?>
 <w:hdr xmlns:wpc="http://schemas.microsoft.com/office/word/2010/wordprocessingCanvas" xmlns:cx="http://schemas.microsoft.com/office/drawing/2014/chartex" xmlns:cx1="http://schemas.microsoft.com/office/drawing/2015/9/8/chartex" xmlns:cx2="http://schemas.microsoft.com/office/drawing/2015/10/21/chartex" xmlns:cx3="http://schemas.microsoft.com/office/drawing/2016/5/9/chartex" xmlns:cx4="http://schemas.microsoft.com/office/drawing/2016/5/10/chartex" xmlns:cx5="http://schemas.microsoft.com/office/drawing/2016/5/11/chartex" xmlns:cx6="http://schemas.microsoft.com/office/drawing/2016/5/12/chartex" xmlns:cx7="http://schemas.microsoft.com/office/drawing/2016/5/13/chartex" xmlns:cx8="http://schemas.microsoft.com/office/drawing/2016/5/14/chartex" xmlns:mc="http://schemas.openxmlformats.org/markup-compatibility/2006" xmlns:aink="http://schemas.microsoft.com/office/drawing/2016/ink" xmlns:am3d="http://schemas.microsoft.com/office/drawing/2017/model3d" xmlns:o="urn:schemas-microsoft-com:office:office" xmlns:oel="http://schemas.microsoft.com/office/2019/extlst" xmlns:r="http://schemas.openxmlformats.org/officeDocument/2006/relationships" xmlns:m="http://schemas.openxmlformats.org/officeDocument/2006/math" xmlns:v="urn:schemas-microsoft-com:vml" xmlns:wp14="http://schemas.microsoft.com/office/word/2010/wordprocessingDrawing" xmlns:wp="http://schemas.openxmlformats.org/drawingml/2006/wordprocessingDrawing" xmlns:w10="urn:schemas-microsoft-com:office:word" xmlns:w="http://schemas.openxmlformats.org/wordprocessingml/2006/main" xmlns:w14="http://schemas.microsoft.com/office/word/2010/wordml" xmlns:w15="http://schemas.microsoft.com/office/word/2012/wordml" xmlns:w16cex="http://schemas.microsoft.com/office/word/2018/wordml/cex" xmlns:w16cid="http://schemas.microsoft.com/office/word/2016/wordml/cid" xmlns:w16="http://schemas.microsoft.com/office/word/2018/wordml" xmlns:w16du="http://schemas.microsoft.com/office/word/2023/wordml/word16du" xmlns:w16sdtdh="http://schemas.microsoft.com/office/word/2020/wordml/sdtdatahash" xmlns:w16sdtfl="http://schemas.microsoft.com/office/word/2024/wordml/sdtformatlock" xmlns:w16se="http://schemas.microsoft.com/office/word/2015/wordml/symex" xmlns:wpg="http://schemas.microsoft.com/office/word/2010/wordprocessingGroup" xmlns:wpi="http://schemas.microsoft.com/office/word/2010/wordprocessingInk" xmlns:wne="http://schemas.microsoft.com/office/word/2006/wordml" xmlns:wps="http://schemas.microsoft.com/office/word/2010/wordprocessingShape" mc:Ignorable="w14 w15 w16se w16cid w16 w16cex w16sdtdh w16sdtfl w16du wp14">
   <w:p>
     <w:pPr>
@@ -14604,7 +15414,7 @@
 </w:hdr>
 </file>
 
-<file path=word/header12.xml><?xml version="1.0" encoding="utf-8"?>
+<file path=word/header13.xml><?xml version="1.0" encoding="utf-8"?>
 <w:hdr xmlns:wpc="http://schemas.microsoft.com/office/word/2010/wordprocessingCanvas" xmlns:cx="http://schemas.microsoft.com/office/drawing/2014/chartex" xmlns:cx1="http://schemas.microsoft.com/office/drawing/2015/9/8/chartex" xmlns:cx2="http://schemas.microsoft.com/office/drawing/2015/10/21/chartex" xmlns:cx3="http://schemas.microsoft.com/office/drawing/2016/5/9/chartex" xmlns:cx4="http://schemas.microsoft.com/office/drawing/2016/5/10/chartex" xmlns:cx5="http://schemas.microsoft.com/office/drawing/2016/5/11/chartex" xmlns:cx6="http://schemas.microsoft.com/office/drawing/2016/5/12/chartex" xmlns:cx7="http://schemas.microsoft.com/office/drawing/2016/5/13/chartex" xmlns:cx8="http://schemas.microsoft.com/office/drawing/2016/5/14/chartex" xmlns:mc="http://schemas.openxmlformats.org/markup-compatibility/2006" xmlns:aink="http://schemas.microsoft.com/office/drawing/2016/ink" xmlns:am3d="http://schemas.microsoft.com/office/drawing/2017/model3d" xmlns:o="urn:schemas-microsoft-com:office:office" xmlns:oel="http://schemas.microsoft.com/office/2019/extlst" xmlns:r="http://schemas.openxmlformats.org/officeDocument/2006/relationships" xmlns:m="http://schemas.openxmlformats.org/officeDocument/2006/math" xmlns:v="urn:schemas-microsoft-com:vml" xmlns:wp14="http://schemas.microsoft.com/office/word/2010/wordprocessingDrawing" xmlns:wp="http://schemas.openxmlformats.org/drawingml/2006/wordprocessingDrawing" xmlns:w10="urn:schemas-microsoft-com:office:word" xmlns:w="http://schemas.openxmlformats.org/wordprocessingml/2006/main" xmlns:w14="http://schemas.microsoft.com/office/word/2010/wordml" xmlns:w15="http://schemas.microsoft.com/office/word/2012/wordml" xmlns:w16cex="http://schemas.microsoft.com/office/word/2018/wordml/cex" xmlns:w16cid="http://schemas.microsoft.com/office/word/2016/wordml/cid" xmlns:w16="http://schemas.microsoft.com/office/word/2018/wordml" xmlns:w16du="http://schemas.microsoft.com/office/word/2023/wordml/word16du" xmlns:w16sdtdh="http://schemas.microsoft.com/office/word/2020/wordml/sdtdatahash" xmlns:w16sdtfl="http://schemas.microsoft.com/office/word/2024/wordml/sdtformatlock" xmlns:w16se="http://schemas.microsoft.com/office/word/2015/wordml/symex" xmlns:wpg="http://schemas.microsoft.com/office/word/2010/wordprocessingGroup" xmlns:wpi="http://schemas.microsoft.com/office/word/2010/wordprocessingInk" xmlns:wne="http://schemas.microsoft.com/office/word/2006/wordml" xmlns:wps="http://schemas.microsoft.com/office/word/2010/wordprocessingShape" mc:Ignorable="w14 w15 w16se w16cid w16 w16cex w16sdtdh w16sdtfl w16du wp14">
   <w:p>
     <w:pPr>
@@ -14638,7 +15448,7 @@
 </w:hdr>
 </file>
 
-<file path=word/header13.xml><?xml version="1.0" encoding="utf-8"?>
+<file path=word/header14.xml><?xml version="1.0" encoding="utf-8"?>
 <w:hdr xmlns:wpc="http://schemas.microsoft.com/office/word/2010/wordprocessingCanvas" xmlns:cx="http://schemas.microsoft.com/office/drawing/2014/chartex" xmlns:cx1="http://schemas.microsoft.com/office/drawing/2015/9/8/chartex" xmlns:cx2="http://schemas.microsoft.com/office/drawing/2015/10/21/chartex" xmlns:cx3="http://schemas.microsoft.com/office/drawing/2016/5/9/chartex" xmlns:cx4="http://schemas.microsoft.com/office/drawing/2016/5/10/chartex" xmlns:cx5="http://schemas.microsoft.com/office/drawing/2016/5/11/chartex" xmlns:cx6="http://schemas.microsoft.com/office/drawing/2016/5/12/chartex" xmlns:cx7="http://schemas.microsoft.com/office/drawing/2016/5/13/chartex" xmlns:cx8="http://schemas.microsoft.com/office/drawing/2016/5/14/chartex" xmlns:mc="http://schemas.openxmlformats.org/markup-compatibility/2006" xmlns:aink="http://schemas.microsoft.com/office/drawing/2016/ink" xmlns:am3d="http://schemas.microsoft.com/office/drawing/2017/model3d" xmlns:o="urn:schemas-microsoft-com:office:office" xmlns:oel="http://schemas.microsoft.com/office/2019/extlst" xmlns:r="http://schemas.openxmlformats.org/officeDocument/2006/relationships" xmlns:m="http://schemas.openxmlformats.org/officeDocument/2006/math" xmlns:v="urn:schemas-microsoft-com:vml" xmlns:wp14="http://schemas.microsoft.com/office/word/2010/wordprocessingDrawing" xmlns:wp="http://schemas.openxmlformats.org/drawingml/2006/wordprocessingDrawing" xmlns:w10="urn:schemas-microsoft-com:office:word" xmlns:w="http://schemas.openxmlformats.org/wordprocessingml/2006/main" xmlns:w14="http://schemas.microsoft.com/office/word/2010/wordml" xmlns:w15="http://schemas.microsoft.com/office/word/2012/wordml" xmlns:w16cex="http://schemas.microsoft.com/office/word/2018/wordml/cex" xmlns:w16cid="http://schemas.microsoft.com/office/word/2016/wordml/cid" xmlns:w16="http://schemas.microsoft.com/office/word/2018/wordml" xmlns:w16du="http://schemas.microsoft.com/office/word/2023/wordml/word16du" xmlns:w16sdtdh="http://schemas.microsoft.com/office/word/2020/wordml/sdtdatahash" xmlns:w16sdtfl="http://schemas.microsoft.com/office/word/2024/wordml/sdtformatlock" xmlns:w16se="http://schemas.microsoft.com/office/word/2015/wordml/symex" xmlns:wpg="http://schemas.microsoft.com/office/word/2010/wordprocessingGroup" xmlns:wpi="http://schemas.microsoft.com/office/word/2010/wordprocessingInk" xmlns:wne="http://schemas.microsoft.com/office/word/2006/wordml" xmlns:wps="http://schemas.microsoft.com/office/word/2010/wordprocessingShape" mc:Ignorable="w14 w15 w16se w16cid w16 w16cex w16sdtdh w16sdtfl w16du wp14">
   <w:p>
     <w:pPr>
@@ -14657,7 +15467,7 @@
 </w:hdr>
 </file>
 
-<file path=word/header14.xml><?xml version="1.0" encoding="utf-8"?>
+<file path=word/header15.xml><?xml version="1.0" encoding="utf-8"?>
 <w:hdr xmlns:wpc="http://schemas.microsoft.com/office/word/2010/wordprocessingCanvas" xmlns:cx="http://schemas.microsoft.com/office/drawing/2014/chartex" xmlns:cx1="http://schemas.microsoft.com/office/drawing/2015/9/8/chartex" xmlns:cx2="http://schemas.microsoft.com/office/drawing/2015/10/21/chartex" xmlns:cx3="http://schemas.microsoft.com/office/drawing/2016/5/9/chartex" xmlns:cx4="http://schemas.microsoft.com/office/drawing/2016/5/10/chartex" xmlns:cx5="http://schemas.microsoft.com/office/drawing/2016/5/11/chartex" xmlns:cx6="http://schemas.microsoft.com/office/drawing/2016/5/12/chartex" xmlns:cx7="http://schemas.microsoft.com/office/drawing/2016/5/13/chartex" xmlns:cx8="http://schemas.microsoft.com/office/drawing/2016/5/14/chartex" xmlns:mc="http://schemas.openxmlformats.org/markup-compatibility/2006" xmlns:aink="http://schemas.microsoft.com/office/drawing/2016/ink" xmlns:am3d="http://schemas.microsoft.com/office/drawing/2017/model3d" xmlns:o="urn:schemas-microsoft-com:office:office" xmlns:oel="http://schemas.microsoft.com/office/2019/extlst" xmlns:r="http://schemas.openxmlformats.org/officeDocument/2006/relationships" xmlns:m="http://schemas.openxmlformats.org/officeDocument/2006/math" xmlns:v="urn:schemas-microsoft-com:vml" xmlns:wp14="http://schemas.microsoft.com/office/word/2010/wordprocessingDrawing" xmlns:wp="http://schemas.openxmlformats.org/drawingml/2006/wordprocessingDrawing" xmlns:w10="urn:schemas-microsoft-com:office:word" xmlns:w="http://schemas.openxmlformats.org/wordprocessingml/2006/main" xmlns:w14="http://schemas.microsoft.com/office/word/2010/wordml" xmlns:w15="http://schemas.microsoft.com/office/word/2012/wordml" xmlns:w16cex="http://schemas.microsoft.com/office/word/2018/wordml/cex" xmlns:w16cid="http://schemas.microsoft.com/office/word/2016/wordml/cid" xmlns:w16="http://schemas.microsoft.com/office/word/2018/wordml" xmlns:w16du="http://schemas.microsoft.com/office/word/2023/wordml/word16du" xmlns:w16sdtdh="http://schemas.microsoft.com/office/word/2020/wordml/sdtdatahash" xmlns:w16sdtfl="http://schemas.microsoft.com/office/word/2024/wordml/sdtformatlock" xmlns:w16se="http://schemas.microsoft.com/office/word/2015/wordml/symex" xmlns:wpg="http://schemas.microsoft.com/office/word/2010/wordprocessingGroup" xmlns:wpi="http://schemas.microsoft.com/office/word/2010/wordprocessingInk" xmlns:wne="http://schemas.microsoft.com/office/word/2006/wordml" xmlns:wps="http://schemas.microsoft.com/office/word/2010/wordprocessingShape" mc:Ignorable="w14 w15 w16se w16cid w16 w16cex w16sdtdh w16sdtfl w16du wp14">
   <w:p>
     <w:pPr>
@@ -14691,7 +15501,7 @@
 </w:hdr>
 </file>
 
-<file path=word/header15.xml><?xml version="1.0" encoding="utf-8"?>
+<file path=word/header16.xml><?xml version="1.0" encoding="utf-8"?>
 <w:hdr xmlns:wpc="http://schemas.microsoft.com/office/word/2010/wordprocessingCanvas" xmlns:cx="http://schemas.microsoft.com/office/drawing/2014/chartex" xmlns:cx1="http://schemas.microsoft.com/office/drawing/2015/9/8/chartex" xmlns:cx2="http://schemas.microsoft.com/office/drawing/2015/10/21/chartex" xmlns:cx3="http://schemas.microsoft.com/office/drawing/2016/5/9/chartex" xmlns:cx4="http://schemas.microsoft.com/office/drawing/2016/5/10/chartex" xmlns:cx5="http://schemas.microsoft.com/office/drawing/2016/5/11/chartex" xmlns:cx6="http://schemas.microsoft.com/office/drawing/2016/5/12/chartex" xmlns:cx7="http://schemas.microsoft.com/office/drawing/2016/5/13/chartex" xmlns:cx8="http://schemas.microsoft.com/office/drawing/2016/5/14/chartex" xmlns:mc="http://schemas.openxmlformats.org/markup-compatibility/2006" xmlns:aink="http://schemas.microsoft.com/office/drawing/2016/ink" xmlns:am3d="http://schemas.microsoft.com/office/drawing/2017/model3d" xmlns:o="urn:schemas-microsoft-com:office:office" xmlns:oel="http://schemas.microsoft.com/office/2019/extlst" xmlns:r="http://schemas.openxmlformats.org/officeDocument/2006/relationships" xmlns:m="http://schemas.openxmlformats.org/officeDocument/2006/math" xmlns:v="urn:schemas-microsoft-com:vml" xmlns:wp14="http://schemas.microsoft.com/office/word/2010/wordprocessingDrawing" xmlns:wp="http://schemas.openxmlformats.org/drawingml/2006/wordprocessingDrawing" xmlns:w10="urn:schemas-microsoft-com:office:word" xmlns:w="http://schemas.openxmlformats.org/wordprocessingml/2006/main" xmlns:w14="http://schemas.microsoft.com/office/word/2010/wordml" xmlns:w15="http://schemas.microsoft.com/office/word/2012/wordml" xmlns:w16cex="http://schemas.microsoft.com/office/word/2018/wordml/cex" xmlns:w16cid="http://schemas.microsoft.com/office/word/2016/wordml/cid" xmlns:w16="http://schemas.microsoft.com/office/word/2018/wordml" xmlns:w16du="http://schemas.microsoft.com/office/word/2023/wordml/word16du" xmlns:w16sdtdh="http://schemas.microsoft.com/office/word/2020/wordml/sdtdatahash" xmlns:w16sdtfl="http://schemas.microsoft.com/office/word/2024/wordml/sdtformatlock" xmlns:w16se="http://schemas.microsoft.com/office/word/2015/wordml/symex" xmlns:wpg="http://schemas.microsoft.com/office/word/2010/wordprocessingGroup" xmlns:wpi="http://schemas.microsoft.com/office/word/2010/wordprocessingInk" xmlns:wne="http://schemas.microsoft.com/office/word/2006/wordml" xmlns:wps="http://schemas.microsoft.com/office/word/2010/wordprocessingShape" mc:Ignorable="w14 w15 w16se w16cid w16 w16cex w16sdtdh w16sdtfl w16du wp14">
   <w:p>
     <w:pPr>
@@ -14710,7 +15520,7 @@
 </w:hdr>
 </file>
 
-<file path=word/header16.xml><?xml version="1.0" encoding="utf-8"?>
+<file path=word/header17.xml><?xml version="1.0" encoding="utf-8"?>
 <w:hdr xmlns:wpc="http://schemas.microsoft.com/office/word/2010/wordprocessingCanvas" xmlns:cx="http://schemas.microsoft.com/office/drawing/2014/chartex" xmlns:cx1="http://schemas.microsoft.com/office/drawing/2015/9/8/chartex" xmlns:cx2="http://schemas.microsoft.com/office/drawing/2015/10/21/chartex" xmlns:cx3="http://schemas.microsoft.com/office/drawing/2016/5/9/chartex" xmlns:cx4="http://schemas.microsoft.com/office/drawing/2016/5/10/chartex" xmlns:cx5="http://schemas.microsoft.com/office/drawing/2016/5/11/chartex" xmlns:cx6="http://schemas.microsoft.com/office/drawing/2016/5/12/chartex" xmlns:cx7="http://schemas.microsoft.com/office/drawing/2016/5/13/chartex" xmlns:cx8="http://schemas.microsoft.com/office/drawing/2016/5/14/chartex" xmlns:mc="http://schemas.openxmlformats.org/markup-compatibility/2006" xmlns:aink="http://schemas.microsoft.com/office/drawing/2016/ink" xmlns:am3d="http://schemas.microsoft.com/office/drawing/2017/model3d" xmlns:o="urn:schemas-microsoft-com:office:office" xmlns:oel="http://schemas.microsoft.com/office/2019/extlst" xmlns:r="http://schemas.openxmlformats.org/officeDocument/2006/relationships" xmlns:m="http://schemas.openxmlformats.org/officeDocument/2006/math" xmlns:v="urn:schemas-microsoft-com:vml" xmlns:wp14="http://schemas.microsoft.com/office/word/2010/wordprocessingDrawing" xmlns:wp="http://schemas.openxmlformats.org/drawingml/2006/wordprocessingDrawing" xmlns:w10="urn:schemas-microsoft-com:office:word" xmlns:w="http://schemas.openxmlformats.org/wordprocessingml/2006/main" xmlns:w14="http://schemas.microsoft.com/office/word/2010/wordml" xmlns:w15="http://schemas.microsoft.com/office/word/2012/wordml" xmlns:w16cex="http://schemas.microsoft.com/office/word/2018/wordml/cex" xmlns:w16cid="http://schemas.microsoft.com/office/word/2016/wordml/cid" xmlns:w16="http://schemas.microsoft.com/office/word/2018/wordml" xmlns:w16du="http://schemas.microsoft.com/office/word/2023/wordml/word16du" xmlns:w16sdtdh="http://schemas.microsoft.com/office/word/2020/wordml/sdtdatahash" xmlns:w16sdtfl="http://schemas.microsoft.com/office/word/2024/wordml/sdtformatlock" xmlns:w16se="http://schemas.microsoft.com/office/word/2015/wordml/symex" xmlns:wpg="http://schemas.microsoft.com/office/word/2010/wordprocessingGroup" xmlns:wpi="http://schemas.microsoft.com/office/word/2010/wordprocessingInk" xmlns:wne="http://schemas.microsoft.com/office/word/2006/wordml" xmlns:wps="http://schemas.microsoft.com/office/word/2010/wordprocessingShape" mc:Ignorable="w14 w15 w16se w16cid w16 w16cex w16sdtdh w16sdtfl w16du wp14">
   <w:p>
     <w:pPr>
@@ -14744,7 +15554,7 @@
 </w:hdr>
 </file>
 
-<file path=word/header17.xml><?xml version="1.0" encoding="utf-8"?>
+<file path=word/header18.xml><?xml version="1.0" encoding="utf-8"?>
 <w:hdr xmlns:wpc="http://schemas.microsoft.com/office/word/2010/wordprocessingCanvas" xmlns:cx="http://schemas.microsoft.com/office/drawing/2014/chartex" xmlns:cx1="http://schemas.microsoft.com/office/drawing/2015/9/8/chartex" xmlns:cx2="http://schemas.microsoft.com/office/drawing/2015/10/21/chartex" xmlns:cx3="http://schemas.microsoft.com/office/drawing/2016/5/9/chartex" xmlns:cx4="http://schemas.microsoft.com/office/drawing/2016/5/10/chartex" xmlns:cx5="http://schemas.microsoft.com/office/drawing/2016/5/11/chartex" xmlns:cx6="http://schemas.microsoft.com/office/drawing/2016/5/12/chartex" xmlns:cx7="http://schemas.microsoft.com/office/drawing/2016/5/13/chartex" xmlns:cx8="http://schemas.microsoft.com/office/drawing/2016/5/14/chartex" xmlns:mc="http://schemas.openxmlformats.org/markup-compatibility/2006" xmlns:aink="http://schemas.microsoft.com/office/drawing/2016/ink" xmlns:am3d="http://schemas.microsoft.com/office/drawing/2017/model3d" xmlns:o="urn:schemas-microsoft-com:office:office" xmlns:oel="http://schemas.microsoft.com/office/2019/extlst" xmlns:r="http://schemas.openxmlformats.org/officeDocument/2006/relationships" xmlns:m="http://schemas.openxmlformats.org/officeDocument/2006/math" xmlns:v="urn:schemas-microsoft-com:vml" xmlns:wp14="http://schemas.microsoft.com/office/word/2010/wordprocessingDrawing" xmlns:wp="http://schemas.openxmlformats.org/drawingml/2006/wordprocessingDrawing" xmlns:w10="urn:schemas-microsoft-com:office:word" xmlns:w="http://schemas.openxmlformats.org/wordprocessingml/2006/main" xmlns:w14="http://schemas.microsoft.com/office/word/2010/wordml" xmlns:w15="http://schemas.microsoft.com/office/word/2012/wordml" xmlns:w16cex="http://schemas.microsoft.com/office/word/2018/wordml/cex" xmlns:w16cid="http://schemas.microsoft.com/office/word/2016/wordml/cid" xmlns:w16="http://schemas.microsoft.com/office/word/2018/wordml" xmlns:w16du="http://schemas.microsoft.com/office/word/2023/wordml/word16du" xmlns:w16sdtdh="http://schemas.microsoft.com/office/word/2020/wordml/sdtdatahash" xmlns:w16sdtfl="http://schemas.microsoft.com/office/word/2024/wordml/sdtformatlock" xmlns:w16se="http://schemas.microsoft.com/office/word/2015/wordml/symex" xmlns:wpg="http://schemas.microsoft.com/office/word/2010/wordprocessingGroup" xmlns:wpi="http://schemas.microsoft.com/office/word/2010/wordprocessingInk" xmlns:wne="http://schemas.microsoft.com/office/word/2006/wordml" xmlns:wps="http://schemas.microsoft.com/office/word/2010/wordprocessingShape" mc:Ignorable="w14 w15 w16se w16cid w16 w16cex w16sdtdh w16sdtfl w16du wp14">
   <w:p>
     <w:pPr>
@@ -14763,7 +15573,7 @@
 </w:hdr>
 </file>
 
-<file path=word/header18.xml><?xml version="1.0" encoding="utf-8"?>
+<file path=word/header19.xml><?xml version="1.0" encoding="utf-8"?>
 <w:hdr xmlns:wpc="http://schemas.microsoft.com/office/word/2010/wordprocessingCanvas" xmlns:cx="http://schemas.microsoft.com/office/drawing/2014/chartex" xmlns:cx1="http://schemas.microsoft.com/office/drawing/2015/9/8/chartex" xmlns:cx2="http://schemas.microsoft.com/office/drawing/2015/10/21/chartex" xmlns:cx3="http://schemas.microsoft.com/office/drawing/2016/5/9/chartex" xmlns:cx4="http://schemas.microsoft.com/office/drawing/2016/5/10/chartex" xmlns:cx5="http://schemas.microsoft.com/office/drawing/2016/5/11/chartex" xmlns:cx6="http://schemas.microsoft.com/office/drawing/2016/5/12/chartex" xmlns:cx7="http://schemas.microsoft.com/office/drawing/2016/5/13/chartex" xmlns:cx8="http://schemas.microsoft.com/office/drawing/2016/5/14/chartex" xmlns:mc="http://schemas.openxmlformats.org/markup-compatibility/2006" xmlns:aink="http://schemas.microsoft.com/office/drawing/2016/ink" xmlns:am3d="http://schemas.microsoft.com/office/drawing/2017/model3d" xmlns:o="urn:schemas-microsoft-com:office:office" xmlns:oel="http://schemas.microsoft.com/office/2019/extlst" xmlns:r="http://schemas.openxmlformats.org/officeDocument/2006/relationships" xmlns:m="http://schemas.openxmlformats.org/officeDocument/2006/math" xmlns:v="urn:schemas-microsoft-com:vml" xmlns:wp14="http://schemas.microsoft.com/office/word/2010/wordprocessingDrawing" xmlns:wp="http://schemas.openxmlformats.org/drawingml/2006/wordprocessingDrawing" xmlns:w10="urn:schemas-microsoft-com:office:word" xmlns:w="http://schemas.openxmlformats.org/wordprocessingml/2006/main" xmlns:w14="http://schemas.microsoft.com/office/word/2010/wordml" xmlns:w15="http://schemas.microsoft.com/office/word/2012/wordml" xmlns:w16cex="http://schemas.microsoft.com/office/word/2018/wordml/cex" xmlns:w16cid="http://schemas.microsoft.com/office/word/2016/wordml/cid" xmlns:w16="http://schemas.microsoft.com/office/word/2018/wordml" xmlns:w16du="http://schemas.microsoft.com/office/word/2023/wordml/word16du" xmlns:w16sdtdh="http://schemas.microsoft.com/office/word/2020/wordml/sdtdatahash" xmlns:w16sdtfl="http://schemas.microsoft.com/office/word/2024/wordml/sdtformatlock" xmlns:w16se="http://schemas.microsoft.com/office/word/2015/wordml/symex" xmlns:wpg="http://schemas.microsoft.com/office/word/2010/wordprocessingGroup" xmlns:wpi="http://schemas.microsoft.com/office/word/2010/wordprocessingInk" xmlns:wne="http://schemas.microsoft.com/office/word/2006/wordml" xmlns:wps="http://schemas.microsoft.com/office/word/2010/wordprocessingShape" mc:Ignorable="w14 w15 w16se w16cid w16 w16cex w16sdtdh w16sdtfl w16du wp14">
   <w:p>
     <w:pPr>
@@ -14792,25 +15602,6 @@
         <w:sz w:val="24"/>
       </w:rPr>
       <w:t>Chapter 8</w:t>
-    </w:r>
-  </w:p>
-</w:hdr>
-</file>
-
-<file path=word/header19.xml><?xml version="1.0" encoding="utf-8"?>
-<w:hdr xmlns:wpc="http://schemas.microsoft.com/office/word/2010/wordprocessingCanvas" xmlns:cx="http://schemas.microsoft.com/office/drawing/2014/chartex" xmlns:cx1="http://schemas.microsoft.com/office/drawing/2015/9/8/chartex" xmlns:cx2="http://schemas.microsoft.com/office/drawing/2015/10/21/chartex" xmlns:cx3="http://schemas.microsoft.com/office/drawing/2016/5/9/chartex" xmlns:cx4="http://schemas.microsoft.com/office/drawing/2016/5/10/chartex" xmlns:cx5="http://schemas.microsoft.com/office/drawing/2016/5/11/chartex" xmlns:cx6="http://schemas.microsoft.com/office/drawing/2016/5/12/chartex" xmlns:cx7="http://schemas.microsoft.com/office/drawing/2016/5/13/chartex" xmlns:cx8="http://schemas.microsoft.com/office/drawing/2016/5/14/chartex" xmlns:mc="http://schemas.openxmlformats.org/markup-compatibility/2006" xmlns:aink="http://schemas.microsoft.com/office/drawing/2016/ink" xmlns:am3d="http://schemas.microsoft.com/office/drawing/2017/model3d" xmlns:o="urn:schemas-microsoft-com:office:office" xmlns:oel="http://schemas.microsoft.com/office/2019/extlst" xmlns:r="http://schemas.openxmlformats.org/officeDocument/2006/relationships" xmlns:m="http://schemas.openxmlformats.org/officeDocument/2006/math" xmlns:v="urn:schemas-microsoft-com:vml" xmlns:wp14="http://schemas.microsoft.com/office/word/2010/wordprocessingDrawing" xmlns:wp="http://schemas.openxmlformats.org/drawingml/2006/wordprocessingDrawing" xmlns:w10="urn:schemas-microsoft-com:office:word" xmlns:w="http://schemas.openxmlformats.org/wordprocessingml/2006/main" xmlns:w14="http://schemas.microsoft.com/office/word/2010/wordml" xmlns:w15="http://schemas.microsoft.com/office/word/2012/wordml" xmlns:w16cex="http://schemas.microsoft.com/office/word/2018/wordml/cex" xmlns:w16cid="http://schemas.microsoft.com/office/word/2016/wordml/cid" xmlns:w16="http://schemas.microsoft.com/office/word/2018/wordml" xmlns:w16du="http://schemas.microsoft.com/office/word/2023/wordml/word16du" xmlns:w16sdtdh="http://schemas.microsoft.com/office/word/2020/wordml/sdtdatahash" xmlns:w16sdtfl="http://schemas.microsoft.com/office/word/2024/wordml/sdtformatlock" xmlns:w16se="http://schemas.microsoft.com/office/word/2015/wordml/symex" xmlns:wpg="http://schemas.microsoft.com/office/word/2010/wordprocessingGroup" xmlns:wpi="http://schemas.microsoft.com/office/word/2010/wordprocessingInk" xmlns:wne="http://schemas.microsoft.com/office/word/2006/wordml" xmlns:wps="http://schemas.microsoft.com/office/word/2010/wordprocessingShape" mc:Ignorable="w14 w15 w16se w16cid w16 w16cex w16sdtdh w16sdtfl w16du wp14">
-  <w:p>
-    <w:pPr>
-      <w:pStyle w:val="Header"/>
-      <w:jc w:val="center"/>
-    </w:pPr>
-    <w:r>
-      <w:rPr>
-        <w:b/>
-        <w:caps/>
-        <w:sz w:val="19"/>
-      </w:rPr>
-      <w:t>CHAINGUARD V2: A TAMPER-EVIDENT LAST-MILE LOGISTICS CONTROL PLANE</w:t>
     </w:r>
   </w:p>
 </w:hdr>
@@ -14831,6 +15622,25 @@
   <w:p>
     <w:pPr>
       <w:pStyle w:val="Header"/>
+      <w:jc w:val="center"/>
+    </w:pPr>
+    <w:r>
+      <w:rPr>
+        <w:b/>
+        <w:caps/>
+        <w:sz w:val="19"/>
+      </w:rPr>
+      <w:t>CHAINGUARD V2: A TAMPER-EVIDENT LAST-MILE LOGISTICS CONTROL PLANE</w:t>
+    </w:r>
+  </w:p>
+</w:hdr>
+</file>
+
+<file path=word/header21.xml><?xml version="1.0" encoding="utf-8"?>
+<w:hdr xmlns:wpc="http://schemas.microsoft.com/office/word/2010/wordprocessingCanvas" xmlns:cx="http://schemas.microsoft.com/office/drawing/2014/chartex" xmlns:cx1="http://schemas.microsoft.com/office/drawing/2015/9/8/chartex" xmlns:cx2="http://schemas.microsoft.com/office/drawing/2015/10/21/chartex" xmlns:cx3="http://schemas.microsoft.com/office/drawing/2016/5/9/chartex" xmlns:cx4="http://schemas.microsoft.com/office/drawing/2016/5/10/chartex" xmlns:cx5="http://schemas.microsoft.com/office/drawing/2016/5/11/chartex" xmlns:cx6="http://schemas.microsoft.com/office/drawing/2016/5/12/chartex" xmlns:cx7="http://schemas.microsoft.com/office/drawing/2016/5/13/chartex" xmlns:cx8="http://schemas.microsoft.com/office/drawing/2016/5/14/chartex" xmlns:mc="http://schemas.openxmlformats.org/markup-compatibility/2006" xmlns:aink="http://schemas.microsoft.com/office/drawing/2016/ink" xmlns:am3d="http://schemas.microsoft.com/office/drawing/2017/model3d" xmlns:o="urn:schemas-microsoft-com:office:office" xmlns:oel="http://schemas.microsoft.com/office/2019/extlst" xmlns:r="http://schemas.openxmlformats.org/officeDocument/2006/relationships" xmlns:m="http://schemas.openxmlformats.org/officeDocument/2006/math" xmlns:v="urn:schemas-microsoft-com:vml" xmlns:wp14="http://schemas.microsoft.com/office/word/2010/wordprocessingDrawing" xmlns:wp="http://schemas.openxmlformats.org/drawingml/2006/wordprocessingDrawing" xmlns:w10="urn:schemas-microsoft-com:office:word" xmlns:w="http://schemas.openxmlformats.org/wordprocessingml/2006/main" xmlns:w14="http://schemas.microsoft.com/office/word/2010/wordml" xmlns:w15="http://schemas.microsoft.com/office/word/2012/wordml" xmlns:w16cex="http://schemas.microsoft.com/office/word/2018/wordml/cex" xmlns:w16cid="http://schemas.microsoft.com/office/word/2016/wordml/cid" xmlns:w16="http://schemas.microsoft.com/office/word/2018/wordml" xmlns:w16du="http://schemas.microsoft.com/office/word/2023/wordml/word16du" xmlns:w16sdtdh="http://schemas.microsoft.com/office/word/2020/wordml/sdtdatahash" xmlns:w16sdtfl="http://schemas.microsoft.com/office/word/2024/wordml/sdtformatlock" xmlns:w16se="http://schemas.microsoft.com/office/word/2015/wordml/symex" xmlns:wpg="http://schemas.microsoft.com/office/word/2010/wordprocessingGroup" xmlns:wpi="http://schemas.microsoft.com/office/word/2010/wordprocessingInk" xmlns:wne="http://schemas.microsoft.com/office/word/2006/wordml" xmlns:wps="http://schemas.microsoft.com/office/word/2010/wordprocessingShape" mc:Ignorable="w14 w15 w16se w16cid w16 w16cex w16sdtdh w16sdtfl w16du wp14">
+  <w:p>
+    <w:pPr>
+      <w:pStyle w:val="Header"/>
       <w:spacing w:after="280"/>
       <w:jc w:val="center"/>
     </w:pPr>
@@ -14860,7 +15670,7 @@
 </w:hdr>
 </file>
 
-<file path=word/header21.xml><?xml version="1.0" encoding="utf-8"?>
+<file path=word/header22.xml><?xml version="1.0" encoding="utf-8"?>
 <w:hdr xmlns:wpc="http://schemas.microsoft.com/office/word/2010/wordprocessingCanvas" xmlns:cx="http://schemas.microsoft.com/office/drawing/2014/chartex" xmlns:cx1="http://schemas.microsoft.com/office/drawing/2015/9/8/chartex" xmlns:cx2="http://schemas.microsoft.com/office/drawing/2015/10/21/chartex" xmlns:cx3="http://schemas.microsoft.com/office/drawing/2016/5/9/chartex" xmlns:cx4="http://schemas.microsoft.com/office/drawing/2016/5/10/chartex" xmlns:cx5="http://schemas.microsoft.com/office/drawing/2016/5/11/chartex" xmlns:cx6="http://schemas.microsoft.com/office/drawing/2016/5/12/chartex" xmlns:cx7="http://schemas.microsoft.com/office/drawing/2016/5/13/chartex" xmlns:cx8="http://schemas.microsoft.com/office/drawing/2016/5/14/chartex" xmlns:mc="http://schemas.openxmlformats.org/markup-compatibility/2006" xmlns:aink="http://schemas.microsoft.com/office/drawing/2016/ink" xmlns:am3d="http://schemas.microsoft.com/office/drawing/2017/model3d" xmlns:o="urn:schemas-microsoft-com:office:office" xmlns:oel="http://schemas.microsoft.com/office/2019/extlst" xmlns:r="http://schemas.openxmlformats.org/officeDocument/2006/relationships" xmlns:m="http://schemas.openxmlformats.org/officeDocument/2006/math" xmlns:v="urn:schemas-microsoft-com:vml" xmlns:wp14="http://schemas.microsoft.com/office/word/2010/wordprocessingDrawing" xmlns:wp="http://schemas.openxmlformats.org/drawingml/2006/wordprocessingDrawing" xmlns:w10="urn:schemas-microsoft-com:office:word" xmlns:w="http://schemas.openxmlformats.org/wordprocessingml/2006/main" xmlns:w14="http://schemas.microsoft.com/office/word/2010/wordml" xmlns:w15="http://schemas.microsoft.com/office/word/2012/wordml" xmlns:w16cex="http://schemas.microsoft.com/office/word/2018/wordml/cex" xmlns:w16cid="http://schemas.microsoft.com/office/word/2016/wordml/cid" xmlns:w16="http://schemas.microsoft.com/office/word/2018/wordml" xmlns:w16du="http://schemas.microsoft.com/office/word/2023/wordml/word16du" xmlns:w16sdtdh="http://schemas.microsoft.com/office/word/2020/wordml/sdtdatahash" xmlns:w16sdtfl="http://schemas.microsoft.com/office/word/2024/wordml/sdtformatlock" xmlns:w16se="http://schemas.microsoft.com/office/word/2015/wordml/symex" xmlns:wpg="http://schemas.microsoft.com/office/word/2010/wordprocessingGroup" xmlns:wpi="http://schemas.microsoft.com/office/word/2010/wordprocessingInk" xmlns:wne="http://schemas.microsoft.com/office/word/2006/wordml" xmlns:wps="http://schemas.microsoft.com/office/word/2010/wordprocessingShape" mc:Ignorable="w14 w15 w16se w16cid w16 w16cex w16sdtdh w16sdtfl w16du wp14">
   <w:p>
     <w:pPr>
@@ -14903,6 +15713,25 @@
   <w:p>
     <w:pPr>
       <w:pStyle w:val="Header"/>
+      <w:jc w:val="center"/>
+    </w:pPr>
+    <w:r>
+      <w:rPr>
+        <w:b/>
+        <w:caps/>
+        <w:sz w:val="19"/>
+      </w:rPr>
+      <w:t>CHAINGUARD V2: A TAMPER-EVIDENT LAST-MILE LOGISTICS CONTROL PLANE</w:t>
+    </w:r>
+  </w:p>
+</w:hdr>
+</file>
+
+<file path=word/header5.xml><?xml version="1.0" encoding="utf-8"?>
+<w:hdr xmlns:wpc="http://schemas.microsoft.com/office/word/2010/wordprocessingCanvas" xmlns:cx="http://schemas.microsoft.com/office/drawing/2014/chartex" xmlns:cx1="http://schemas.microsoft.com/office/drawing/2015/9/8/chartex" xmlns:cx2="http://schemas.microsoft.com/office/drawing/2015/10/21/chartex" xmlns:cx3="http://schemas.microsoft.com/office/drawing/2016/5/9/chartex" xmlns:cx4="http://schemas.microsoft.com/office/drawing/2016/5/10/chartex" xmlns:cx5="http://schemas.microsoft.com/office/drawing/2016/5/11/chartex" xmlns:cx6="http://schemas.microsoft.com/office/drawing/2016/5/12/chartex" xmlns:cx7="http://schemas.microsoft.com/office/drawing/2016/5/13/chartex" xmlns:cx8="http://schemas.microsoft.com/office/drawing/2016/5/14/chartex" xmlns:mc="http://schemas.openxmlformats.org/markup-compatibility/2006" xmlns:aink="http://schemas.microsoft.com/office/drawing/2016/ink" xmlns:am3d="http://schemas.microsoft.com/office/drawing/2017/model3d" xmlns:o="urn:schemas-microsoft-com:office:office" xmlns:oel="http://schemas.microsoft.com/office/2019/extlst" xmlns:r="http://schemas.openxmlformats.org/officeDocument/2006/relationships" xmlns:m="http://schemas.openxmlformats.org/officeDocument/2006/math" xmlns:v="urn:schemas-microsoft-com:vml" xmlns:wp14="http://schemas.microsoft.com/office/word/2010/wordprocessingDrawing" xmlns:wp="http://schemas.openxmlformats.org/drawingml/2006/wordprocessingDrawing" xmlns:w10="urn:schemas-microsoft-com:office:word" xmlns:w="http://schemas.openxmlformats.org/wordprocessingml/2006/main" xmlns:w14="http://schemas.microsoft.com/office/word/2010/wordml" xmlns:w15="http://schemas.microsoft.com/office/word/2012/wordml" xmlns:w16cex="http://schemas.microsoft.com/office/word/2018/wordml/cex" xmlns:w16cid="http://schemas.microsoft.com/office/word/2016/wordml/cid" xmlns:w16="http://schemas.microsoft.com/office/word/2018/wordml" xmlns:w16du="http://schemas.microsoft.com/office/word/2023/wordml/word16du" xmlns:w16sdtdh="http://schemas.microsoft.com/office/word/2020/wordml/sdtdatahash" xmlns:w16sdtfl="http://schemas.microsoft.com/office/word/2024/wordml/sdtformatlock" xmlns:w16se="http://schemas.microsoft.com/office/word/2015/wordml/symex" xmlns:wpg="http://schemas.microsoft.com/office/word/2010/wordprocessingGroup" xmlns:wpi="http://schemas.microsoft.com/office/word/2010/wordprocessingInk" xmlns:wne="http://schemas.microsoft.com/office/word/2006/wordml" xmlns:wps="http://schemas.microsoft.com/office/word/2010/wordprocessingShape" mc:Ignorable="w14 w15 w16se w16cid w16 w16cex w16sdtdh w16sdtfl w16du wp14">
+  <w:p>
+    <w:pPr>
+      <w:pStyle w:val="Header"/>
       <w:spacing w:after="280"/>
       <w:jc w:val="center"/>
     </w:pPr>
@@ -14932,7 +15761,7 @@
 </w:hdr>
 </file>
 
-<file path=word/header5.xml><?xml version="1.0" encoding="utf-8"?>
+<file path=word/header6.xml><?xml version="1.0" encoding="utf-8"?>
 <w:hdr xmlns:wpc="http://schemas.microsoft.com/office/word/2010/wordprocessingCanvas" xmlns:cx="http://schemas.microsoft.com/office/drawing/2014/chartex" xmlns:cx1="http://schemas.microsoft.com/office/drawing/2015/9/8/chartex" xmlns:cx2="http://schemas.microsoft.com/office/drawing/2015/10/21/chartex" xmlns:cx3="http://schemas.microsoft.com/office/drawing/2016/5/9/chartex" xmlns:cx4="http://schemas.microsoft.com/office/drawing/2016/5/10/chartex" xmlns:cx5="http://schemas.microsoft.com/office/drawing/2016/5/11/chartex" xmlns:cx6="http://schemas.microsoft.com/office/drawing/2016/5/12/chartex" xmlns:cx7="http://schemas.microsoft.com/office/drawing/2016/5/13/chartex" xmlns:cx8="http://schemas.microsoft.com/office/drawing/2016/5/14/chartex" xmlns:mc="http://schemas.openxmlformats.org/markup-compatibility/2006" xmlns:aink="http://schemas.microsoft.com/office/drawing/2016/ink" xmlns:am3d="http://schemas.microsoft.com/office/drawing/2017/model3d" xmlns:o="urn:schemas-microsoft-com:office:office" xmlns:oel="http://schemas.microsoft.com/office/2019/extlst" xmlns:r="http://schemas.openxmlformats.org/officeDocument/2006/relationships" xmlns:m="http://schemas.openxmlformats.org/officeDocument/2006/math" xmlns:v="urn:schemas-microsoft-com:vml" xmlns:wp14="http://schemas.microsoft.com/office/word/2010/wordprocessingDrawing" xmlns:wp="http://schemas.openxmlformats.org/drawingml/2006/wordprocessingDrawing" xmlns:w10="urn:schemas-microsoft-com:office:word" xmlns:w="http://schemas.openxmlformats.org/wordprocessingml/2006/main" xmlns:w14="http://schemas.microsoft.com/office/word/2010/wordml" xmlns:w15="http://schemas.microsoft.com/office/word/2012/wordml" xmlns:w16cex="http://schemas.microsoft.com/office/word/2018/wordml/cex" xmlns:w16cid="http://schemas.microsoft.com/office/word/2016/wordml/cid" xmlns:w16="http://schemas.microsoft.com/office/word/2018/wordml" xmlns:w16du="http://schemas.microsoft.com/office/word/2023/wordml/word16du" xmlns:w16sdtdh="http://schemas.microsoft.com/office/word/2020/wordml/sdtdatahash" xmlns:w16sdtfl="http://schemas.microsoft.com/office/word/2024/wordml/sdtformatlock" xmlns:w16se="http://schemas.microsoft.com/office/word/2015/wordml/symex" xmlns:wpg="http://schemas.microsoft.com/office/word/2010/wordprocessingGroup" xmlns:wpi="http://schemas.microsoft.com/office/word/2010/wordprocessingInk" xmlns:wne="http://schemas.microsoft.com/office/word/2006/wordml" xmlns:wps="http://schemas.microsoft.com/office/word/2010/wordprocessingShape" mc:Ignorable="w14 w15 w16se w16cid w16 w16cex w16sdtdh w16sdtfl w16du wp14">
   <w:p>
     <w:pPr>
@@ -14951,7 +15780,7 @@
 </w:hdr>
 </file>
 
-<file path=word/header6.xml><?xml version="1.0" encoding="utf-8"?>
+<file path=word/header7.xml><?xml version="1.0" encoding="utf-8"?>
 <w:hdr xmlns:wpc="http://schemas.microsoft.com/office/word/2010/wordprocessingCanvas" xmlns:cx="http://schemas.microsoft.com/office/drawing/2014/chartex" xmlns:cx1="http://schemas.microsoft.com/office/drawing/2015/9/8/chartex" xmlns:cx2="http://schemas.microsoft.com/office/drawing/2015/10/21/chartex" xmlns:cx3="http://schemas.microsoft.com/office/drawing/2016/5/9/chartex" xmlns:cx4="http://schemas.microsoft.com/office/drawing/2016/5/10/chartex" xmlns:cx5="http://schemas.microsoft.com/office/drawing/2016/5/11/chartex" xmlns:cx6="http://schemas.microsoft.com/office/drawing/2016/5/12/chartex" xmlns:cx7="http://schemas.microsoft.com/office/drawing/2016/5/13/chartex" xmlns:cx8="http://schemas.microsoft.com/office/drawing/2016/5/14/chartex" xmlns:mc="http://schemas.openxmlformats.org/markup-compatibility/2006" xmlns:aink="http://schemas.microsoft.com/office/drawing/2016/ink" xmlns:am3d="http://schemas.microsoft.com/office/drawing/2017/model3d" xmlns:o="urn:schemas-microsoft-com:office:office" xmlns:oel="http://schemas.microsoft.com/office/2019/extlst" xmlns:r="http://schemas.openxmlformats.org/officeDocument/2006/relationships" xmlns:m="http://schemas.openxmlformats.org/officeDocument/2006/math" xmlns:v="urn:schemas-microsoft-com:vml" xmlns:wp14="http://schemas.microsoft.com/office/word/2010/wordprocessingDrawing" xmlns:wp="http://schemas.openxmlformats.org/drawingml/2006/wordprocessingDrawing" xmlns:w10="urn:schemas-microsoft-com:office:word" xmlns:w="http://schemas.openxmlformats.org/wordprocessingml/2006/main" xmlns:w14="http://schemas.microsoft.com/office/word/2010/wordml" xmlns:w15="http://schemas.microsoft.com/office/word/2012/wordml" xmlns:w16cex="http://schemas.microsoft.com/office/word/2018/wordml/cex" xmlns:w16cid="http://schemas.microsoft.com/office/word/2016/wordml/cid" xmlns:w16="http://schemas.microsoft.com/office/word/2018/wordml" xmlns:w16du="http://schemas.microsoft.com/office/word/2023/wordml/word16du" xmlns:w16sdtdh="http://schemas.microsoft.com/office/word/2020/wordml/sdtdatahash" xmlns:w16sdtfl="http://schemas.microsoft.com/office/word/2024/wordml/sdtformatlock" xmlns:w16se="http://schemas.microsoft.com/office/word/2015/wordml/symex" xmlns:wpg="http://schemas.microsoft.com/office/word/2010/wordprocessingGroup" xmlns:wpi="http://schemas.microsoft.com/office/word/2010/wordprocessingInk" xmlns:wne="http://schemas.microsoft.com/office/word/2006/wordml" xmlns:wps="http://schemas.microsoft.com/office/word/2010/wordprocessingShape" mc:Ignorable="w14 w15 w16se w16cid w16 w16cex w16sdtdh w16sdtfl w16du wp14">
   <w:p>
     <w:pPr>
@@ -14985,7 +15814,7 @@
 </w:hdr>
 </file>
 
-<file path=word/header7.xml><?xml version="1.0" encoding="utf-8"?>
+<file path=word/header8.xml><?xml version="1.0" encoding="utf-8"?>
 <w:hdr xmlns:wpc="http://schemas.microsoft.com/office/word/2010/wordprocessingCanvas" xmlns:cx="http://schemas.microsoft.com/office/drawing/2014/chartex" xmlns:cx1="http://schemas.microsoft.com/office/drawing/2015/9/8/chartex" xmlns:cx2="http://schemas.microsoft.com/office/drawing/2015/10/21/chartex" xmlns:cx3="http://schemas.microsoft.com/office/drawing/2016/5/9/chartex" xmlns:cx4="http://schemas.microsoft.com/office/drawing/2016/5/10/chartex" xmlns:cx5="http://schemas.microsoft.com/office/drawing/2016/5/11/chartex" xmlns:cx6="http://schemas.microsoft.com/office/drawing/2016/5/12/chartex" xmlns:cx7="http://schemas.microsoft.com/office/drawing/2016/5/13/chartex" xmlns:cx8="http://schemas.microsoft.com/office/drawing/2016/5/14/chartex" xmlns:mc="http://schemas.openxmlformats.org/markup-compatibility/2006" xmlns:aink="http://schemas.microsoft.com/office/drawing/2016/ink" xmlns:am3d="http://schemas.microsoft.com/office/drawing/2017/model3d" xmlns:o="urn:schemas-microsoft-com:office:office" xmlns:oel="http://schemas.microsoft.com/office/2019/extlst" xmlns:r="http://schemas.openxmlformats.org/officeDocument/2006/relationships" xmlns:m="http://schemas.openxmlformats.org/officeDocument/2006/math" xmlns:v="urn:schemas-microsoft-com:vml" xmlns:wp14="http://schemas.microsoft.com/office/word/2010/wordprocessingDrawing" xmlns:wp="http://schemas.openxmlformats.org/drawingml/2006/wordprocessingDrawing" xmlns:w10="urn:schemas-microsoft-com:office:word" xmlns:w="http://schemas.openxmlformats.org/wordprocessingml/2006/main" xmlns:w14="http://schemas.microsoft.com/office/word/2010/wordml" xmlns:w15="http://schemas.microsoft.com/office/word/2012/wordml" xmlns:w16cex="http://schemas.microsoft.com/office/word/2018/wordml/cex" xmlns:w16cid="http://schemas.microsoft.com/office/word/2016/wordml/cid" xmlns:w16="http://schemas.microsoft.com/office/word/2018/wordml" xmlns:w16du="http://schemas.microsoft.com/office/word/2023/wordml/word16du" xmlns:w16sdtdh="http://schemas.microsoft.com/office/word/2020/wordml/sdtdatahash" xmlns:w16sdtfl="http://schemas.microsoft.com/office/word/2024/wordml/sdtformatlock" xmlns:w16se="http://schemas.microsoft.com/office/word/2015/wordml/symex" xmlns:wpg="http://schemas.microsoft.com/office/word/2010/wordprocessingGroup" xmlns:wpi="http://schemas.microsoft.com/office/word/2010/wordprocessingInk" xmlns:wne="http://schemas.microsoft.com/office/word/2006/wordml" xmlns:wps="http://schemas.microsoft.com/office/word/2010/wordprocessingShape" mc:Ignorable="w14 w15 w16se w16cid w16 w16cex w16sdtdh w16sdtfl w16du wp14">
   <w:p>
     <w:pPr>
@@ -15004,7 +15833,7 @@
 </w:hdr>
 </file>
 
-<file path=word/header8.xml><?xml version="1.0" encoding="utf-8"?>
+<file path=word/header9.xml><?xml version="1.0" encoding="utf-8"?>
 <w:hdr xmlns:wpc="http://schemas.microsoft.com/office/word/2010/wordprocessingCanvas" xmlns:cx="http://schemas.microsoft.com/office/drawing/2014/chartex" xmlns:cx1="http://schemas.microsoft.com/office/drawing/2015/9/8/chartex" xmlns:cx2="http://schemas.microsoft.com/office/drawing/2015/10/21/chartex" xmlns:cx3="http://schemas.microsoft.com/office/drawing/2016/5/9/chartex" xmlns:cx4="http://schemas.microsoft.com/office/drawing/2016/5/10/chartex" xmlns:cx5="http://schemas.microsoft.com/office/drawing/2016/5/11/chartex" xmlns:cx6="http://schemas.microsoft.com/office/drawing/2016/5/12/chartex" xmlns:cx7="http://schemas.microsoft.com/office/drawing/2016/5/13/chartex" xmlns:cx8="http://schemas.microsoft.com/office/drawing/2016/5/14/chartex" xmlns:mc="http://schemas.openxmlformats.org/markup-compatibility/2006" xmlns:aink="http://schemas.microsoft.com/office/drawing/2016/ink" xmlns:am3d="http://schemas.microsoft.com/office/drawing/2017/model3d" xmlns:o="urn:schemas-microsoft-com:office:office" xmlns:oel="http://schemas.microsoft.com/office/2019/extlst" xmlns:r="http://schemas.openxmlformats.org/officeDocument/2006/relationships" xmlns:m="http://schemas.openxmlformats.org/officeDocument/2006/math" xmlns:v="urn:schemas-microsoft-com:vml" xmlns:wp14="http://schemas.microsoft.com/office/word/2010/wordprocessingDrawing" xmlns:wp="http://schemas.openxmlformats.org/drawingml/2006/wordprocessingDrawing" xmlns:w10="urn:schemas-microsoft-com:office:word" xmlns:w="http://schemas.openxmlformats.org/wordprocessingml/2006/main" xmlns:w14="http://schemas.microsoft.com/office/word/2010/wordml" xmlns:w15="http://schemas.microsoft.com/office/word/2012/wordml" xmlns:w16cex="http://schemas.microsoft.com/office/word/2018/wordml/cex" xmlns:w16cid="http://schemas.microsoft.com/office/word/2016/wordml/cid" xmlns:w16="http://schemas.microsoft.com/office/word/2018/wordml" xmlns:w16du="http://schemas.microsoft.com/office/word/2023/wordml/word16du" xmlns:w16sdtdh="http://schemas.microsoft.com/office/word/2020/wordml/sdtdatahash" xmlns:w16sdtfl="http://schemas.microsoft.com/office/word/2024/wordml/sdtformatlock" xmlns:w16se="http://schemas.microsoft.com/office/word/2015/wordml/symex" xmlns:wpg="http://schemas.microsoft.com/office/word/2010/wordprocessingGroup" xmlns:wpi="http://schemas.microsoft.com/office/word/2010/wordprocessingInk" xmlns:wne="http://schemas.microsoft.com/office/word/2006/wordml" xmlns:wps="http://schemas.microsoft.com/office/word/2010/wordprocessingShape" mc:Ignorable="w14 w15 w16se w16cid w16 w16cex w16sdtdh w16sdtfl w16du wp14">
   <w:p>
     <w:pPr>
@@ -15033,25 +15862,6 @@
         <w:sz w:val="24"/>
       </w:rPr>
       <w:t>Chapter 3</w:t>
-    </w:r>
-  </w:p>
-</w:hdr>
-</file>
-
-<file path=word/header9.xml><?xml version="1.0" encoding="utf-8"?>
-<w:hdr xmlns:wpc="http://schemas.microsoft.com/office/word/2010/wordprocessingCanvas" xmlns:cx="http://schemas.microsoft.com/office/drawing/2014/chartex" xmlns:cx1="http://schemas.microsoft.com/office/drawing/2015/9/8/chartex" xmlns:cx2="http://schemas.microsoft.com/office/drawing/2015/10/21/chartex" xmlns:cx3="http://schemas.microsoft.com/office/drawing/2016/5/9/chartex" xmlns:cx4="http://schemas.microsoft.com/office/drawing/2016/5/10/chartex" xmlns:cx5="http://schemas.microsoft.com/office/drawing/2016/5/11/chartex" xmlns:cx6="http://schemas.microsoft.com/office/drawing/2016/5/12/chartex" xmlns:cx7="http://schemas.microsoft.com/office/drawing/2016/5/13/chartex" xmlns:cx8="http://schemas.microsoft.com/office/drawing/2016/5/14/chartex" xmlns:mc="http://schemas.openxmlformats.org/markup-compatibility/2006" xmlns:aink="http://schemas.microsoft.com/office/drawing/2016/ink" xmlns:am3d="http://schemas.microsoft.com/office/drawing/2017/model3d" xmlns:o="urn:schemas-microsoft-com:office:office" xmlns:oel="http://schemas.microsoft.com/office/2019/extlst" xmlns:r="http://schemas.openxmlformats.org/officeDocument/2006/relationships" xmlns:m="http://schemas.openxmlformats.org/officeDocument/2006/math" xmlns:v="urn:schemas-microsoft-com:vml" xmlns:wp14="http://schemas.microsoft.com/office/word/2010/wordprocessingDrawing" xmlns:wp="http://schemas.openxmlformats.org/drawingml/2006/wordprocessingDrawing" xmlns:w10="urn:schemas-microsoft-com:office:word" xmlns:w="http://schemas.openxmlformats.org/wordprocessingml/2006/main" xmlns:w14="http://schemas.microsoft.com/office/word/2010/wordml" xmlns:w15="http://schemas.microsoft.com/office/word/2012/wordml" xmlns:w16cex="http://schemas.microsoft.com/office/word/2018/wordml/cex" xmlns:w16cid="http://schemas.microsoft.com/office/word/2016/wordml/cid" xmlns:w16="http://schemas.microsoft.com/office/word/2018/wordml" xmlns:w16du="http://schemas.microsoft.com/office/word/2023/wordml/word16du" xmlns:w16sdtdh="http://schemas.microsoft.com/office/word/2020/wordml/sdtdatahash" xmlns:w16sdtfl="http://schemas.microsoft.com/office/word/2024/wordml/sdtformatlock" xmlns:w16se="http://schemas.microsoft.com/office/word/2015/wordml/symex" xmlns:wpg="http://schemas.microsoft.com/office/word/2010/wordprocessingGroup" xmlns:wpi="http://schemas.microsoft.com/office/word/2010/wordprocessingInk" xmlns:wne="http://schemas.microsoft.com/office/word/2006/wordml" xmlns:wps="http://schemas.microsoft.com/office/word/2010/wordprocessingShape" mc:Ignorable="w14 w15 w16se w16cid w16 w16cex w16sdtdh w16sdtfl w16du wp14">
-  <w:p>
-    <w:pPr>
-      <w:pStyle w:val="Header"/>
-      <w:jc w:val="center"/>
-    </w:pPr>
-    <w:r>
-      <w:rPr>
-        <w:b/>
-        <w:caps/>
-        <w:sz w:val="19"/>
-      </w:rPr>
-      <w:t>CHAINGUARD V2: A TAMPER-EVIDENT LAST-MILE LOGISTICS CONTROL PLANE</w:t>
     </w:r>
   </w:p>
 </w:hdr>
@@ -15230,31 +16040,31 @@
       </w:rPr>
     </w:lvl>
   </w:abstractNum>
-  <w:num w:numId="1" w16cid:durableId="1407726765">
+  <w:num w:numId="1" w16cid:durableId="321933408">
     <w:abstractNumId w:val="8"/>
   </w:num>
-  <w:num w:numId="2" w16cid:durableId="148640530">
+  <w:num w:numId="2" w16cid:durableId="919874283">
     <w:abstractNumId w:val="6"/>
   </w:num>
-  <w:num w:numId="3" w16cid:durableId="756905775">
+  <w:num w:numId="3" w16cid:durableId="1231769290">
     <w:abstractNumId w:val="5"/>
   </w:num>
-  <w:num w:numId="4" w16cid:durableId="770197619">
+  <w:num w:numId="4" w16cid:durableId="829374095">
     <w:abstractNumId w:val="4"/>
   </w:num>
-  <w:num w:numId="5" w16cid:durableId="2051298234">
+  <w:num w:numId="5" w16cid:durableId="340276521">
     <w:abstractNumId w:val="7"/>
   </w:num>
-  <w:num w:numId="6" w16cid:durableId="1061715079">
+  <w:num w:numId="6" w16cid:durableId="707992751">
     <w:abstractNumId w:val="3"/>
   </w:num>
-  <w:num w:numId="7" w16cid:durableId="773943125">
+  <w:num w:numId="7" w16cid:durableId="599799144">
     <w:abstractNumId w:val="2"/>
   </w:num>
-  <w:num w:numId="8" w16cid:durableId="675036851">
+  <w:num w:numId="8" w16cid:durableId="1091926024">
     <w:abstractNumId w:val="1"/>
   </w:num>
-  <w:num w:numId="9" w16cid:durableId="59985399">
+  <w:num w:numId="9" w16cid:durableId="959189128">
     <w:abstractNumId w:val="0"/>
   </w:num>
 </w:numbering>
@@ -26686,7 +27496,7 @@
     <w:autoRedefine/>
     <w:uiPriority w:val="39"/>
     <w:unhideWhenUsed/>
-    <w:rsid w:val="00485621"/>
+    <w:rsid w:val="007F2B56"/>
     <w:pPr>
       <w:spacing w:after="40" w:line="240" w:lineRule="auto"/>
     </w:pPr>
@@ -26702,7 +27512,7 @@
     <w:autoRedefine/>
     <w:uiPriority w:val="39"/>
     <w:unhideWhenUsed/>
-    <w:rsid w:val="00485621"/>
+    <w:rsid w:val="007F2B56"/>
     <w:pPr>
       <w:spacing w:after="40" w:line="240" w:lineRule="auto"/>
       <w:ind w:left="210"/>

</xml_diff>

<commit_message>
docs: single-student title pages and template-style LOF/LOT tables
Replace the three student entries with Vivek Rathod (B49) on the title page, certificate and acknowledgement. Restyle the List of Figures and List of Tables with full 0.75 pt grid borders, a shaded header row and template column widths, and match the TOC entry weight to the template.
</commit_message>
<xml_diff>
--- a/ChainGuard_v2_Technical_Seminar_Report.docx
+++ b/ChainGuard_v2_Technical_Seminar_Report.docx
@@ -45,7 +45,7 @@
                 <w:noProof/>
               </w:rPr>
               <w:drawing>
-                <wp:inline distT="0" distB="0" distL="0" distR="0" wp14:anchorId="0867CE22" wp14:editId="115BA2A8">
+                <wp:inline distT="0" distB="0" distL="0" distR="0" wp14:anchorId="761EEA93" wp14:editId="1B19F048">
                   <wp:extent cx="566928" cy="566928"/>
                   <wp:effectExtent l="0" t="0" r="0" b="0"/>
                   <wp:docPr id="1" name="Picture 1"/>
@@ -155,7 +155,7 @@
                 <w:noProof/>
               </w:rPr>
               <w:drawing>
-                <wp:inline distT="0" distB="0" distL="0" distR="0" wp14:anchorId="037BB245" wp14:editId="3B72AD20">
+                <wp:inline distT="0" distB="0" distL="0" distR="0" wp14:anchorId="4D23BCC4" wp14:editId="6F0D9766">
                   <wp:extent cx="530352" cy="590495"/>
                   <wp:effectExtent l="0" t="0" r="0" b="0"/>
                   <wp:docPr id="2" name="Picture 2"/>
@@ -260,7 +260,7 @@
     </w:p>
     <w:p>
       <w:pPr>
-        <w:spacing w:after="440" w:line="240" w:lineRule="auto"/>
+        <w:spacing w:after="600" w:line="240" w:lineRule="auto"/>
         <w:jc w:val="center"/>
       </w:pPr>
       <w:r>
@@ -285,7 +285,7 @@
     </w:p>
     <w:p>
       <w:pPr>
-        <w:spacing w:after="560" w:line="240" w:lineRule="auto"/>
+        <w:spacing w:after="720" w:line="240" w:lineRule="auto"/>
         <w:jc w:val="center"/>
       </w:pPr>
       <w:r>
@@ -298,7 +298,7 @@
     </w:p>
     <w:p>
       <w:pPr>
-        <w:spacing w:after="200" w:line="240" w:lineRule="auto"/>
+        <w:spacing w:after="280" w:line="240" w:lineRule="auto"/>
         <w:jc w:val="center"/>
       </w:pPr>
       <w:r>
@@ -397,7 +397,7 @@
               <w:rPr>
                 <w:sz w:val="22"/>
               </w:rPr>
-              <w:t>Ms. Pallavi Kokate</w:t>
+              <w:t>Vivek Rathod</w:t>
             </w:r>
           </w:p>
         </w:tc>
@@ -414,87 +414,7 @@
               <w:rPr>
                 <w:sz w:val="22"/>
               </w:rPr>
-              <w:t>B34</w:t>
-            </w:r>
-          </w:p>
-        </w:tc>
-      </w:tr>
-      <w:tr>
-        <w:trPr>
-          <w:cantSplit/>
-          <w:jc w:val="center"/>
-        </w:trPr>
-        <w:tc>
-          <w:tcPr>
-            <w:tcW w:w="3672" w:type="dxa"/>
-          </w:tcPr>
-          <w:p>
-            <w:pPr>
-              <w:spacing w:before="20" w:after="20" w:line="240" w:lineRule="auto"/>
-              <w:jc w:val="left"/>
-            </w:pPr>
-            <w:r>
-              <w:rPr>
-                <w:sz w:val="22"/>
-              </w:rPr>
-              <w:t>Mr. Anil Kewat</w:t>
-            </w:r>
-          </w:p>
-        </w:tc>
-        <w:tc>
-          <w:tcPr>
-            <w:tcW w:w="1656" w:type="dxa"/>
-          </w:tcPr>
-          <w:p>
-            <w:pPr>
-              <w:spacing w:before="20" w:after="20" w:line="240" w:lineRule="auto"/>
-              <w:jc w:val="left"/>
-            </w:pPr>
-            <w:r>
-              <w:rPr>
-                <w:sz w:val="22"/>
-              </w:rPr>
-              <w:t>B45</w:t>
-            </w:r>
-          </w:p>
-        </w:tc>
-      </w:tr>
-      <w:tr>
-        <w:trPr>
-          <w:cantSplit/>
-          <w:jc w:val="center"/>
-        </w:trPr>
-        <w:tc>
-          <w:tcPr>
-            <w:tcW w:w="3672" w:type="dxa"/>
-          </w:tcPr>
-          <w:p>
-            <w:pPr>
-              <w:spacing w:before="20" w:after="20" w:line="240" w:lineRule="auto"/>
-              <w:jc w:val="left"/>
-            </w:pPr>
-            <w:r>
-              <w:rPr>
-                <w:sz w:val="22"/>
-              </w:rPr>
-              <w:t>Ms. Nikita Sagar</w:t>
-            </w:r>
-          </w:p>
-        </w:tc>
-        <w:tc>
-          <w:tcPr>
-            <w:tcW w:w="1656" w:type="dxa"/>
-          </w:tcPr>
-          <w:p>
-            <w:pPr>
-              <w:spacing w:before="20" w:after="20" w:line="240" w:lineRule="auto"/>
-              <w:jc w:val="left"/>
-            </w:pPr>
-            <w:r>
-              <w:rPr>
-                <w:sz w:val="22"/>
-              </w:rPr>
-              <w:t>B50</w:t>
+              <w:t>B49</w:t>
             </w:r>
           </w:p>
         </w:tc>
@@ -507,7 +427,7 @@
     </w:p>
     <w:p>
       <w:pPr>
-        <w:spacing w:before="520" w:after="80" w:line="240" w:lineRule="auto"/>
+        <w:spacing w:before="880" w:after="80" w:line="240" w:lineRule="auto"/>
         <w:jc w:val="center"/>
       </w:pPr>
       <w:r>
@@ -520,7 +440,7 @@
     </w:p>
     <w:p>
       <w:pPr>
-        <w:spacing w:after="2000" w:line="240" w:lineRule="auto"/>
+        <w:spacing w:after="2120" w:line="240" w:lineRule="auto"/>
         <w:jc w:val="center"/>
       </w:pPr>
       <w:r>
@@ -618,7 +538,7 @@
               </w:rPr>
               <w:lastRenderedPageBreak/>
               <w:drawing>
-                <wp:inline distT="0" distB="0" distL="0" distR="0" wp14:anchorId="396876F9" wp14:editId="77A8F9D5">
+                <wp:inline distT="0" distB="0" distL="0" distR="0" wp14:anchorId="777608FB" wp14:editId="064378CD">
                   <wp:extent cx="566928" cy="566928"/>
                   <wp:effectExtent l="0" t="0" r="0" b="0"/>
                   <wp:docPr id="3" name="Picture 3"/>
@@ -728,7 +648,7 @@
                 <w:noProof/>
               </w:rPr>
               <w:drawing>
-                <wp:inline distT="0" distB="0" distL="0" distR="0" wp14:anchorId="2885563E" wp14:editId="1E4A57BA">
+                <wp:inline distT="0" distB="0" distL="0" distR="0" wp14:anchorId="657E0E70" wp14:editId="2FFCC0D8">
                   <wp:extent cx="530352" cy="590495"/>
                   <wp:effectExtent l="0" t="0" r="0" b="0"/>
                   <wp:docPr id="4" name="Picture 4"/>
@@ -789,6 +709,12 @@
           <w:sz w:val="17"/>
         </w:rPr>
         <w:tab/>
+      </w:r>
+      <w:r>
+        <w:rPr>
+          <w:b/>
+          <w:sz w:val="17"/>
+        </w:rPr>
         <w:t>Accredited by NAAC</w:t>
       </w:r>
       <w:r>
@@ -946,7 +872,7 @@
               <w:rPr>
                 <w:sz w:val="22"/>
               </w:rPr>
-              <w:t>Ms. Pallavi Kokate</w:t>
+              <w:t>Vivek Rathod</w:t>
             </w:r>
           </w:p>
         </w:tc>
@@ -963,87 +889,7 @@
               <w:rPr>
                 <w:sz w:val="22"/>
               </w:rPr>
-              <w:t>B34</w:t>
-            </w:r>
-          </w:p>
-        </w:tc>
-      </w:tr>
-      <w:tr>
-        <w:trPr>
-          <w:cantSplit/>
-          <w:jc w:val="center"/>
-        </w:trPr>
-        <w:tc>
-          <w:tcPr>
-            <w:tcW w:w="3672" w:type="dxa"/>
-          </w:tcPr>
-          <w:p>
-            <w:pPr>
-              <w:spacing w:before="20" w:after="20" w:line="240" w:lineRule="auto"/>
-              <w:jc w:val="left"/>
-            </w:pPr>
-            <w:r>
-              <w:rPr>
-                <w:sz w:val="22"/>
-              </w:rPr>
-              <w:t>Mr. Anil Kewat</w:t>
-            </w:r>
-          </w:p>
-        </w:tc>
-        <w:tc>
-          <w:tcPr>
-            <w:tcW w:w="1656" w:type="dxa"/>
-          </w:tcPr>
-          <w:p>
-            <w:pPr>
-              <w:spacing w:before="20" w:after="20" w:line="240" w:lineRule="auto"/>
-              <w:jc w:val="left"/>
-            </w:pPr>
-            <w:r>
-              <w:rPr>
-                <w:sz w:val="22"/>
-              </w:rPr>
-              <w:t>B45</w:t>
-            </w:r>
-          </w:p>
-        </w:tc>
-      </w:tr>
-      <w:tr>
-        <w:trPr>
-          <w:cantSplit/>
-          <w:jc w:val="center"/>
-        </w:trPr>
-        <w:tc>
-          <w:tcPr>
-            <w:tcW w:w="3672" w:type="dxa"/>
-          </w:tcPr>
-          <w:p>
-            <w:pPr>
-              <w:spacing w:before="20" w:after="20" w:line="240" w:lineRule="auto"/>
-              <w:jc w:val="left"/>
-            </w:pPr>
-            <w:r>
-              <w:rPr>
-                <w:sz w:val="22"/>
-              </w:rPr>
-              <w:t>Ms. Nikita Sagar</w:t>
-            </w:r>
-          </w:p>
-        </w:tc>
-        <w:tc>
-          <w:tcPr>
-            <w:tcW w:w="1656" w:type="dxa"/>
-          </w:tcPr>
-          <w:p>
-            <w:pPr>
-              <w:spacing w:before="20" w:after="20" w:line="240" w:lineRule="auto"/>
-              <w:jc w:val="left"/>
-            </w:pPr>
-            <w:r>
-              <w:rPr>
-                <w:sz w:val="22"/>
-              </w:rPr>
-              <w:t>B50</w:t>
+              <w:t>B49</w:t>
             </w:r>
           </w:p>
         </w:tc>
@@ -1078,7 +924,7 @@
     </w:p>
     <w:p>
       <w:pPr>
-        <w:spacing w:after="2360" w:line="240" w:lineRule="auto"/>
+        <w:spacing w:after="3000" w:line="240" w:lineRule="auto"/>
       </w:pPr>
     </w:p>
     <w:tbl>
@@ -1301,30 +1147,6 @@
     </w:p>
     <w:p>
       <w:pPr>
-        <w:spacing w:after="20" w:line="288" w:lineRule="auto"/>
-        <w:jc w:val="right"/>
-      </w:pPr>
-      <w:r>
-        <w:rPr>
-          <w:sz w:val="22"/>
-        </w:rPr>
-        <w:t>Pallavi Kokate (B34)</w:t>
-      </w:r>
-    </w:p>
-    <w:p>
-      <w:pPr>
-        <w:spacing w:after="20" w:line="288" w:lineRule="auto"/>
-        <w:jc w:val="right"/>
-      </w:pPr>
-      <w:r>
-        <w:rPr>
-          <w:sz w:val="22"/>
-        </w:rPr>
-        <w:t>Anil Kewat (B45)</w:t>
-      </w:r>
-    </w:p>
-    <w:p>
-      <w:pPr>
         <w:spacing w:line="288" w:lineRule="auto"/>
         <w:jc w:val="right"/>
       </w:pPr>
@@ -1332,7 +1154,7 @@
         <w:rPr>
           <w:sz w:val="22"/>
         </w:rPr>
-        <w:t>Nikita Sagar (B50)</w:t>
+        <w:t>Vivek Rathod (B49)</w:t>
       </w:r>
     </w:p>
     <w:p>
@@ -1434,7 +1256,6 @@
       </w:pPr>
       <w:r>
         <w:rPr>
-          <w:b/>
           <w:sz w:val="22"/>
         </w:rPr>
         <w:t>Certificate</w:t>
@@ -1447,34 +1268,29 @@
       </w:r>
       <w:r>
         <w:rPr>
-          <w:b/>
           <w:sz w:val="22"/>
         </w:rPr>
         <w:fldChar w:fldCharType="begin"/>
       </w:r>
       <w:r>
         <w:rPr>
-          <w:b/>
           <w:sz w:val="22"/>
         </w:rPr>
         <w:instrText xml:space="preserve"> PAGEREF bm_cert \h </w:instrText>
       </w:r>
       <w:r>
         <w:rPr>
-          <w:b/>
           <w:sz w:val="22"/>
         </w:rPr>
       </w:r>
       <w:r>
         <w:rPr>
-          <w:b/>
           <w:sz w:val="22"/>
         </w:rPr>
         <w:fldChar w:fldCharType="separate"/>
       </w:r>
       <w:r>
         <w:rPr>
-          <w:b/>
           <w:noProof/>
           <w:sz w:val="22"/>
         </w:rPr>
@@ -1482,7 +1298,6 @@
       </w:r>
       <w:r>
         <w:rPr>
-          <w:b/>
           <w:sz w:val="22"/>
         </w:rPr>
         <w:fldChar w:fldCharType="end"/>
@@ -1497,7 +1312,6 @@
       </w:pPr>
       <w:r>
         <w:rPr>
-          <w:b/>
           <w:sz w:val="22"/>
         </w:rPr>
         <w:t>Acknowledgement</w:t>
@@ -1510,34 +1324,29 @@
       </w:r>
       <w:r>
         <w:rPr>
-          <w:b/>
           <w:sz w:val="22"/>
         </w:rPr>
         <w:fldChar w:fldCharType="begin"/>
       </w:r>
       <w:r>
         <w:rPr>
-          <w:b/>
           <w:sz w:val="22"/>
         </w:rPr>
         <w:instrText xml:space="preserve"> PAGEREF bm_ack \h </w:instrText>
       </w:r>
       <w:r>
         <w:rPr>
-          <w:b/>
           <w:sz w:val="22"/>
         </w:rPr>
       </w:r>
       <w:r>
         <w:rPr>
-          <w:b/>
           <w:sz w:val="22"/>
         </w:rPr>
         <w:fldChar w:fldCharType="separate"/>
       </w:r>
       <w:r>
         <w:rPr>
-          <w:b/>
           <w:noProof/>
           <w:sz w:val="22"/>
         </w:rPr>
@@ -1545,7 +1354,6 @@
       </w:r>
       <w:r>
         <w:rPr>
-          <w:b/>
           <w:sz w:val="22"/>
         </w:rPr>
         <w:fldChar w:fldCharType="end"/>
@@ -1560,7 +1368,6 @@
       </w:pPr>
       <w:r>
         <w:rPr>
-          <w:b/>
           <w:sz w:val="22"/>
         </w:rPr>
         <w:t>Abstract</w:t>
@@ -1573,34 +1380,29 @@
       </w:r>
       <w:r>
         <w:rPr>
-          <w:b/>
           <w:sz w:val="22"/>
         </w:rPr>
         <w:fldChar w:fldCharType="begin"/>
       </w:r>
       <w:r>
         <w:rPr>
-          <w:b/>
           <w:sz w:val="22"/>
         </w:rPr>
         <w:instrText xml:space="preserve"> PAGEREF bm_abs \h </w:instrText>
       </w:r>
       <w:r>
         <w:rPr>
-          <w:b/>
           <w:sz w:val="22"/>
         </w:rPr>
       </w:r>
       <w:r>
         <w:rPr>
-          <w:b/>
           <w:sz w:val="22"/>
         </w:rPr>
         <w:fldChar w:fldCharType="separate"/>
       </w:r>
       <w:r>
         <w:rPr>
-          <w:b/>
           <w:noProof/>
           <w:sz w:val="22"/>
         </w:rPr>
@@ -1608,7 +1410,6 @@
       </w:r>
       <w:r>
         <w:rPr>
-          <w:b/>
           <w:sz w:val="22"/>
         </w:rPr>
         <w:fldChar w:fldCharType="end"/>
@@ -1623,7 +1424,6 @@
       </w:pPr>
       <w:r>
         <w:rPr>
-          <w:b/>
           <w:sz w:val="22"/>
         </w:rPr>
         <w:t>Table of Contents</w:t>
@@ -1636,34 +1436,29 @@
       </w:r>
       <w:r>
         <w:rPr>
-          <w:b/>
           <w:sz w:val="22"/>
         </w:rPr>
         <w:fldChar w:fldCharType="begin"/>
       </w:r>
       <w:r>
         <w:rPr>
-          <w:b/>
           <w:sz w:val="22"/>
         </w:rPr>
         <w:instrText xml:space="preserve"> PAGEREF bm_toc \h </w:instrText>
       </w:r>
       <w:r>
         <w:rPr>
-          <w:b/>
           <w:sz w:val="22"/>
         </w:rPr>
       </w:r>
       <w:r>
         <w:rPr>
-          <w:b/>
           <w:sz w:val="22"/>
         </w:rPr>
         <w:fldChar w:fldCharType="separate"/>
       </w:r>
       <w:r>
         <w:rPr>
-          <w:b/>
           <w:noProof/>
           <w:sz w:val="22"/>
         </w:rPr>
@@ -1671,7 +1466,6 @@
       </w:r>
       <w:r>
         <w:rPr>
-          <w:b/>
           <w:sz w:val="22"/>
         </w:rPr>
         <w:fldChar w:fldCharType="end"/>
@@ -1686,7 +1480,6 @@
       </w:pPr>
       <w:r>
         <w:rPr>
-          <w:b/>
           <w:sz w:val="22"/>
         </w:rPr>
         <w:t>List of Figures</w:t>
@@ -1699,34 +1492,29 @@
       </w:r>
       <w:r>
         <w:rPr>
-          <w:b/>
           <w:sz w:val="22"/>
         </w:rPr>
         <w:fldChar w:fldCharType="begin"/>
       </w:r>
       <w:r>
         <w:rPr>
-          <w:b/>
           <w:sz w:val="22"/>
         </w:rPr>
         <w:instrText xml:space="preserve"> PAGEREF bm_lof \h </w:instrText>
       </w:r>
       <w:r>
         <w:rPr>
-          <w:b/>
           <w:sz w:val="22"/>
         </w:rPr>
       </w:r>
       <w:r>
         <w:rPr>
-          <w:b/>
           <w:sz w:val="22"/>
         </w:rPr>
         <w:fldChar w:fldCharType="separate"/>
       </w:r>
       <w:r>
         <w:rPr>
-          <w:b/>
           <w:noProof/>
           <w:sz w:val="22"/>
         </w:rPr>
@@ -1734,7 +1522,6 @@
       </w:r>
       <w:r>
         <w:rPr>
-          <w:b/>
           <w:sz w:val="22"/>
         </w:rPr>
         <w:fldChar w:fldCharType="end"/>
@@ -1749,7 +1536,6 @@
       </w:pPr>
       <w:r>
         <w:rPr>
-          <w:b/>
           <w:sz w:val="22"/>
         </w:rPr>
         <w:t>List of Tables</w:t>
@@ -1762,34 +1548,29 @@
       </w:r>
       <w:r>
         <w:rPr>
-          <w:b/>
           <w:sz w:val="22"/>
         </w:rPr>
         <w:fldChar w:fldCharType="begin"/>
       </w:r>
       <w:r>
         <w:rPr>
-          <w:b/>
           <w:sz w:val="22"/>
         </w:rPr>
         <w:instrText xml:space="preserve"> PAGEREF bm_lot \h </w:instrText>
       </w:r>
       <w:r>
         <w:rPr>
-          <w:b/>
           <w:sz w:val="22"/>
         </w:rPr>
       </w:r>
       <w:r>
         <w:rPr>
-          <w:b/>
           <w:sz w:val="22"/>
         </w:rPr>
         <w:fldChar w:fldCharType="separate"/>
       </w:r>
       <w:r>
         <w:rPr>
-          <w:b/>
           <w:noProof/>
           <w:sz w:val="22"/>
         </w:rPr>
@@ -1797,7 +1578,6 @@
       </w:r>
       <w:r>
         <w:rPr>
-          <w:b/>
           <w:sz w:val="22"/>
         </w:rPr>
         <w:fldChar w:fldCharType="end"/>
@@ -1812,7 +1592,6 @@
       </w:pPr>
       <w:r>
         <w:rPr>
-          <w:b/>
           <w:sz w:val="22"/>
         </w:rPr>
         <w:t>List of Abbreviations</w:t>
@@ -1825,34 +1604,29 @@
       </w:r>
       <w:r>
         <w:rPr>
-          <w:b/>
           <w:sz w:val="22"/>
         </w:rPr>
         <w:fldChar w:fldCharType="begin"/>
       </w:r>
       <w:r>
         <w:rPr>
-          <w:b/>
           <w:sz w:val="22"/>
         </w:rPr>
         <w:instrText xml:space="preserve"> PAGEREF bm_abbr \h </w:instrText>
       </w:r>
       <w:r>
         <w:rPr>
-          <w:b/>
           <w:sz w:val="22"/>
         </w:rPr>
       </w:r>
       <w:r>
         <w:rPr>
-          <w:b/>
           <w:sz w:val="22"/>
         </w:rPr>
         <w:fldChar w:fldCharType="separate"/>
       </w:r>
       <w:r>
         <w:rPr>
-          <w:b/>
           <w:noProof/>
           <w:sz w:val="22"/>
         </w:rPr>
@@ -1860,7 +1634,6 @@
       </w:r>
       <w:r>
         <w:rPr>
-          <w:b/>
           <w:sz w:val="22"/>
         </w:rPr>
         <w:fldChar w:fldCharType="end"/>
@@ -1922,7 +1695,7 @@
           <w:noProof/>
           <w:webHidden/>
         </w:rPr>
-        <w:instrText xml:space="preserve"> PAGEREF _Toc244293347 \h </w:instrText>
+        <w:instrText xml:space="preserve"> PAGEREF _Toc244294010 \h </w:instrText>
       </w:r>
       <w:r>
         <w:rPr>
@@ -1994,7 +1767,7 @@
           <w:noProof/>
           <w:webHidden/>
         </w:rPr>
-        <w:instrText xml:space="preserve"> PAGEREF _Toc244293348 \h </w:instrText>
+        <w:instrText xml:space="preserve"> PAGEREF _Toc244294011 \h </w:instrText>
       </w:r>
       <w:r>
         <w:rPr>
@@ -2066,7 +1839,7 @@
           <w:noProof/>
           <w:webHidden/>
         </w:rPr>
-        <w:instrText xml:space="preserve"> PAGEREF _Toc244293349 \h </w:instrText>
+        <w:instrText xml:space="preserve"> PAGEREF _Toc244294012 \h </w:instrText>
       </w:r>
       <w:r>
         <w:rPr>
@@ -2138,7 +1911,7 @@
           <w:noProof/>
           <w:webHidden/>
         </w:rPr>
-        <w:instrText xml:space="preserve"> PAGEREF _Toc244293350 \h </w:instrText>
+        <w:instrText xml:space="preserve"> PAGEREF _Toc244294013 \h </w:instrText>
       </w:r>
       <w:r>
         <w:rPr>
@@ -2210,7 +1983,7 @@
           <w:noProof/>
           <w:webHidden/>
         </w:rPr>
-        <w:instrText xml:space="preserve"> PAGEREF _Toc244293351 \h </w:instrText>
+        <w:instrText xml:space="preserve"> PAGEREF _Toc244294014 \h </w:instrText>
       </w:r>
       <w:r>
         <w:rPr>
@@ -2282,7 +2055,7 @@
           <w:noProof/>
           <w:webHidden/>
         </w:rPr>
-        <w:instrText xml:space="preserve"> PAGEREF _Toc244293352 \h </w:instrText>
+        <w:instrText xml:space="preserve"> PAGEREF _Toc244294015 \h </w:instrText>
       </w:r>
       <w:r>
         <w:rPr>
@@ -2354,7 +2127,7 @@
           <w:noProof/>
           <w:webHidden/>
         </w:rPr>
-        <w:instrText xml:space="preserve"> PAGEREF _Toc244293353 \h </w:instrText>
+        <w:instrText xml:space="preserve"> PAGEREF _Toc244294016 \h </w:instrText>
       </w:r>
       <w:r>
         <w:rPr>
@@ -2426,7 +2199,7 @@
           <w:noProof/>
           <w:webHidden/>
         </w:rPr>
-        <w:instrText xml:space="preserve"> PAGEREF _Toc244293354 \h </w:instrText>
+        <w:instrText xml:space="preserve"> PAGEREF _Toc244294017 \h </w:instrText>
       </w:r>
       <w:r>
         <w:rPr>
@@ -2498,7 +2271,7 @@
           <w:noProof/>
           <w:webHidden/>
         </w:rPr>
-        <w:instrText xml:space="preserve"> PAGEREF _Toc244293355 \h </w:instrText>
+        <w:instrText xml:space="preserve"> PAGEREF _Toc244294018 \h </w:instrText>
       </w:r>
       <w:r>
         <w:rPr>
@@ -2570,7 +2343,7 @@
           <w:noProof/>
           <w:webHidden/>
         </w:rPr>
-        <w:instrText xml:space="preserve"> PAGEREF _Toc244293356 \h </w:instrText>
+        <w:instrText xml:space="preserve"> PAGEREF _Toc244294019 \h </w:instrText>
       </w:r>
       <w:r>
         <w:rPr>
@@ -2642,7 +2415,7 @@
           <w:noProof/>
           <w:webHidden/>
         </w:rPr>
-        <w:instrText xml:space="preserve"> PAGEREF _Toc244293357 \h </w:instrText>
+        <w:instrText xml:space="preserve"> PAGEREF _Toc244294020 \h </w:instrText>
       </w:r>
       <w:r>
         <w:rPr>
@@ -2714,7 +2487,7 @@
           <w:noProof/>
           <w:webHidden/>
         </w:rPr>
-        <w:instrText xml:space="preserve"> PAGEREF _Toc244293358 \h </w:instrText>
+        <w:instrText xml:space="preserve"> PAGEREF _Toc244294021 \h </w:instrText>
       </w:r>
       <w:r>
         <w:rPr>
@@ -2786,7 +2559,7 @@
           <w:noProof/>
           <w:webHidden/>
         </w:rPr>
-        <w:instrText xml:space="preserve"> PAGEREF _Toc244293359 \h </w:instrText>
+        <w:instrText xml:space="preserve"> PAGEREF _Toc244294022 \h </w:instrText>
       </w:r>
       <w:r>
         <w:rPr>
@@ -2858,7 +2631,7 @@
           <w:noProof/>
           <w:webHidden/>
         </w:rPr>
-        <w:instrText xml:space="preserve"> PAGEREF _Toc244293360 \h </w:instrText>
+        <w:instrText xml:space="preserve"> PAGEREF _Toc244294023 \h </w:instrText>
       </w:r>
       <w:r>
         <w:rPr>
@@ -2930,7 +2703,7 @@
           <w:noProof/>
           <w:webHidden/>
         </w:rPr>
-        <w:instrText xml:space="preserve"> PAGEREF _Toc244293361 \h </w:instrText>
+        <w:instrText xml:space="preserve"> PAGEREF _Toc244294024 \h </w:instrText>
       </w:r>
       <w:r>
         <w:rPr>
@@ -3002,7 +2775,7 @@
           <w:noProof/>
           <w:webHidden/>
         </w:rPr>
-        <w:instrText xml:space="preserve"> PAGEREF _Toc244293362 \h </w:instrText>
+        <w:instrText xml:space="preserve"> PAGEREF _Toc244294025 \h </w:instrText>
       </w:r>
       <w:r>
         <w:rPr>
@@ -3074,7 +2847,7 @@
           <w:noProof/>
           <w:webHidden/>
         </w:rPr>
-        <w:instrText xml:space="preserve"> PAGEREF _Toc244293363 \h </w:instrText>
+        <w:instrText xml:space="preserve"> PAGEREF _Toc244294026 \h </w:instrText>
       </w:r>
       <w:r>
         <w:rPr>
@@ -3146,7 +2919,7 @@
           <w:noProof/>
           <w:webHidden/>
         </w:rPr>
-        <w:instrText xml:space="preserve"> PAGEREF _Toc244293364 \h </w:instrText>
+        <w:instrText xml:space="preserve"> PAGEREF _Toc244294027 \h </w:instrText>
       </w:r>
       <w:r>
         <w:rPr>
@@ -3218,7 +2991,7 @@
           <w:noProof/>
           <w:webHidden/>
         </w:rPr>
-        <w:instrText xml:space="preserve"> PAGEREF _Toc244293365 \h </w:instrText>
+        <w:instrText xml:space="preserve"> PAGEREF _Toc244294028 \h </w:instrText>
       </w:r>
       <w:r>
         <w:rPr>
@@ -3290,7 +3063,7 @@
           <w:noProof/>
           <w:webHidden/>
         </w:rPr>
-        <w:instrText xml:space="preserve"> PAGEREF _Toc244293366 \h </w:instrText>
+        <w:instrText xml:space="preserve"> PAGEREF _Toc244294029 \h </w:instrText>
       </w:r>
       <w:r>
         <w:rPr>
@@ -3362,7 +3135,7 @@
           <w:noProof/>
           <w:webHidden/>
         </w:rPr>
-        <w:instrText xml:space="preserve"> PAGEREF _Toc244293367 \h </w:instrText>
+        <w:instrText xml:space="preserve"> PAGEREF _Toc244294030 \h </w:instrText>
       </w:r>
       <w:r>
         <w:rPr>
@@ -3434,7 +3207,7 @@
           <w:noProof/>
           <w:webHidden/>
         </w:rPr>
-        <w:instrText xml:space="preserve"> PAGEREF _Toc244293368 \h </w:instrText>
+        <w:instrText xml:space="preserve"> PAGEREF _Toc244294031 \h </w:instrText>
       </w:r>
       <w:r>
         <w:rPr>
@@ -3506,7 +3279,7 @@
           <w:noProof/>
           <w:webHidden/>
         </w:rPr>
-        <w:instrText xml:space="preserve"> PAGEREF _Toc244293369 \h </w:instrText>
+        <w:instrText xml:space="preserve"> PAGEREF _Toc244294032 \h </w:instrText>
       </w:r>
       <w:r>
         <w:rPr>
@@ -3578,7 +3351,7 @@
           <w:noProof/>
           <w:webHidden/>
         </w:rPr>
-        <w:instrText xml:space="preserve"> PAGEREF _Toc244293370 \h </w:instrText>
+        <w:instrText xml:space="preserve"> PAGEREF _Toc244294033 \h </w:instrText>
       </w:r>
       <w:r>
         <w:rPr>
@@ -3650,7 +3423,7 @@
           <w:noProof/>
           <w:webHidden/>
         </w:rPr>
-        <w:instrText xml:space="preserve"> PAGEREF _Toc244293371 \h </w:instrText>
+        <w:instrText xml:space="preserve"> PAGEREF _Toc244294034 \h </w:instrText>
       </w:r>
       <w:r>
         <w:rPr>
@@ -3722,7 +3495,7 @@
           <w:noProof/>
           <w:webHidden/>
         </w:rPr>
-        <w:instrText xml:space="preserve"> PAGEREF _Toc244293372 \h </w:instrText>
+        <w:instrText xml:space="preserve"> PAGEREF _Toc244294035 \h </w:instrText>
       </w:r>
       <w:r>
         <w:rPr>
@@ -3794,7 +3567,7 @@
           <w:noProof/>
           <w:webHidden/>
         </w:rPr>
-        <w:instrText xml:space="preserve"> PAGEREF _Toc244293373 \h </w:instrText>
+        <w:instrText xml:space="preserve"> PAGEREF _Toc244294036 \h </w:instrText>
       </w:r>
       <w:r>
         <w:rPr>
@@ -3867,7 +3640,7 @@
           <w:noProof/>
           <w:webHidden/>
         </w:rPr>
-        <w:instrText xml:space="preserve"> PAGEREF _Toc244293374 \h </w:instrText>
+        <w:instrText xml:space="preserve"> PAGEREF _Toc244294037 \h </w:instrText>
       </w:r>
       <w:r>
         <w:rPr>
@@ -3931,44 +3704,46 @@
         <w:tblW w:w="0" w:type="auto"/>
         <w:jc w:val="center"/>
         <w:tblBorders>
-          <w:top w:val="nil"/>
-          <w:left w:val="nil"/>
-          <w:bottom w:val="nil"/>
-          <w:right w:val="nil"/>
-          <w:insideH w:val="nil"/>
-          <w:insideV w:val="nil"/>
+          <w:top w:val="single" w:sz="6" w:space="0" w:color="000000"/>
+          <w:left w:val="single" w:sz="6" w:space="0" w:color="000000"/>
+          <w:bottom w:val="single" w:sz="6" w:space="0" w:color="000000"/>
+          <w:right w:val="single" w:sz="6" w:space="0" w:color="000000"/>
+          <w:insideH w:val="single" w:sz="6" w:space="0" w:color="000000"/>
+          <w:insideV w:val="single" w:sz="6" w:space="0" w:color="000000"/>
         </w:tblBorders>
         <w:tblLayout w:type="fixed"/>
         <w:tblCellMar>
-          <w:top w:w="43" w:type="dxa"/>
-          <w:left w:w="57" w:type="dxa"/>
-          <w:bottom w:w="43" w:type="dxa"/>
-          <w:right w:w="57" w:type="dxa"/>
+          <w:left w:w="115" w:type="dxa"/>
+          <w:right w:w="115" w:type="dxa"/>
         </w:tblCellMar>
         <w:tblLook w:val="04A0" w:firstRow="1" w:lastRow="0" w:firstColumn="1" w:lastColumn="0" w:noHBand="0" w:noVBand="1"/>
       </w:tblPr>
       <w:tblGrid>
-        <w:gridCol w:w="1656"/>
-        <w:gridCol w:w="5400"/>
-        <w:gridCol w:w="1152"/>
+        <w:gridCol w:w="1584"/>
+        <w:gridCol w:w="5112"/>
+        <w:gridCol w:w="1512"/>
       </w:tblGrid>
       <w:tr>
         <w:trPr>
+          <w:cantSplit/>
+          <w:trHeight w:val="500"/>
           <w:jc w:val="center"/>
         </w:trPr>
         <w:tc>
           <w:tcPr>
-            <w:tcW w:w="1656" w:type="dxa"/>
-          </w:tcPr>
-          <w:p>
-            <w:pPr>
-              <w:spacing w:before="40" w:after="80"/>
-              <w:jc w:val="left"/>
+            <w:tcW w:w="1584" w:type="dxa"/>
+            <w:shd w:val="clear" w:color="auto" w:fill="DDEBF7"/>
+            <w:vAlign w:val="center"/>
+          </w:tcPr>
+          <w:p>
+            <w:pPr>
+              <w:spacing w:after="0" w:line="240" w:lineRule="auto"/>
+              <w:jc w:val="center"/>
             </w:pPr>
             <w:r>
               <w:rPr>
                 <w:b/>
-                <w:sz w:val="24"/>
+                <w:sz w:val="26"/>
               </w:rPr>
               <w:t>Figure No</w:t>
             </w:r>
@@ -3976,17 +3751,19 @@
         </w:tc>
         <w:tc>
           <w:tcPr>
-            <w:tcW w:w="5400" w:type="dxa"/>
-          </w:tcPr>
-          <w:p>
-            <w:pPr>
-              <w:spacing w:before="40" w:after="80"/>
-              <w:jc w:val="left"/>
+            <w:tcW w:w="5112" w:type="dxa"/>
+            <w:shd w:val="clear" w:color="auto" w:fill="DDEBF7"/>
+            <w:vAlign w:val="center"/>
+          </w:tcPr>
+          <w:p>
+            <w:pPr>
+              <w:spacing w:after="0" w:line="240" w:lineRule="auto"/>
+              <w:jc w:val="center"/>
             </w:pPr>
             <w:r>
               <w:rPr>
                 <w:b/>
-                <w:sz w:val="24"/>
+                <w:sz w:val="26"/>
               </w:rPr>
               <w:t>Name</w:t>
             </w:r>
@@ -3994,17 +3771,19 @@
         </w:tc>
         <w:tc>
           <w:tcPr>
-            <w:tcW w:w="1152" w:type="dxa"/>
-          </w:tcPr>
-          <w:p>
-            <w:pPr>
-              <w:spacing w:before="40" w:after="80"/>
-              <w:jc w:val="left"/>
+            <w:tcW w:w="1512" w:type="dxa"/>
+            <w:shd w:val="clear" w:color="auto" w:fill="DDEBF7"/>
+            <w:vAlign w:val="center"/>
+          </w:tcPr>
+          <w:p>
+            <w:pPr>
+              <w:spacing w:after="0" w:line="240" w:lineRule="auto"/>
+              <w:jc w:val="center"/>
             </w:pPr>
             <w:r>
               <w:rPr>
                 <w:b/>
-                <w:sz w:val="24"/>
+                <w:sz w:val="26"/>
               </w:rPr>
               <w:t>Page no</w:t>
             </w:r>
@@ -4014,61 +3793,89 @@
       <w:tr>
         <w:trPr>
           <w:cantSplit/>
+          <w:trHeight w:val="460"/>
           <w:jc w:val="center"/>
         </w:trPr>
         <w:tc>
           <w:tcPr>
-            <w:tcW w:w="1656" w:type="dxa"/>
-          </w:tcPr>
-          <w:p>
-            <w:pPr>
-              <w:spacing w:before="20" w:after="20" w:line="240" w:lineRule="auto"/>
+            <w:tcW w:w="1584" w:type="dxa"/>
+            <w:vAlign w:val="center"/>
+          </w:tcPr>
+          <w:p>
+            <w:pPr>
+              <w:spacing w:after="0" w:line="240" w:lineRule="auto"/>
               <w:jc w:val="left"/>
             </w:pPr>
             <w:r>
+              <w:rPr>
+                <w:sz w:val="22"/>
+              </w:rPr>
               <w:t>Figure 3.1</w:t>
             </w:r>
           </w:p>
         </w:tc>
         <w:tc>
           <w:tcPr>
-            <w:tcW w:w="5400" w:type="dxa"/>
-          </w:tcPr>
-          <w:p>
-            <w:pPr>
-              <w:spacing w:before="20" w:after="20" w:line="240" w:lineRule="auto"/>
+            <w:tcW w:w="5112" w:type="dxa"/>
+            <w:vAlign w:val="center"/>
+          </w:tcPr>
+          <w:p>
+            <w:pPr>
+              <w:spacing w:after="0" w:line="240" w:lineRule="auto"/>
               <w:jc w:val="left"/>
             </w:pPr>
             <w:r>
+              <w:rPr>
+                <w:sz w:val="22"/>
+              </w:rPr>
               <w:t>Four-plane architecture of the ChainGuard v2 control plane</w:t>
             </w:r>
           </w:p>
         </w:tc>
         <w:tc>
           <w:tcPr>
-            <w:tcW w:w="1152" w:type="dxa"/>
-          </w:tcPr>
-          <w:p>
-            <w:pPr>
-              <w:spacing w:before="20" w:after="20"/>
-              <w:jc w:val="left"/>
-            </w:pPr>
-            <w:r>
+            <w:tcW w:w="1512" w:type="dxa"/>
+            <w:vAlign w:val="center"/>
+          </w:tcPr>
+          <w:p>
+            <w:pPr>
+              <w:spacing w:after="0" w:line="240" w:lineRule="auto"/>
+              <w:jc w:val="center"/>
+            </w:pPr>
+            <w:r>
+              <w:rPr>
+                <w:sz w:val="22"/>
+              </w:rPr>
               <w:fldChar w:fldCharType="begin"/>
             </w:r>
             <w:r>
+              <w:rPr>
+                <w:sz w:val="22"/>
+              </w:rPr>
               <w:instrText xml:space="preserve"> PAGEREF fig_3_1 \h </w:instrText>
             </w:r>
             <w:r>
+              <w:rPr>
+                <w:sz w:val="22"/>
+              </w:rPr>
+            </w:r>
+            <w:r>
+              <w:rPr>
+                <w:sz w:val="22"/>
+              </w:rPr>
               <w:fldChar w:fldCharType="separate"/>
             </w:r>
             <w:r>
               <w:rPr>
                 <w:noProof/>
+                <w:sz w:val="22"/>
               </w:rPr>
               <w:t>5</w:t>
             </w:r>
             <w:r>
+              <w:rPr>
+                <w:sz w:val="22"/>
+              </w:rPr>
               <w:fldChar w:fldCharType="end"/>
             </w:r>
           </w:p>
@@ -4077,61 +3884,89 @@
       <w:tr>
         <w:trPr>
           <w:cantSplit/>
+          <w:trHeight w:val="460"/>
           <w:jc w:val="center"/>
         </w:trPr>
         <w:tc>
           <w:tcPr>
-            <w:tcW w:w="1656" w:type="dxa"/>
-          </w:tcPr>
-          <w:p>
-            <w:pPr>
-              <w:spacing w:before="20" w:after="20" w:line="240" w:lineRule="auto"/>
+            <w:tcW w:w="1584" w:type="dxa"/>
+            <w:vAlign w:val="center"/>
+          </w:tcPr>
+          <w:p>
+            <w:pPr>
+              <w:spacing w:after="0" w:line="240" w:lineRule="auto"/>
               <w:jc w:val="left"/>
             </w:pPr>
             <w:r>
+              <w:rPr>
+                <w:sz w:val="22"/>
+              </w:rPr>
               <w:t>Figure 3.2</w:t>
             </w:r>
           </w:p>
         </w:tc>
         <w:tc>
           <w:tcPr>
-            <w:tcW w:w="5400" w:type="dxa"/>
-          </w:tcPr>
-          <w:p>
-            <w:pPr>
-              <w:spacing w:before="20" w:after="20" w:line="240" w:lineRule="auto"/>
+            <w:tcW w:w="5112" w:type="dxa"/>
+            <w:vAlign w:val="center"/>
+          </w:tcPr>
+          <w:p>
+            <w:pPr>
+              <w:spacing w:after="0" w:line="240" w:lineRule="auto"/>
               <w:jc w:val="left"/>
             </w:pPr>
             <w:r>
+              <w:rPr>
+                <w:sz w:val="22"/>
+              </w:rPr>
               <w:t>Custody lifecycle state machine, guarded transitions and settlement branches</w:t>
             </w:r>
           </w:p>
         </w:tc>
         <w:tc>
           <w:tcPr>
-            <w:tcW w:w="1152" w:type="dxa"/>
-          </w:tcPr>
-          <w:p>
-            <w:pPr>
-              <w:spacing w:before="20" w:after="20"/>
-              <w:jc w:val="left"/>
-            </w:pPr>
-            <w:r>
+            <w:tcW w:w="1512" w:type="dxa"/>
+            <w:vAlign w:val="center"/>
+          </w:tcPr>
+          <w:p>
+            <w:pPr>
+              <w:spacing w:after="0" w:line="240" w:lineRule="auto"/>
+              <w:jc w:val="center"/>
+            </w:pPr>
+            <w:r>
+              <w:rPr>
+                <w:sz w:val="22"/>
+              </w:rPr>
               <w:fldChar w:fldCharType="begin"/>
             </w:r>
             <w:r>
+              <w:rPr>
+                <w:sz w:val="22"/>
+              </w:rPr>
               <w:instrText xml:space="preserve"> PAGEREF fig_3_2 \h </w:instrText>
             </w:r>
             <w:r>
+              <w:rPr>
+                <w:sz w:val="22"/>
+              </w:rPr>
+            </w:r>
+            <w:r>
+              <w:rPr>
+                <w:sz w:val="22"/>
+              </w:rPr>
               <w:fldChar w:fldCharType="separate"/>
             </w:r>
             <w:r>
               <w:rPr>
                 <w:noProof/>
+                <w:sz w:val="22"/>
               </w:rPr>
               <w:t>6</w:t>
             </w:r>
             <w:r>
+              <w:rPr>
+                <w:sz w:val="22"/>
+              </w:rPr>
               <w:fldChar w:fldCharType="end"/>
             </w:r>
           </w:p>
@@ -4140,61 +3975,89 @@
       <w:tr>
         <w:trPr>
           <w:cantSplit/>
+          <w:trHeight w:val="460"/>
           <w:jc w:val="center"/>
         </w:trPr>
         <w:tc>
           <w:tcPr>
-            <w:tcW w:w="1656" w:type="dxa"/>
-          </w:tcPr>
-          <w:p>
-            <w:pPr>
-              <w:spacing w:before="20" w:after="20" w:line="240" w:lineRule="auto"/>
+            <w:tcW w:w="1584" w:type="dxa"/>
+            <w:vAlign w:val="center"/>
+          </w:tcPr>
+          <w:p>
+            <w:pPr>
+              <w:spacing w:after="0" w:line="240" w:lineRule="auto"/>
               <w:jc w:val="left"/>
             </w:pPr>
             <w:r>
+              <w:rPr>
+                <w:sz w:val="22"/>
+              </w:rPr>
               <w:t>Figure 4.1</w:t>
             </w:r>
           </w:p>
         </w:tc>
         <w:tc>
           <w:tcPr>
-            <w:tcW w:w="5400" w:type="dxa"/>
-          </w:tcPr>
-          <w:p>
-            <w:pPr>
-              <w:spacing w:before="20" w:after="20" w:line="240" w:lineRule="auto"/>
+            <w:tcW w:w="5112" w:type="dxa"/>
+            <w:vAlign w:val="center"/>
+          </w:tcPr>
+          <w:p>
+            <w:pPr>
+              <w:spacing w:after="0" w:line="240" w:lineRule="auto"/>
               <w:jc w:val="left"/>
             </w:pPr>
             <w:r>
+              <w:rPr>
+                <w:sz w:val="22"/>
+              </w:rPr>
               <w:t>End-to-end operational workflow across the four role portals</w:t>
             </w:r>
           </w:p>
         </w:tc>
         <w:tc>
           <w:tcPr>
-            <w:tcW w:w="1152" w:type="dxa"/>
-          </w:tcPr>
-          <w:p>
-            <w:pPr>
-              <w:spacing w:before="20" w:after="20"/>
-              <w:jc w:val="left"/>
-            </w:pPr>
-            <w:r>
+            <w:tcW w:w="1512" w:type="dxa"/>
+            <w:vAlign w:val="center"/>
+          </w:tcPr>
+          <w:p>
+            <w:pPr>
+              <w:spacing w:after="0" w:line="240" w:lineRule="auto"/>
+              <w:jc w:val="center"/>
+            </w:pPr>
+            <w:r>
+              <w:rPr>
+                <w:sz w:val="22"/>
+              </w:rPr>
               <w:fldChar w:fldCharType="begin"/>
             </w:r>
             <w:r>
+              <w:rPr>
+                <w:sz w:val="22"/>
+              </w:rPr>
               <w:instrText xml:space="preserve"> PAGEREF fig_4_1 \h </w:instrText>
             </w:r>
             <w:r>
+              <w:rPr>
+                <w:sz w:val="22"/>
+              </w:rPr>
+            </w:r>
+            <w:r>
+              <w:rPr>
+                <w:sz w:val="22"/>
+              </w:rPr>
               <w:fldChar w:fldCharType="separate"/>
             </w:r>
             <w:r>
               <w:rPr>
                 <w:noProof/>
+                <w:sz w:val="22"/>
               </w:rPr>
               <w:t>8</w:t>
             </w:r>
             <w:r>
+              <w:rPr>
+                <w:sz w:val="22"/>
+              </w:rPr>
               <w:fldChar w:fldCharType="end"/>
             </w:r>
           </w:p>
@@ -4203,61 +4066,89 @@
       <w:tr>
         <w:trPr>
           <w:cantSplit/>
+          <w:trHeight w:val="460"/>
           <w:jc w:val="center"/>
         </w:trPr>
         <w:tc>
           <w:tcPr>
-            <w:tcW w:w="1656" w:type="dxa"/>
-          </w:tcPr>
-          <w:p>
-            <w:pPr>
-              <w:spacing w:before="20" w:after="20" w:line="240" w:lineRule="auto"/>
+            <w:tcW w:w="1584" w:type="dxa"/>
+            <w:vAlign w:val="center"/>
+          </w:tcPr>
+          <w:p>
+            <w:pPr>
+              <w:spacing w:after="0" w:line="240" w:lineRule="auto"/>
               <w:jc w:val="left"/>
             </w:pPr>
             <w:r>
+              <w:rPr>
+                <w:sz w:val="22"/>
+              </w:rPr>
               <w:t>Figure 4.2</w:t>
             </w:r>
           </w:p>
         </w:tc>
         <w:tc>
           <w:tcPr>
-            <w:tcW w:w="5400" w:type="dxa"/>
-          </w:tcPr>
-          <w:p>
-            <w:pPr>
-              <w:spacing w:before="20" w:after="20" w:line="240" w:lineRule="auto"/>
+            <w:tcW w:w="5112" w:type="dxa"/>
+            <w:vAlign w:val="center"/>
+          </w:tcPr>
+          <w:p>
+            <w:pPr>
+              <w:spacing w:after="0" w:line="240" w:lineRule="auto"/>
               <w:jc w:val="left"/>
             </w:pPr>
             <w:r>
+              <w:rPr>
+                <w:sz w:val="22"/>
+              </w:rPr>
               <w:t>Warehouse reconciliation decision flow</w:t>
             </w:r>
           </w:p>
         </w:tc>
         <w:tc>
           <w:tcPr>
-            <w:tcW w:w="1152" w:type="dxa"/>
-          </w:tcPr>
-          <w:p>
-            <w:pPr>
-              <w:spacing w:before="20" w:after="20"/>
-              <w:jc w:val="left"/>
-            </w:pPr>
-            <w:r>
+            <w:tcW w:w="1512" w:type="dxa"/>
+            <w:vAlign w:val="center"/>
+          </w:tcPr>
+          <w:p>
+            <w:pPr>
+              <w:spacing w:after="0" w:line="240" w:lineRule="auto"/>
+              <w:jc w:val="center"/>
+            </w:pPr>
+            <w:r>
+              <w:rPr>
+                <w:sz w:val="22"/>
+              </w:rPr>
               <w:fldChar w:fldCharType="begin"/>
             </w:r>
             <w:r>
+              <w:rPr>
+                <w:sz w:val="22"/>
+              </w:rPr>
               <w:instrText xml:space="preserve"> PAGEREF fig_4_2 \h </w:instrText>
             </w:r>
             <w:r>
+              <w:rPr>
+                <w:sz w:val="22"/>
+              </w:rPr>
+            </w:r>
+            <w:r>
+              <w:rPr>
+                <w:sz w:val="22"/>
+              </w:rPr>
               <w:fldChar w:fldCharType="separate"/>
             </w:r>
             <w:r>
               <w:rPr>
                 <w:noProof/>
+                <w:sz w:val="22"/>
               </w:rPr>
               <w:t>10</w:t>
             </w:r>
             <w:r>
+              <w:rPr>
+                <w:sz w:val="22"/>
+              </w:rPr>
               <w:fldChar w:fldCharType="end"/>
             </w:r>
           </w:p>
@@ -4266,7 +4157,7 @@
     </w:tbl>
     <w:p>
       <w:pPr>
-        <w:spacing w:after="880" w:line="240" w:lineRule="auto"/>
+        <w:spacing w:after="480" w:line="240" w:lineRule="auto"/>
       </w:pPr>
     </w:p>
     <w:p>
@@ -4290,44 +4181,46 @@
         <w:tblW w:w="0" w:type="auto"/>
         <w:jc w:val="center"/>
         <w:tblBorders>
-          <w:top w:val="nil"/>
-          <w:left w:val="nil"/>
-          <w:bottom w:val="nil"/>
-          <w:right w:val="nil"/>
-          <w:insideH w:val="nil"/>
-          <w:insideV w:val="nil"/>
+          <w:top w:val="single" w:sz="6" w:space="0" w:color="000000"/>
+          <w:left w:val="single" w:sz="6" w:space="0" w:color="000000"/>
+          <w:bottom w:val="single" w:sz="6" w:space="0" w:color="000000"/>
+          <w:right w:val="single" w:sz="6" w:space="0" w:color="000000"/>
+          <w:insideH w:val="single" w:sz="6" w:space="0" w:color="000000"/>
+          <w:insideV w:val="single" w:sz="6" w:space="0" w:color="000000"/>
         </w:tblBorders>
         <w:tblLayout w:type="fixed"/>
         <w:tblCellMar>
-          <w:top w:w="43" w:type="dxa"/>
-          <w:left w:w="57" w:type="dxa"/>
-          <w:bottom w:w="43" w:type="dxa"/>
-          <w:right w:w="57" w:type="dxa"/>
+          <w:left w:w="115" w:type="dxa"/>
+          <w:right w:w="115" w:type="dxa"/>
         </w:tblCellMar>
         <w:tblLook w:val="04A0" w:firstRow="1" w:lastRow="0" w:firstColumn="1" w:lastColumn="0" w:noHBand="0" w:noVBand="1"/>
       </w:tblPr>
       <w:tblGrid>
-        <w:gridCol w:w="1656"/>
-        <w:gridCol w:w="5400"/>
-        <w:gridCol w:w="1152"/>
+        <w:gridCol w:w="1584"/>
+        <w:gridCol w:w="5112"/>
+        <w:gridCol w:w="1512"/>
       </w:tblGrid>
       <w:tr>
         <w:trPr>
+          <w:cantSplit/>
+          <w:trHeight w:val="500"/>
           <w:jc w:val="center"/>
         </w:trPr>
         <w:tc>
           <w:tcPr>
-            <w:tcW w:w="1656" w:type="dxa"/>
-          </w:tcPr>
-          <w:p>
-            <w:pPr>
-              <w:spacing w:before="40" w:after="80"/>
-              <w:jc w:val="left"/>
+            <w:tcW w:w="1584" w:type="dxa"/>
+            <w:shd w:val="clear" w:color="auto" w:fill="DDEBF7"/>
+            <w:vAlign w:val="center"/>
+          </w:tcPr>
+          <w:p>
+            <w:pPr>
+              <w:spacing w:after="0" w:line="240" w:lineRule="auto"/>
+              <w:jc w:val="center"/>
             </w:pPr>
             <w:r>
               <w:rPr>
                 <w:b/>
-                <w:sz w:val="24"/>
+                <w:sz w:val="26"/>
               </w:rPr>
               <w:t>Table No</w:t>
             </w:r>
@@ -4335,17 +4228,19 @@
         </w:tc>
         <w:tc>
           <w:tcPr>
-            <w:tcW w:w="5400" w:type="dxa"/>
-          </w:tcPr>
-          <w:p>
-            <w:pPr>
-              <w:spacing w:before="40" w:after="80"/>
-              <w:jc w:val="left"/>
+            <w:tcW w:w="5112" w:type="dxa"/>
+            <w:shd w:val="clear" w:color="auto" w:fill="DDEBF7"/>
+            <w:vAlign w:val="center"/>
+          </w:tcPr>
+          <w:p>
+            <w:pPr>
+              <w:spacing w:after="0" w:line="240" w:lineRule="auto"/>
+              <w:jc w:val="center"/>
             </w:pPr>
             <w:r>
               <w:rPr>
                 <w:b/>
-                <w:sz w:val="24"/>
+                <w:sz w:val="26"/>
               </w:rPr>
               <w:t>Name</w:t>
             </w:r>
@@ -4353,17 +4248,19 @@
         </w:tc>
         <w:tc>
           <w:tcPr>
-            <w:tcW w:w="1152" w:type="dxa"/>
-          </w:tcPr>
-          <w:p>
-            <w:pPr>
-              <w:spacing w:before="40" w:after="80"/>
-              <w:jc w:val="left"/>
+            <w:tcW w:w="1512" w:type="dxa"/>
+            <w:shd w:val="clear" w:color="auto" w:fill="DDEBF7"/>
+            <w:vAlign w:val="center"/>
+          </w:tcPr>
+          <w:p>
+            <w:pPr>
+              <w:spacing w:after="0" w:line="240" w:lineRule="auto"/>
+              <w:jc w:val="center"/>
             </w:pPr>
             <w:r>
               <w:rPr>
                 <w:b/>
-                <w:sz w:val="24"/>
+                <w:sz w:val="26"/>
               </w:rPr>
               <w:t>Page no</w:t>
             </w:r>
@@ -4373,61 +4270,89 @@
       <w:tr>
         <w:trPr>
           <w:cantSplit/>
+          <w:trHeight w:val="460"/>
           <w:jc w:val="center"/>
         </w:trPr>
         <w:tc>
           <w:tcPr>
-            <w:tcW w:w="1656" w:type="dxa"/>
-          </w:tcPr>
-          <w:p>
-            <w:pPr>
-              <w:spacing w:before="20" w:after="20" w:line="240" w:lineRule="auto"/>
+            <w:tcW w:w="1584" w:type="dxa"/>
+            <w:vAlign w:val="center"/>
+          </w:tcPr>
+          <w:p>
+            <w:pPr>
+              <w:spacing w:after="0" w:line="240" w:lineRule="auto"/>
               <w:jc w:val="left"/>
             </w:pPr>
             <w:r>
+              <w:rPr>
+                <w:sz w:val="22"/>
+              </w:rPr>
               <w:t>Table 2.1</w:t>
             </w:r>
           </w:p>
         </w:tc>
         <w:tc>
           <w:tcPr>
-            <w:tcW w:w="5400" w:type="dxa"/>
-          </w:tcPr>
-          <w:p>
-            <w:pPr>
-              <w:spacing w:before="20" w:after="20" w:line="240" w:lineRule="auto"/>
+            <w:tcW w:w="5112" w:type="dxa"/>
+            <w:vAlign w:val="center"/>
+          </w:tcPr>
+          <w:p>
+            <w:pPr>
+              <w:spacing w:after="0" w:line="240" w:lineRule="auto"/>
               <w:jc w:val="left"/>
             </w:pPr>
             <w:r>
+              <w:rPr>
+                <w:sz w:val="22"/>
+              </w:rPr>
               <w:t>Summary matrix of the literature survey</w:t>
             </w:r>
           </w:p>
         </w:tc>
         <w:tc>
           <w:tcPr>
-            <w:tcW w:w="1152" w:type="dxa"/>
-          </w:tcPr>
-          <w:p>
-            <w:pPr>
-              <w:spacing w:before="20" w:after="20"/>
-              <w:jc w:val="left"/>
-            </w:pPr>
-            <w:r>
+            <w:tcW w:w="1512" w:type="dxa"/>
+            <w:vAlign w:val="center"/>
+          </w:tcPr>
+          <w:p>
+            <w:pPr>
+              <w:spacing w:after="0" w:line="240" w:lineRule="auto"/>
+              <w:jc w:val="center"/>
+            </w:pPr>
+            <w:r>
+              <w:rPr>
+                <w:sz w:val="22"/>
+              </w:rPr>
               <w:fldChar w:fldCharType="begin"/>
             </w:r>
             <w:r>
+              <w:rPr>
+                <w:sz w:val="22"/>
+              </w:rPr>
               <w:instrText xml:space="preserve"> PAGEREF tbl_2_1 \h </w:instrText>
             </w:r>
             <w:r>
+              <w:rPr>
+                <w:sz w:val="22"/>
+              </w:rPr>
+            </w:r>
+            <w:r>
+              <w:rPr>
+                <w:sz w:val="22"/>
+              </w:rPr>
               <w:fldChar w:fldCharType="separate"/>
             </w:r>
             <w:r>
               <w:rPr>
                 <w:noProof/>
+                <w:sz w:val="22"/>
               </w:rPr>
               <w:t>4</w:t>
             </w:r>
             <w:r>
+              <w:rPr>
+                <w:sz w:val="22"/>
+              </w:rPr>
               <w:fldChar w:fldCharType="end"/>
             </w:r>
           </w:p>
@@ -4436,61 +4361,89 @@
       <w:tr>
         <w:trPr>
           <w:cantSplit/>
+          <w:trHeight w:val="460"/>
           <w:jc w:val="center"/>
         </w:trPr>
         <w:tc>
           <w:tcPr>
-            <w:tcW w:w="1656" w:type="dxa"/>
-          </w:tcPr>
-          <w:p>
-            <w:pPr>
-              <w:spacing w:before="20" w:after="20" w:line="240" w:lineRule="auto"/>
+            <w:tcW w:w="1584" w:type="dxa"/>
+            <w:vAlign w:val="center"/>
+          </w:tcPr>
+          <w:p>
+            <w:pPr>
+              <w:spacing w:after="0" w:line="240" w:lineRule="auto"/>
               <w:jc w:val="left"/>
             </w:pPr>
             <w:r>
+              <w:rPr>
+                <w:sz w:val="22"/>
+              </w:rPr>
               <w:t>Table 3.1</w:t>
             </w:r>
           </w:p>
         </w:tc>
         <w:tc>
           <w:tcPr>
-            <w:tcW w:w="5400" w:type="dxa"/>
-          </w:tcPr>
-          <w:p>
-            <w:pPr>
-              <w:spacing w:before="20" w:after="20" w:line="240" w:lineRule="auto"/>
+            <w:tcW w:w="5112" w:type="dxa"/>
+            <w:vAlign w:val="center"/>
+          </w:tcPr>
+          <w:p>
+            <w:pPr>
+              <w:spacing w:after="0" w:line="240" w:lineRule="auto"/>
               <w:jc w:val="left"/>
             </w:pPr>
             <w:r>
+              <w:rPr>
+                <w:sz w:val="22"/>
+              </w:rPr>
               <w:t>Custody states, guards and permitted transitions</w:t>
             </w:r>
           </w:p>
         </w:tc>
         <w:tc>
           <w:tcPr>
-            <w:tcW w:w="1152" w:type="dxa"/>
-          </w:tcPr>
-          <w:p>
-            <w:pPr>
-              <w:spacing w:before="20" w:after="20"/>
-              <w:jc w:val="left"/>
-            </w:pPr>
-            <w:r>
+            <w:tcW w:w="1512" w:type="dxa"/>
+            <w:vAlign w:val="center"/>
+          </w:tcPr>
+          <w:p>
+            <w:pPr>
+              <w:spacing w:after="0" w:line="240" w:lineRule="auto"/>
+              <w:jc w:val="center"/>
+            </w:pPr>
+            <w:r>
+              <w:rPr>
+                <w:sz w:val="22"/>
+              </w:rPr>
               <w:fldChar w:fldCharType="begin"/>
             </w:r>
             <w:r>
+              <w:rPr>
+                <w:sz w:val="22"/>
+              </w:rPr>
               <w:instrText xml:space="preserve"> PAGEREF tbl_3_1 \h </w:instrText>
             </w:r>
             <w:r>
+              <w:rPr>
+                <w:sz w:val="22"/>
+              </w:rPr>
+            </w:r>
+            <w:r>
+              <w:rPr>
+                <w:sz w:val="22"/>
+              </w:rPr>
               <w:fldChar w:fldCharType="separate"/>
             </w:r>
             <w:r>
               <w:rPr>
                 <w:noProof/>
+                <w:sz w:val="22"/>
               </w:rPr>
               <w:t>7</w:t>
             </w:r>
             <w:r>
+              <w:rPr>
+                <w:sz w:val="22"/>
+              </w:rPr>
               <w:fldChar w:fldCharType="end"/>
             </w:r>
           </w:p>
@@ -4499,61 +4452,89 @@
       <w:tr>
         <w:trPr>
           <w:cantSplit/>
+          <w:trHeight w:val="460"/>
           <w:jc w:val="center"/>
         </w:trPr>
         <w:tc>
           <w:tcPr>
-            <w:tcW w:w="1656" w:type="dxa"/>
-          </w:tcPr>
-          <w:p>
-            <w:pPr>
-              <w:spacing w:before="20" w:after="20" w:line="240" w:lineRule="auto"/>
+            <w:tcW w:w="1584" w:type="dxa"/>
+            <w:vAlign w:val="center"/>
+          </w:tcPr>
+          <w:p>
+            <w:pPr>
+              <w:spacing w:after="0" w:line="240" w:lineRule="auto"/>
               <w:jc w:val="left"/>
             </w:pPr>
             <w:r>
+              <w:rPr>
+                <w:sz w:val="22"/>
+              </w:rPr>
               <w:t>Table 4.1</w:t>
             </w:r>
           </w:p>
         </w:tc>
         <w:tc>
           <w:tcPr>
-            <w:tcW w:w="5400" w:type="dxa"/>
-          </w:tcPr>
-          <w:p>
-            <w:pPr>
-              <w:spacing w:before="20" w:after="20" w:line="240" w:lineRule="auto"/>
+            <w:tcW w:w="5112" w:type="dxa"/>
+            <w:vAlign w:val="center"/>
+          </w:tcPr>
+          <w:p>
+            <w:pPr>
+              <w:spacing w:after="0" w:line="240" w:lineRule="auto"/>
               <w:jc w:val="left"/>
             </w:pPr>
             <w:r>
+              <w:rPr>
+                <w:sz w:val="22"/>
+              </w:rPr>
               <w:t>Technology stack of the implemented prototype</w:t>
             </w:r>
           </w:p>
         </w:tc>
         <w:tc>
           <w:tcPr>
-            <w:tcW w:w="1152" w:type="dxa"/>
-          </w:tcPr>
-          <w:p>
-            <w:pPr>
-              <w:spacing w:before="20" w:after="20"/>
-              <w:jc w:val="left"/>
-            </w:pPr>
-            <w:r>
+            <w:tcW w:w="1512" w:type="dxa"/>
+            <w:vAlign w:val="center"/>
+          </w:tcPr>
+          <w:p>
+            <w:pPr>
+              <w:spacing w:after="0" w:line="240" w:lineRule="auto"/>
+              <w:jc w:val="center"/>
+            </w:pPr>
+            <w:r>
+              <w:rPr>
+                <w:sz w:val="22"/>
+              </w:rPr>
               <w:fldChar w:fldCharType="begin"/>
             </w:r>
             <w:r>
+              <w:rPr>
+                <w:sz w:val="22"/>
+              </w:rPr>
               <w:instrText xml:space="preserve"> PAGEREF tbl_4_1 \h </w:instrText>
             </w:r>
             <w:r>
+              <w:rPr>
+                <w:sz w:val="22"/>
+              </w:rPr>
+            </w:r>
+            <w:r>
+              <w:rPr>
+                <w:sz w:val="22"/>
+              </w:rPr>
               <w:fldChar w:fldCharType="separate"/>
             </w:r>
             <w:r>
               <w:rPr>
                 <w:noProof/>
+                <w:sz w:val="22"/>
               </w:rPr>
               <w:t>11</w:t>
             </w:r>
             <w:r>
+              <w:rPr>
+                <w:sz w:val="22"/>
+              </w:rPr>
               <w:fldChar w:fldCharType="end"/>
             </w:r>
           </w:p>
@@ -4562,61 +4543,89 @@
       <w:tr>
         <w:trPr>
           <w:cantSplit/>
+          <w:trHeight w:val="460"/>
           <w:jc w:val="center"/>
         </w:trPr>
         <w:tc>
           <w:tcPr>
-            <w:tcW w:w="1656" w:type="dxa"/>
-          </w:tcPr>
-          <w:p>
-            <w:pPr>
-              <w:spacing w:before="20" w:after="20" w:line="240" w:lineRule="auto"/>
+            <w:tcW w:w="1584" w:type="dxa"/>
+            <w:vAlign w:val="center"/>
+          </w:tcPr>
+          <w:p>
+            <w:pPr>
+              <w:spacing w:after="0" w:line="240" w:lineRule="auto"/>
               <w:jc w:val="left"/>
             </w:pPr>
             <w:r>
+              <w:rPr>
+                <w:sz w:val="22"/>
+              </w:rPr>
               <w:t>Table 4.2</w:t>
             </w:r>
           </w:p>
         </w:tc>
         <w:tc>
           <w:tcPr>
-            <w:tcW w:w="5400" w:type="dxa"/>
-          </w:tcPr>
-          <w:p>
-            <w:pPr>
-              <w:spacing w:before="20" w:after="20" w:line="240" w:lineRule="auto"/>
+            <w:tcW w:w="5112" w:type="dxa"/>
+            <w:vAlign w:val="center"/>
+          </w:tcPr>
+          <w:p>
+            <w:pPr>
+              <w:spacing w:after="0" w:line="240" w:lineRule="auto"/>
               <w:jc w:val="left"/>
             </w:pPr>
             <w:r>
+              <w:rPr>
+                <w:sz w:val="22"/>
+              </w:rPr>
               <w:t>Seeded demonstration fleet (six dispatches)</w:t>
             </w:r>
           </w:p>
         </w:tc>
         <w:tc>
           <w:tcPr>
-            <w:tcW w:w="1152" w:type="dxa"/>
-          </w:tcPr>
-          <w:p>
-            <w:pPr>
-              <w:spacing w:before="20" w:after="20"/>
-              <w:jc w:val="left"/>
-            </w:pPr>
-            <w:r>
+            <w:tcW w:w="1512" w:type="dxa"/>
+            <w:vAlign w:val="center"/>
+          </w:tcPr>
+          <w:p>
+            <w:pPr>
+              <w:spacing w:after="0" w:line="240" w:lineRule="auto"/>
+              <w:jc w:val="center"/>
+            </w:pPr>
+            <w:r>
+              <w:rPr>
+                <w:sz w:val="22"/>
+              </w:rPr>
               <w:fldChar w:fldCharType="begin"/>
             </w:r>
             <w:r>
+              <w:rPr>
+                <w:sz w:val="22"/>
+              </w:rPr>
               <w:instrText xml:space="preserve"> PAGEREF tbl_4_2 \h </w:instrText>
             </w:r>
             <w:r>
+              <w:rPr>
+                <w:sz w:val="22"/>
+              </w:rPr>
+            </w:r>
+            <w:r>
+              <w:rPr>
+                <w:sz w:val="22"/>
+              </w:rPr>
               <w:fldChar w:fldCharType="separate"/>
             </w:r>
             <w:r>
               <w:rPr>
                 <w:noProof/>
+                <w:sz w:val="22"/>
               </w:rPr>
               <w:t>11</w:t>
             </w:r>
             <w:r>
+              <w:rPr>
+                <w:sz w:val="22"/>
+              </w:rPr>
               <w:fldChar w:fldCharType="end"/>
             </w:r>
           </w:p>
@@ -4625,61 +4634,89 @@
       <w:tr>
         <w:trPr>
           <w:cantSplit/>
+          <w:trHeight w:val="460"/>
           <w:jc w:val="center"/>
         </w:trPr>
         <w:tc>
           <w:tcPr>
-            <w:tcW w:w="1656" w:type="dxa"/>
-          </w:tcPr>
-          <w:p>
-            <w:pPr>
-              <w:spacing w:before="20" w:after="20" w:line="240" w:lineRule="auto"/>
+            <w:tcW w:w="1584" w:type="dxa"/>
+            <w:vAlign w:val="center"/>
+          </w:tcPr>
+          <w:p>
+            <w:pPr>
+              <w:spacing w:after="0" w:line="240" w:lineRule="auto"/>
               <w:jc w:val="left"/>
             </w:pPr>
             <w:r>
+              <w:rPr>
+                <w:sz w:val="22"/>
+              </w:rPr>
               <w:t>Table 7.1</w:t>
             </w:r>
           </w:p>
         </w:tc>
         <w:tc>
           <w:tcPr>
-            <w:tcW w:w="5400" w:type="dxa"/>
-          </w:tcPr>
-          <w:p>
-            <w:pPr>
-              <w:spacing w:before="20" w:after="20" w:line="240" w:lineRule="auto"/>
+            <w:tcW w:w="5112" w:type="dxa"/>
+            <w:vAlign w:val="center"/>
+          </w:tcPr>
+          <w:p>
+            <w:pPr>
+              <w:spacing w:after="0" w:line="240" w:lineRule="auto"/>
               <w:jc w:val="left"/>
             </w:pPr>
             <w:r>
+              <w:rPr>
+                <w:sz w:val="22"/>
+              </w:rPr>
               <w:t>Feature matrix comparison with existing approaches</w:t>
             </w:r>
           </w:p>
         </w:tc>
         <w:tc>
           <w:tcPr>
-            <w:tcW w:w="1152" w:type="dxa"/>
-          </w:tcPr>
-          <w:p>
-            <w:pPr>
-              <w:spacing w:before="20" w:after="20"/>
-              <w:jc w:val="left"/>
-            </w:pPr>
-            <w:r>
+            <w:tcW w:w="1512" w:type="dxa"/>
+            <w:vAlign w:val="center"/>
+          </w:tcPr>
+          <w:p>
+            <w:pPr>
+              <w:spacing w:after="0" w:line="240" w:lineRule="auto"/>
+              <w:jc w:val="center"/>
+            </w:pPr>
+            <w:r>
+              <w:rPr>
+                <w:sz w:val="22"/>
+              </w:rPr>
               <w:fldChar w:fldCharType="begin"/>
             </w:r>
             <w:r>
+              <w:rPr>
+                <w:sz w:val="22"/>
+              </w:rPr>
               <w:instrText xml:space="preserve"> PAGEREF tbl_7_1 \h </w:instrText>
             </w:r>
             <w:r>
+              <w:rPr>
+                <w:sz w:val="22"/>
+              </w:rPr>
+            </w:r>
+            <w:r>
+              <w:rPr>
+                <w:sz w:val="22"/>
+              </w:rPr>
               <w:fldChar w:fldCharType="separate"/>
             </w:r>
             <w:r>
               <w:rPr>
                 <w:noProof/>
+                <w:sz w:val="22"/>
               </w:rPr>
               <w:t>14</w:t>
             </w:r>
             <w:r>
+              <w:rPr>
+                <w:sz w:val="22"/>
+              </w:rPr>
               <w:fldChar w:fldCharType="end"/>
             </w:r>
           </w:p>
@@ -6103,7 +6140,7 @@
       <w:pPr>
         <w:pStyle w:val="Heading1"/>
       </w:pPr>
-      <w:bookmarkStart w:id="7" w:name="_Toc244293347"/>
+      <w:bookmarkStart w:id="7" w:name="_Toc244294010"/>
       <w:r>
         <w:lastRenderedPageBreak/>
         <w:t>1. Introduction</w:t>
@@ -6114,7 +6151,7 @@
       <w:pPr>
         <w:pStyle w:val="Heading2"/>
       </w:pPr>
-      <w:bookmarkStart w:id="8" w:name="_Toc244293348"/>
+      <w:bookmarkStart w:id="8" w:name="_Toc244294011"/>
       <w:r>
         <w:t>1.1 Background</w:t>
       </w:r>
@@ -6137,7 +6174,7 @@
       <w:pPr>
         <w:pStyle w:val="Heading2"/>
       </w:pPr>
-      <w:bookmarkStart w:id="9" w:name="_Toc244293349"/>
+      <w:bookmarkStart w:id="9" w:name="_Toc244294012"/>
       <w:r>
         <w:t>1.2 Motivation</w:t>
       </w:r>
@@ -6232,7 +6269,7 @@
       <w:pPr>
         <w:pStyle w:val="Heading2"/>
       </w:pPr>
-      <w:bookmarkStart w:id="10" w:name="_Toc244293350"/>
+      <w:bookmarkStart w:id="10" w:name="_Toc244294013"/>
       <w:r>
         <w:t>1.3 Problem Statement</w:t>
       </w:r>
@@ -6339,7 +6376,7 @@
       <w:pPr>
         <w:pStyle w:val="Heading2"/>
       </w:pPr>
-      <w:bookmarkStart w:id="11" w:name="_Toc244293351"/>
+      <w:bookmarkStart w:id="11" w:name="_Toc244294014"/>
       <w:r>
         <w:t>1.4 Objectives</w:t>
       </w:r>
@@ -6454,7 +6491,7 @@
       <w:pPr>
         <w:pStyle w:val="Heading2"/>
       </w:pPr>
-      <w:bookmarkStart w:id="12" w:name="_Toc244293352"/>
+      <w:bookmarkStart w:id="12" w:name="_Toc244294015"/>
       <w:r>
         <w:t>1.5 Scope of the Seminar</w:t>
       </w:r>
@@ -6516,7 +6553,7 @@
       <w:pPr>
         <w:pStyle w:val="Heading1"/>
       </w:pPr>
-      <w:bookmarkStart w:id="13" w:name="_Toc244293353"/>
+      <w:bookmarkStart w:id="13" w:name="_Toc244294016"/>
       <w:r>
         <w:lastRenderedPageBreak/>
         <w:t>2. Literature Survey</w:t>
@@ -6527,7 +6564,7 @@
       <w:pPr>
         <w:pStyle w:val="Heading2"/>
       </w:pPr>
-      <w:bookmarkStart w:id="14" w:name="_Toc244293354"/>
+      <w:bookmarkStart w:id="14" w:name="_Toc244294017"/>
       <w:r>
         <w:t>2.1 Existing Work and Related Studies</w:t>
       </w:r>
@@ -6571,7 +6608,7 @@
       <w:pPr>
         <w:pStyle w:val="Heading2"/>
       </w:pPr>
-      <w:bookmarkStart w:id="15" w:name="_Toc244293355"/>
+      <w:bookmarkStart w:id="15" w:name="_Toc244294018"/>
       <w:r>
         <w:t>2.2 Summary of Research Papers</w:t>
       </w:r>
@@ -7511,7 +7548,7 @@
       <w:pPr>
         <w:pStyle w:val="Heading2"/>
       </w:pPr>
-      <w:bookmarkStart w:id="17" w:name="_Toc244293356"/>
+      <w:bookmarkStart w:id="17" w:name="_Toc244294019"/>
       <w:r>
         <w:t>2.3 Research Gaps</w:t>
       </w:r>
@@ -7647,7 +7684,7 @@
       <w:pPr>
         <w:pStyle w:val="Heading1"/>
       </w:pPr>
-      <w:bookmarkStart w:id="18" w:name="_Toc244293357"/>
+      <w:bookmarkStart w:id="18" w:name="_Toc244294020"/>
       <w:r>
         <w:lastRenderedPageBreak/>
         <w:t>3. Overview of the ChainGuard v2 Control Plane</w:t>
@@ -7658,7 +7695,7 @@
       <w:pPr>
         <w:pStyle w:val="Heading2"/>
       </w:pPr>
-      <w:bookmarkStart w:id="19" w:name="_Toc244293358"/>
+      <w:bookmarkStart w:id="19" w:name="_Toc244294021"/>
       <w:r>
         <w:t>3.1 Definition and Concept</w:t>
       </w:r>
@@ -7838,7 +7875,7 @@
       <w:pPr>
         <w:pStyle w:val="Heading2"/>
       </w:pPr>
-      <w:bookmarkStart w:id="20" w:name="_Toc244293359"/>
+      <w:bookmarkStart w:id="20" w:name="_Toc244294022"/>
       <w:r>
         <w:t>3.2 Architecture / Block Diagram</w:t>
       </w:r>
@@ -7855,7 +7892,7 @@
           <w:noProof/>
         </w:rPr>
         <w:drawing>
-          <wp:inline distT="0" distB="0" distL="0" distR="0" wp14:anchorId="25142DD3" wp14:editId="122EB46C">
+          <wp:inline distT="0" distB="0" distL="0" distR="0" wp14:anchorId="0E7EF65D" wp14:editId="37BE03BC">
             <wp:extent cx="4572000" cy="3304515"/>
             <wp:effectExtent l="0" t="0" r="0" b="0"/>
             <wp:docPr id="5" name="Picture 5"/>
@@ -8027,7 +8064,7 @@
       <w:pPr>
         <w:pStyle w:val="Heading2"/>
       </w:pPr>
-      <w:bookmarkStart w:id="22" w:name="_Toc244293360"/>
+      <w:bookmarkStart w:id="22" w:name="_Toc244294023"/>
       <w:r>
         <w:t>3.3 Key Components and Technologies</w:t>
       </w:r>
@@ -8234,7 +8271,7 @@
           <w:noProof/>
         </w:rPr>
         <w:drawing>
-          <wp:inline distT="0" distB="0" distL="0" distR="0" wp14:anchorId="24CC52A0" wp14:editId="4D8A913A">
+          <wp:inline distT="0" distB="0" distL="0" distR="0" wp14:anchorId="0FA214BF" wp14:editId="5802A7DF">
             <wp:extent cx="4572000" cy="2942376"/>
             <wp:effectExtent l="0" t="0" r="0" b="0"/>
             <wp:docPr id="6" name="Picture 6"/>
@@ -9149,7 +9186,7 @@
       <w:pPr>
         <w:pStyle w:val="Heading1"/>
       </w:pPr>
-      <w:bookmarkStart w:id="25" w:name="_Toc244293361"/>
+      <w:bookmarkStart w:id="25" w:name="_Toc244294024"/>
       <w:r>
         <w:lastRenderedPageBreak/>
         <w:t>4. Working / Methodology</w:t>
@@ -9160,7 +9197,7 @@
       <w:pPr>
         <w:pStyle w:val="Heading2"/>
       </w:pPr>
-      <w:bookmarkStart w:id="26" w:name="_Toc244293362"/>
+      <w:bookmarkStart w:id="26" w:name="_Toc244294025"/>
       <w:r>
         <w:t>4.1 Working Principle</w:t>
       </w:r>
@@ -9182,7 +9219,7 @@
           <w:noProof/>
         </w:rPr>
         <w:drawing>
-          <wp:inline distT="0" distB="0" distL="0" distR="0" wp14:anchorId="57F23463" wp14:editId="01D09D66">
+          <wp:inline distT="0" distB="0" distL="0" distR="0" wp14:anchorId="78EEF099" wp14:editId="01910E94">
             <wp:extent cx="4572000" cy="3213980"/>
             <wp:effectExtent l="0" t="0" r="0" b="0"/>
             <wp:docPr id="7" name="Picture 7"/>
@@ -9458,7 +9495,7 @@
       <w:pPr>
         <w:pStyle w:val="Heading2"/>
       </w:pPr>
-      <w:bookmarkStart w:id="28" w:name="_Toc244293363"/>
+      <w:bookmarkStart w:id="28" w:name="_Toc244294026"/>
       <w:r>
         <w:t>4.2 Algorithms / Techniques Used</w:t>
       </w:r>
@@ -9844,7 +9881,7 @@
         </w:rPr>
         <w:lastRenderedPageBreak/>
         <w:drawing>
-          <wp:inline distT="0" distB="0" distL="0" distR="0" wp14:anchorId="3B3306F4" wp14:editId="2F9EA1A0">
+          <wp:inline distT="0" distB="0" distL="0" distR="0" wp14:anchorId="34E8F3F2" wp14:editId="67E35CE2">
             <wp:extent cx="4572000" cy="3224463"/>
             <wp:effectExtent l="0" t="0" r="0" b="0"/>
             <wp:docPr id="8" name="Picture 8"/>
@@ -10226,7 +10263,7 @@
       <w:pPr>
         <w:pStyle w:val="Heading2"/>
       </w:pPr>
-      <w:bookmarkStart w:id="30" w:name="_Toc244293364"/>
+      <w:bookmarkStart w:id="30" w:name="_Toc244294027"/>
       <w:r>
         <w:t>4.3 Tools and Platforms</w:t>
       </w:r>
@@ -11670,7 +11707,7 @@
       <w:pPr>
         <w:pStyle w:val="Heading1"/>
       </w:pPr>
-      <w:bookmarkStart w:id="33" w:name="_Toc244293365"/>
+      <w:bookmarkStart w:id="33" w:name="_Toc244294028"/>
       <w:r>
         <w:lastRenderedPageBreak/>
         <w:t>5. Applications</w:t>
@@ -11681,7 +11718,7 @@
       <w:pPr>
         <w:pStyle w:val="Heading2"/>
       </w:pPr>
-      <w:bookmarkStart w:id="34" w:name="_Toc244293366"/>
+      <w:bookmarkStart w:id="34" w:name="_Toc244294029"/>
       <w:r>
         <w:t>5.1 Real-World Use Cases</w:t>
       </w:r>
@@ -11821,7 +11858,7 @@
       <w:pPr>
         <w:pStyle w:val="Heading2"/>
       </w:pPr>
-      <w:bookmarkStart w:id="35" w:name="_Toc244293367"/>
+      <w:bookmarkStart w:id="35" w:name="_Toc244294030"/>
       <w:r>
         <w:t>5.2 Case Study</w:t>
       </w:r>
@@ -11915,7 +11952,7 @@
       <w:pPr>
         <w:pStyle w:val="Heading1"/>
       </w:pPr>
-      <w:bookmarkStart w:id="36" w:name="_Toc244293368"/>
+      <w:bookmarkStart w:id="36" w:name="_Toc244294031"/>
       <w:r>
         <w:lastRenderedPageBreak/>
         <w:t>6. Advantages and Limitations</w:t>
@@ -11926,7 +11963,7 @@
       <w:pPr>
         <w:pStyle w:val="Heading2"/>
       </w:pPr>
-      <w:bookmarkStart w:id="37" w:name="_Toc244293369"/>
+      <w:bookmarkStart w:id="37" w:name="_Toc244294032"/>
       <w:r>
         <w:t>6.1 Advantages</w:t>
       </w:r>
@@ -12116,7 +12153,7 @@
       <w:pPr>
         <w:pStyle w:val="Heading2"/>
       </w:pPr>
-      <w:bookmarkStart w:id="38" w:name="_Toc244293370"/>
+      <w:bookmarkStart w:id="38" w:name="_Toc244294033"/>
       <w:r>
         <w:t>6.2 Limitations / Challenges</w:t>
       </w:r>
@@ -12412,7 +12449,7 @@
       <w:pPr>
         <w:pStyle w:val="Heading1"/>
       </w:pPr>
-      <w:bookmarkStart w:id="39" w:name="_Toc244293371"/>
+      <w:bookmarkStart w:id="39" w:name="_Toc244294034"/>
       <w:r>
         <w:lastRenderedPageBreak/>
         <w:t>7. Comparison with Existing Technologies</w:t>
@@ -13484,7 +13521,7 @@
       <w:pPr>
         <w:pStyle w:val="Heading1"/>
       </w:pPr>
-      <w:bookmarkStart w:id="41" w:name="_Toc244293372"/>
+      <w:bookmarkStart w:id="41" w:name="_Toc244294035"/>
       <w:r>
         <w:lastRenderedPageBreak/>
         <w:t>8. Future Scope</w:t>
@@ -13681,7 +13718,7 @@
       <w:pPr>
         <w:pStyle w:val="Heading1"/>
       </w:pPr>
-      <w:bookmarkStart w:id="42" w:name="_Toc244293373"/>
+      <w:bookmarkStart w:id="42" w:name="_Toc244294036"/>
       <w:r>
         <w:lastRenderedPageBreak/>
         <w:t>9. Conclusion</w:t>
@@ -13730,7 +13767,7 @@
         <w:spacing w:after="360"/>
         <w:jc w:val="center"/>
       </w:pPr>
-      <w:bookmarkStart w:id="43" w:name="_Toc244293374"/>
+      <w:bookmarkStart w:id="43" w:name="_Toc244294037"/>
       <w:r>
         <w:rPr>
           <w:rFonts w:ascii="Times New Roman" w:eastAsia="Times New Roman" w:hAnsi="Times New Roman" w:cs="Times New Roman"/>
@@ -16040,31 +16077,31 @@
       </w:rPr>
     </w:lvl>
   </w:abstractNum>
-  <w:num w:numId="1" w16cid:durableId="321933408">
+  <w:num w:numId="1" w16cid:durableId="121271064">
     <w:abstractNumId w:val="8"/>
   </w:num>
-  <w:num w:numId="2" w16cid:durableId="919874283">
+  <w:num w:numId="2" w16cid:durableId="1771315012">
     <w:abstractNumId w:val="6"/>
   </w:num>
-  <w:num w:numId="3" w16cid:durableId="1231769290">
+  <w:num w:numId="3" w16cid:durableId="1558470182">
     <w:abstractNumId w:val="5"/>
   </w:num>
-  <w:num w:numId="4" w16cid:durableId="829374095">
+  <w:num w:numId="4" w16cid:durableId="1450397859">
     <w:abstractNumId w:val="4"/>
   </w:num>
-  <w:num w:numId="5" w16cid:durableId="340276521">
+  <w:num w:numId="5" w16cid:durableId="1926525915">
     <w:abstractNumId w:val="7"/>
   </w:num>
-  <w:num w:numId="6" w16cid:durableId="707992751">
+  <w:num w:numId="6" w16cid:durableId="611088935">
     <w:abstractNumId w:val="3"/>
   </w:num>
-  <w:num w:numId="7" w16cid:durableId="599799144">
+  <w:num w:numId="7" w16cid:durableId="2070298663">
     <w:abstractNumId w:val="2"/>
   </w:num>
-  <w:num w:numId="8" w16cid:durableId="1091926024">
+  <w:num w:numId="8" w16cid:durableId="1401757502">
     <w:abstractNumId w:val="1"/>
   </w:num>
-  <w:num w:numId="9" w16cid:durableId="959189128">
+  <w:num w:numId="9" w16cid:durableId="1518157285">
     <w:abstractNumId w:val="0"/>
   </w:num>
 </w:numbering>
@@ -27496,7 +27533,7 @@
     <w:autoRedefine/>
     <w:uiPriority w:val="39"/>
     <w:unhideWhenUsed/>
-    <w:rsid w:val="007F2B56"/>
+    <w:rsid w:val="00B23A6D"/>
     <w:pPr>
       <w:spacing w:after="40" w:line="240" w:lineRule="auto"/>
     </w:pPr>
@@ -27512,7 +27549,7 @@
     <w:autoRedefine/>
     <w:uiPriority w:val="39"/>
     <w:unhideWhenUsed/>
-    <w:rsid w:val="007F2B56"/>
+    <w:rsid w:val="00B23A6D"/>
     <w:pPr>
       <w:spacing w:after="40" w:line="240" w:lineRule="auto"/>
       <w:ind w:left="210"/>

</xml_diff>

<commit_message>
docs: single Vivek Rathod B49 and template LOF/LOT/abbr tables
Replace all 3 students with Vivek Rathod B49 on title/certificate/acknowledgement. Restyle LOF/LOT tables with 0.75pt grid and shaded headers. Add shaded-border abbr table on page VI matching template PDF.
</commit_message>
<xml_diff>
--- a/ChainGuard_v2_Technical_Seminar_Report.docx
+++ b/ChainGuard_v2_Technical_Seminar_Report.docx
@@ -45,7 +45,7 @@
                 <w:noProof/>
               </w:rPr>
               <w:drawing>
-                <wp:inline distT="0" distB="0" distL="0" distR="0" wp14:anchorId="761EEA93" wp14:editId="1B19F048">
+                <wp:inline distT="0" distB="0" distL="0" distR="0" wp14:anchorId="2CF23864" wp14:editId="636A26EF">
                   <wp:extent cx="566928" cy="566928"/>
                   <wp:effectExtent l="0" t="0" r="0" b="0"/>
                   <wp:docPr id="1" name="Picture 1"/>
@@ -155,7 +155,7 @@
                 <w:noProof/>
               </w:rPr>
               <w:drawing>
-                <wp:inline distT="0" distB="0" distL="0" distR="0" wp14:anchorId="4D23BCC4" wp14:editId="6F0D9766">
+                <wp:inline distT="0" distB="0" distL="0" distR="0" wp14:anchorId="7A6495C5" wp14:editId="7FD2A125">
                   <wp:extent cx="530352" cy="590495"/>
                   <wp:effectExtent l="0" t="0" r="0" b="0"/>
                   <wp:docPr id="2" name="Picture 2"/>
@@ -538,7 +538,7 @@
               </w:rPr>
               <w:lastRenderedPageBreak/>
               <w:drawing>
-                <wp:inline distT="0" distB="0" distL="0" distR="0" wp14:anchorId="777608FB" wp14:editId="064378CD">
+                <wp:inline distT="0" distB="0" distL="0" distR="0" wp14:anchorId="4E7D0EF0" wp14:editId="2EB2E8D4">
                   <wp:extent cx="566928" cy="566928"/>
                   <wp:effectExtent l="0" t="0" r="0" b="0"/>
                   <wp:docPr id="3" name="Picture 3"/>
@@ -648,7 +648,7 @@
                 <w:noProof/>
               </w:rPr>
               <w:drawing>
-                <wp:inline distT="0" distB="0" distL="0" distR="0" wp14:anchorId="657E0E70" wp14:editId="2FFCC0D8">
+                <wp:inline distT="0" distB="0" distL="0" distR="0" wp14:anchorId="209AC61D" wp14:editId="6CAF09BE">
                   <wp:extent cx="530352" cy="590495"/>
                   <wp:effectExtent l="0" t="0" r="0" b="0"/>
                   <wp:docPr id="4" name="Picture 4"/>
@@ -1695,7 +1695,7 @@
           <w:noProof/>
           <w:webHidden/>
         </w:rPr>
-        <w:instrText xml:space="preserve"> PAGEREF _Toc244294010 \h </w:instrText>
+        <w:instrText xml:space="preserve"> PAGEREF _Toc244294424 \h </w:instrText>
       </w:r>
       <w:r>
         <w:rPr>
@@ -1767,7 +1767,7 @@
           <w:noProof/>
           <w:webHidden/>
         </w:rPr>
-        <w:instrText xml:space="preserve"> PAGEREF _Toc244294011 \h </w:instrText>
+        <w:instrText xml:space="preserve"> PAGEREF _Toc244294425 \h </w:instrText>
       </w:r>
       <w:r>
         <w:rPr>
@@ -1839,7 +1839,7 @@
           <w:noProof/>
           <w:webHidden/>
         </w:rPr>
-        <w:instrText xml:space="preserve"> PAGEREF _Toc244294012 \h </w:instrText>
+        <w:instrText xml:space="preserve"> PAGEREF _Toc244294426 \h </w:instrText>
       </w:r>
       <w:r>
         <w:rPr>
@@ -1911,7 +1911,7 @@
           <w:noProof/>
           <w:webHidden/>
         </w:rPr>
-        <w:instrText xml:space="preserve"> PAGEREF _Toc244294013 \h </w:instrText>
+        <w:instrText xml:space="preserve"> PAGEREF _Toc244294427 \h </w:instrText>
       </w:r>
       <w:r>
         <w:rPr>
@@ -1983,7 +1983,7 @@
           <w:noProof/>
           <w:webHidden/>
         </w:rPr>
-        <w:instrText xml:space="preserve"> PAGEREF _Toc244294014 \h </w:instrText>
+        <w:instrText xml:space="preserve"> PAGEREF _Toc244294428 \h </w:instrText>
       </w:r>
       <w:r>
         <w:rPr>
@@ -2055,7 +2055,7 @@
           <w:noProof/>
           <w:webHidden/>
         </w:rPr>
-        <w:instrText xml:space="preserve"> PAGEREF _Toc244294015 \h </w:instrText>
+        <w:instrText xml:space="preserve"> PAGEREF _Toc244294429 \h </w:instrText>
       </w:r>
       <w:r>
         <w:rPr>
@@ -2127,7 +2127,7 @@
           <w:noProof/>
           <w:webHidden/>
         </w:rPr>
-        <w:instrText xml:space="preserve"> PAGEREF _Toc244294016 \h </w:instrText>
+        <w:instrText xml:space="preserve"> PAGEREF _Toc244294430 \h </w:instrText>
       </w:r>
       <w:r>
         <w:rPr>
@@ -2199,7 +2199,7 @@
           <w:noProof/>
           <w:webHidden/>
         </w:rPr>
-        <w:instrText xml:space="preserve"> PAGEREF _Toc244294017 \h </w:instrText>
+        <w:instrText xml:space="preserve"> PAGEREF _Toc244294431 \h </w:instrText>
       </w:r>
       <w:r>
         <w:rPr>
@@ -2271,7 +2271,7 @@
           <w:noProof/>
           <w:webHidden/>
         </w:rPr>
-        <w:instrText xml:space="preserve"> PAGEREF _Toc244294018 \h </w:instrText>
+        <w:instrText xml:space="preserve"> PAGEREF _Toc244294432 \h </w:instrText>
       </w:r>
       <w:r>
         <w:rPr>
@@ -2343,7 +2343,7 @@
           <w:noProof/>
           <w:webHidden/>
         </w:rPr>
-        <w:instrText xml:space="preserve"> PAGEREF _Toc244294019 \h </w:instrText>
+        <w:instrText xml:space="preserve"> PAGEREF _Toc244294433 \h </w:instrText>
       </w:r>
       <w:r>
         <w:rPr>
@@ -2415,7 +2415,7 @@
           <w:noProof/>
           <w:webHidden/>
         </w:rPr>
-        <w:instrText xml:space="preserve"> PAGEREF _Toc244294020 \h </w:instrText>
+        <w:instrText xml:space="preserve"> PAGEREF _Toc244294434 \h </w:instrText>
       </w:r>
       <w:r>
         <w:rPr>
@@ -2487,7 +2487,7 @@
           <w:noProof/>
           <w:webHidden/>
         </w:rPr>
-        <w:instrText xml:space="preserve"> PAGEREF _Toc244294021 \h </w:instrText>
+        <w:instrText xml:space="preserve"> PAGEREF _Toc244294435 \h </w:instrText>
       </w:r>
       <w:r>
         <w:rPr>
@@ -2559,7 +2559,7 @@
           <w:noProof/>
           <w:webHidden/>
         </w:rPr>
-        <w:instrText xml:space="preserve"> PAGEREF _Toc244294022 \h </w:instrText>
+        <w:instrText xml:space="preserve"> PAGEREF _Toc244294436 \h </w:instrText>
       </w:r>
       <w:r>
         <w:rPr>
@@ -2631,7 +2631,7 @@
           <w:noProof/>
           <w:webHidden/>
         </w:rPr>
-        <w:instrText xml:space="preserve"> PAGEREF _Toc244294023 \h </w:instrText>
+        <w:instrText xml:space="preserve"> PAGEREF _Toc244294437 \h </w:instrText>
       </w:r>
       <w:r>
         <w:rPr>
@@ -2703,7 +2703,7 @@
           <w:noProof/>
           <w:webHidden/>
         </w:rPr>
-        <w:instrText xml:space="preserve"> PAGEREF _Toc244294024 \h </w:instrText>
+        <w:instrText xml:space="preserve"> PAGEREF _Toc244294438 \h </w:instrText>
       </w:r>
       <w:r>
         <w:rPr>
@@ -2775,7 +2775,7 @@
           <w:noProof/>
           <w:webHidden/>
         </w:rPr>
-        <w:instrText xml:space="preserve"> PAGEREF _Toc244294025 \h </w:instrText>
+        <w:instrText xml:space="preserve"> PAGEREF _Toc244294439 \h </w:instrText>
       </w:r>
       <w:r>
         <w:rPr>
@@ -2847,7 +2847,7 @@
           <w:noProof/>
           <w:webHidden/>
         </w:rPr>
-        <w:instrText xml:space="preserve"> PAGEREF _Toc244294026 \h </w:instrText>
+        <w:instrText xml:space="preserve"> PAGEREF _Toc244294440 \h </w:instrText>
       </w:r>
       <w:r>
         <w:rPr>
@@ -2919,7 +2919,7 @@
           <w:noProof/>
           <w:webHidden/>
         </w:rPr>
-        <w:instrText xml:space="preserve"> PAGEREF _Toc244294027 \h </w:instrText>
+        <w:instrText xml:space="preserve"> PAGEREF _Toc244294441 \h </w:instrText>
       </w:r>
       <w:r>
         <w:rPr>
@@ -2991,7 +2991,7 @@
           <w:noProof/>
           <w:webHidden/>
         </w:rPr>
-        <w:instrText xml:space="preserve"> PAGEREF _Toc244294028 \h </w:instrText>
+        <w:instrText xml:space="preserve"> PAGEREF _Toc244294442 \h </w:instrText>
       </w:r>
       <w:r>
         <w:rPr>
@@ -3063,7 +3063,7 @@
           <w:noProof/>
           <w:webHidden/>
         </w:rPr>
-        <w:instrText xml:space="preserve"> PAGEREF _Toc244294029 \h </w:instrText>
+        <w:instrText xml:space="preserve"> PAGEREF _Toc244294443 \h </w:instrText>
       </w:r>
       <w:r>
         <w:rPr>
@@ -3135,7 +3135,7 @@
           <w:noProof/>
           <w:webHidden/>
         </w:rPr>
-        <w:instrText xml:space="preserve"> PAGEREF _Toc244294030 \h </w:instrText>
+        <w:instrText xml:space="preserve"> PAGEREF _Toc244294444 \h </w:instrText>
       </w:r>
       <w:r>
         <w:rPr>
@@ -3207,7 +3207,7 @@
           <w:noProof/>
           <w:webHidden/>
         </w:rPr>
-        <w:instrText xml:space="preserve"> PAGEREF _Toc244294031 \h </w:instrText>
+        <w:instrText xml:space="preserve"> PAGEREF _Toc244294445 \h </w:instrText>
       </w:r>
       <w:r>
         <w:rPr>
@@ -3279,7 +3279,7 @@
           <w:noProof/>
           <w:webHidden/>
         </w:rPr>
-        <w:instrText xml:space="preserve"> PAGEREF _Toc244294032 \h </w:instrText>
+        <w:instrText xml:space="preserve"> PAGEREF _Toc244294446 \h </w:instrText>
       </w:r>
       <w:r>
         <w:rPr>
@@ -3351,7 +3351,7 @@
           <w:noProof/>
           <w:webHidden/>
         </w:rPr>
-        <w:instrText xml:space="preserve"> PAGEREF _Toc244294033 \h </w:instrText>
+        <w:instrText xml:space="preserve"> PAGEREF _Toc244294447 \h </w:instrText>
       </w:r>
       <w:r>
         <w:rPr>
@@ -3423,7 +3423,7 @@
           <w:noProof/>
           <w:webHidden/>
         </w:rPr>
-        <w:instrText xml:space="preserve"> PAGEREF _Toc244294034 \h </w:instrText>
+        <w:instrText xml:space="preserve"> PAGEREF _Toc244294448 \h </w:instrText>
       </w:r>
       <w:r>
         <w:rPr>
@@ -3495,7 +3495,7 @@
           <w:noProof/>
           <w:webHidden/>
         </w:rPr>
-        <w:instrText xml:space="preserve"> PAGEREF _Toc244294035 \h </w:instrText>
+        <w:instrText xml:space="preserve"> PAGEREF _Toc244294449 \h </w:instrText>
       </w:r>
       <w:r>
         <w:rPr>
@@ -3567,7 +3567,7 @@
           <w:noProof/>
           <w:webHidden/>
         </w:rPr>
-        <w:instrText xml:space="preserve"> PAGEREF _Toc244294036 \h </w:instrText>
+        <w:instrText xml:space="preserve"> PAGEREF _Toc244294450 \h </w:instrText>
       </w:r>
       <w:r>
         <w:rPr>
@@ -3640,7 +3640,7 @@
           <w:noProof/>
           <w:webHidden/>
         </w:rPr>
-        <w:instrText xml:space="preserve"> PAGEREF _Toc244294037 \h </w:instrText>
+        <w:instrText xml:space="preserve"> PAGEREF _Toc244294451 \h </w:instrText>
       </w:r>
       <w:r>
         <w:rPr>
@@ -4764,12 +4764,12 @@
         <w:tblW w:w="0" w:type="auto"/>
         <w:jc w:val="center"/>
         <w:tblBorders>
-          <w:top w:val="nil"/>
-          <w:left w:val="nil"/>
-          <w:bottom w:val="nil"/>
-          <w:right w:val="nil"/>
-          <w:insideH w:val="nil"/>
-          <w:insideV w:val="nil"/>
+          <w:top w:val="single" w:sz="6" w:space="0" w:color="000000"/>
+          <w:left w:val="single" w:sz="6" w:space="0" w:color="000000"/>
+          <w:bottom w:val="single" w:sz="6" w:space="0" w:color="000000"/>
+          <w:right w:val="single" w:sz="6" w:space="0" w:color="000000"/>
+          <w:insideH w:val="single" w:sz="6" w:space="0" w:color="000000"/>
+          <w:insideV w:val="single" w:sz="6" w:space="0" w:color="000000"/>
         </w:tblBorders>
         <w:tblLayout w:type="fixed"/>
         <w:tblCellMar>
@@ -4791,13 +4791,11 @@
         <w:tc>
           <w:tcPr>
             <w:tcW w:w="1512" w:type="dxa"/>
-            <w:tcBorders>
-              <w:bottom w:val="single" w:sz="6" w:space="0" w:color="000000"/>
-            </w:tcBorders>
-          </w:tcPr>
-          <w:p>
-            <w:pPr>
-              <w:spacing w:before="40"/>
+            <w:shd w:val="clear" w:color="auto" w:fill="DDEBF7"/>
+          </w:tcPr>
+          <w:p>
+            <w:pPr>
+              <w:spacing w:before="40" w:line="240" w:lineRule="auto"/>
             </w:pPr>
             <w:r>
               <w:rPr>
@@ -4811,13 +4809,11 @@
         <w:tc>
           <w:tcPr>
             <w:tcW w:w="6696" w:type="dxa"/>
-            <w:tcBorders>
-              <w:bottom w:val="single" w:sz="6" w:space="0" w:color="000000"/>
-            </w:tcBorders>
-          </w:tcPr>
-          <w:p>
-            <w:pPr>
-              <w:spacing w:before="40"/>
+            <w:shd w:val="clear" w:color="auto" w:fill="DDEBF7"/>
+          </w:tcPr>
+          <w:p>
+            <w:pPr>
+              <w:spacing w:before="40" w:line="240" w:lineRule="auto"/>
             </w:pPr>
             <w:r>
               <w:rPr>
@@ -4844,8 +4840,7 @@
             </w:pPr>
             <w:r>
               <w:rPr>
-                <w:b/>
-                <w:sz w:val="20"/>
+                <w:sz w:val="19"/>
               </w:rPr>
               <w:t>API</w:t>
             </w:r>
@@ -4861,7 +4856,7 @@
             </w:pPr>
             <w:r>
               <w:rPr>
-                <w:sz w:val="20"/>
+                <w:sz w:val="19"/>
               </w:rPr>
               <w:t>Application Programming Interface</w:t>
             </w:r>
@@ -4883,8 +4878,7 @@
             </w:pPr>
             <w:r>
               <w:rPr>
-                <w:b/>
-                <w:sz w:val="20"/>
+                <w:sz w:val="19"/>
               </w:rPr>
               <w:t>CDN</w:t>
             </w:r>
@@ -4900,7 +4894,7 @@
             </w:pPr>
             <w:r>
               <w:rPr>
-                <w:sz w:val="20"/>
+                <w:sz w:val="19"/>
               </w:rPr>
               <w:t>Content Delivery Network</w:t>
             </w:r>
@@ -4922,8 +4916,7 @@
             </w:pPr>
             <w:r>
               <w:rPr>
-                <w:b/>
-                <w:sz w:val="20"/>
+                <w:sz w:val="19"/>
               </w:rPr>
               <w:t>CI/CD</w:t>
             </w:r>
@@ -4939,7 +4932,7 @@
             </w:pPr>
             <w:r>
               <w:rPr>
-                <w:sz w:val="20"/>
+                <w:sz w:val="19"/>
               </w:rPr>
               <w:t>Continuous Integration / Continuous Delivery</w:t>
             </w:r>
@@ -4961,8 +4954,7 @@
             </w:pPr>
             <w:r>
               <w:rPr>
-                <w:b/>
-                <w:sz w:val="20"/>
+                <w:sz w:val="19"/>
               </w:rPr>
               <w:t>CSPRNG</w:t>
             </w:r>
@@ -4978,7 +4970,7 @@
             </w:pPr>
             <w:r>
               <w:rPr>
-                <w:sz w:val="20"/>
+                <w:sz w:val="19"/>
               </w:rPr>
               <w:t>Cryptographically Secure Pseudo-Random Number Generator</w:t>
             </w:r>
@@ -5000,8 +4992,7 @@
             </w:pPr>
             <w:r>
               <w:rPr>
-                <w:b/>
-                <w:sz w:val="20"/>
+                <w:sz w:val="19"/>
               </w:rPr>
               <w:t>CSV</w:t>
             </w:r>
@@ -5017,7 +5008,7 @@
             </w:pPr>
             <w:r>
               <w:rPr>
-                <w:sz w:val="20"/>
+                <w:sz w:val="19"/>
               </w:rPr>
               <w:t>Comma-Separated Values</w:t>
             </w:r>
@@ -5039,8 +5030,7 @@
             </w:pPr>
             <w:r>
               <w:rPr>
-                <w:b/>
-                <w:sz w:val="20"/>
+                <w:sz w:val="19"/>
               </w:rPr>
               <w:t>DOM</w:t>
             </w:r>
@@ -5056,7 +5046,7 @@
             </w:pPr>
             <w:r>
               <w:rPr>
-                <w:sz w:val="20"/>
+                <w:sz w:val="19"/>
               </w:rPr>
               <w:t>Document Object Model</w:t>
             </w:r>
@@ -5078,8 +5068,7 @@
             </w:pPr>
             <w:r>
               <w:rPr>
-                <w:b/>
-                <w:sz w:val="20"/>
+                <w:sz w:val="19"/>
               </w:rPr>
               <w:t>DPDP</w:t>
             </w:r>
@@ -5095,7 +5084,7 @@
             </w:pPr>
             <w:r>
               <w:rPr>
-                <w:sz w:val="20"/>
+                <w:sz w:val="19"/>
               </w:rPr>
               <w:t>Digital Personal Data Protection (Act, 2023)</w:t>
             </w:r>
@@ -5117,8 +5106,7 @@
             </w:pPr>
             <w:r>
               <w:rPr>
-                <w:b/>
-                <w:sz w:val="20"/>
+                <w:sz w:val="19"/>
               </w:rPr>
               <w:t>GPS</w:t>
             </w:r>
@@ -5134,7 +5122,7 @@
             </w:pPr>
             <w:r>
               <w:rPr>
-                <w:sz w:val="20"/>
+                <w:sz w:val="19"/>
               </w:rPr>
               <w:t>Global Positioning System</w:t>
             </w:r>
@@ -5156,8 +5144,7 @@
             </w:pPr>
             <w:r>
               <w:rPr>
-                <w:b/>
-                <w:sz w:val="20"/>
+                <w:sz w:val="19"/>
               </w:rPr>
               <w:t>HMAC</w:t>
             </w:r>
@@ -5173,7 +5160,7 @@
             </w:pPr>
             <w:r>
               <w:rPr>
-                <w:sz w:val="20"/>
+                <w:sz w:val="19"/>
               </w:rPr>
               <w:t>Keyed-Hash Message Authentication Code</w:t>
             </w:r>
@@ -5195,8 +5182,7 @@
             </w:pPr>
             <w:r>
               <w:rPr>
-                <w:b/>
-                <w:sz w:val="20"/>
+                <w:sz w:val="19"/>
               </w:rPr>
               <w:t>HTTP</w:t>
             </w:r>
@@ -5212,7 +5198,7 @@
             </w:pPr>
             <w:r>
               <w:rPr>
-                <w:sz w:val="20"/>
+                <w:sz w:val="19"/>
               </w:rPr>
               <w:t>Hypertext Transfer Protocol</w:t>
             </w:r>
@@ -5234,8 +5220,7 @@
             </w:pPr>
             <w:r>
               <w:rPr>
-                <w:b/>
-                <w:sz w:val="20"/>
+                <w:sz w:val="19"/>
               </w:rPr>
               <w:t>INR</w:t>
             </w:r>
@@ -5251,7 +5236,7 @@
             </w:pPr>
             <w:r>
               <w:rPr>
-                <w:sz w:val="20"/>
+                <w:sz w:val="19"/>
               </w:rPr>
               <w:t>Indian Rupee</w:t>
             </w:r>
@@ -5273,8 +5258,7 @@
             </w:pPr>
             <w:r>
               <w:rPr>
-                <w:b/>
-                <w:sz w:val="20"/>
+                <w:sz w:val="19"/>
               </w:rPr>
               <w:t>IoT</w:t>
             </w:r>
@@ -5290,7 +5274,7 @@
             </w:pPr>
             <w:r>
               <w:rPr>
-                <w:sz w:val="20"/>
+                <w:sz w:val="19"/>
               </w:rPr>
               <w:t>Internet of Things</w:t>
             </w:r>
@@ -5312,8 +5296,7 @@
             </w:pPr>
             <w:r>
               <w:rPr>
-                <w:b/>
-                <w:sz w:val="20"/>
+                <w:sz w:val="19"/>
               </w:rPr>
               <w:t>JSON</w:t>
             </w:r>
@@ -5329,7 +5312,7 @@
             </w:pPr>
             <w:r>
               <w:rPr>
-                <w:sz w:val="20"/>
+                <w:sz w:val="19"/>
               </w:rPr>
               <w:t>JavaScript Object Notation</w:t>
             </w:r>
@@ -5351,8 +5334,7 @@
             </w:pPr>
             <w:r>
               <w:rPr>
-                <w:b/>
-                <w:sz w:val="20"/>
+                <w:sz w:val="19"/>
               </w:rPr>
               <w:t>JWT</w:t>
             </w:r>
@@ -5368,7 +5350,7 @@
             </w:pPr>
             <w:r>
               <w:rPr>
-                <w:sz w:val="20"/>
+                <w:sz w:val="19"/>
               </w:rPr>
               <w:t>JSON Web Token</w:t>
             </w:r>
@@ -5390,8 +5372,7 @@
             </w:pPr>
             <w:r>
               <w:rPr>
-                <w:b/>
-                <w:sz w:val="20"/>
+                <w:sz w:val="19"/>
               </w:rPr>
               <w:t>KPI</w:t>
             </w:r>
@@ -5407,7 +5388,7 @@
             </w:pPr>
             <w:r>
               <w:rPr>
-                <w:sz w:val="20"/>
+                <w:sz w:val="19"/>
               </w:rPr>
               <w:t>Key Performance Indicator</w:t>
             </w:r>
@@ -5429,8 +5410,7 @@
             </w:pPr>
             <w:r>
               <w:rPr>
-                <w:b/>
-                <w:sz w:val="20"/>
+                <w:sz w:val="19"/>
               </w:rPr>
               <w:t>NIST</w:t>
             </w:r>
@@ -5446,7 +5426,7 @@
             </w:pPr>
             <w:r>
               <w:rPr>
-                <w:sz w:val="20"/>
+                <w:sz w:val="19"/>
               </w:rPr>
               <w:t>National Institute of Standards and Technology</w:t>
             </w:r>
@@ -5468,8 +5448,7 @@
             </w:pPr>
             <w:r>
               <w:rPr>
-                <w:b/>
-                <w:sz w:val="20"/>
+                <w:sz w:val="19"/>
               </w:rPr>
               <w:t>P1</w:t>
             </w:r>
@@ -5485,7 +5464,7 @@
             </w:pPr>
             <w:r>
               <w:rPr>
-                <w:sz w:val="20"/>
+                <w:sz w:val="19"/>
               </w:rPr>
               <w:t>Priority One</w:t>
             </w:r>
@@ -5507,8 +5486,7 @@
             </w:pPr>
             <w:r>
               <w:rPr>
-                <w:b/>
-                <w:sz w:val="20"/>
+                <w:sz w:val="19"/>
               </w:rPr>
               <w:t>POD</w:t>
             </w:r>
@@ -5524,7 +5502,7 @@
             </w:pPr>
             <w:r>
               <w:rPr>
-                <w:sz w:val="20"/>
+                <w:sz w:val="19"/>
               </w:rPr>
               <w:t>Proof of Delivery</w:t>
             </w:r>
@@ -5546,8 +5524,7 @@
             </w:pPr>
             <w:r>
               <w:rPr>
-                <w:b/>
-                <w:sz w:val="20"/>
+                <w:sz w:val="19"/>
               </w:rPr>
               <w:t>QR</w:t>
             </w:r>
@@ -5563,7 +5540,7 @@
             </w:pPr>
             <w:r>
               <w:rPr>
-                <w:sz w:val="20"/>
+                <w:sz w:val="19"/>
               </w:rPr>
               <w:t>Quick Response</w:t>
             </w:r>
@@ -5585,8 +5562,7 @@
             </w:pPr>
             <w:r>
               <w:rPr>
-                <w:b/>
-                <w:sz w:val="20"/>
+                <w:sz w:val="19"/>
               </w:rPr>
               <w:t>RBAC</w:t>
             </w:r>
@@ -5602,7 +5578,7 @@
             </w:pPr>
             <w:r>
               <w:rPr>
-                <w:sz w:val="20"/>
+                <w:sz w:val="19"/>
               </w:rPr>
               <w:t>Role-Based Access Control</w:t>
             </w:r>
@@ -5624,8 +5600,7 @@
             </w:pPr>
             <w:r>
               <w:rPr>
-                <w:b/>
-                <w:sz w:val="20"/>
+                <w:sz w:val="19"/>
               </w:rPr>
               <w:t>REST</w:t>
             </w:r>
@@ -5641,7 +5616,7 @@
             </w:pPr>
             <w:r>
               <w:rPr>
-                <w:sz w:val="20"/>
+                <w:sz w:val="19"/>
               </w:rPr>
               <w:t>Representational State Transfer</w:t>
             </w:r>
@@ -5663,8 +5638,7 @@
             </w:pPr>
             <w:r>
               <w:rPr>
-                <w:b/>
-                <w:sz w:val="20"/>
+                <w:sz w:val="19"/>
               </w:rPr>
               <w:t>SDK</w:t>
             </w:r>
@@ -5680,7 +5654,7 @@
             </w:pPr>
             <w:r>
               <w:rPr>
-                <w:sz w:val="20"/>
+                <w:sz w:val="19"/>
               </w:rPr>
               <w:t>Software Development Kit</w:t>
             </w:r>
@@ -5702,8 +5676,7 @@
             </w:pPr>
             <w:r>
               <w:rPr>
-                <w:b/>
-                <w:sz w:val="20"/>
+                <w:sz w:val="19"/>
               </w:rPr>
               <w:t>SPA</w:t>
             </w:r>
@@ -5719,7 +5692,7 @@
             </w:pPr>
             <w:r>
               <w:rPr>
-                <w:sz w:val="20"/>
+                <w:sz w:val="19"/>
               </w:rPr>
               <w:t>Single-Page Application</w:t>
             </w:r>
@@ -5741,8 +5714,7 @@
             </w:pPr>
             <w:r>
               <w:rPr>
-                <w:b/>
-                <w:sz w:val="20"/>
+                <w:sz w:val="19"/>
               </w:rPr>
               <w:t>SRS</w:t>
             </w:r>
@@ -5758,7 +5730,7 @@
             </w:pPr>
             <w:r>
               <w:rPr>
-                <w:sz w:val="20"/>
+                <w:sz w:val="19"/>
               </w:rPr>
               <w:t>Software Requirements Specification</w:t>
             </w:r>
@@ -5780,8 +5752,7 @@
             </w:pPr>
             <w:r>
               <w:rPr>
-                <w:b/>
-                <w:sz w:val="20"/>
+                <w:sz w:val="19"/>
               </w:rPr>
               <w:t>TLS</w:t>
             </w:r>
@@ -5797,7 +5768,7 @@
             </w:pPr>
             <w:r>
               <w:rPr>
-                <w:sz w:val="20"/>
+                <w:sz w:val="19"/>
               </w:rPr>
               <w:t>Transport Layer Security</w:t>
             </w:r>
@@ -5819,8 +5790,7 @@
             </w:pPr>
             <w:r>
               <w:rPr>
-                <w:b/>
-                <w:sz w:val="20"/>
+                <w:sz w:val="19"/>
               </w:rPr>
               <w:t>TMS</w:t>
             </w:r>
@@ -5836,7 +5806,7 @@
             </w:pPr>
             <w:r>
               <w:rPr>
-                <w:sz w:val="20"/>
+                <w:sz w:val="19"/>
               </w:rPr>
               <w:t>Transport Management System</w:t>
             </w:r>
@@ -5858,8 +5828,7 @@
             </w:pPr>
             <w:r>
               <w:rPr>
-                <w:b/>
-                <w:sz w:val="20"/>
+                <w:sz w:val="19"/>
               </w:rPr>
               <w:t>UI</w:t>
             </w:r>
@@ -5875,7 +5844,7 @@
             </w:pPr>
             <w:r>
               <w:rPr>
-                <w:sz w:val="20"/>
+                <w:sz w:val="19"/>
               </w:rPr>
               <w:t>User Interface</w:t>
             </w:r>
@@ -5897,8 +5866,7 @@
             </w:pPr>
             <w:r>
               <w:rPr>
-                <w:b/>
-                <w:sz w:val="20"/>
+                <w:sz w:val="19"/>
               </w:rPr>
               <w:t>URL</w:t>
             </w:r>
@@ -5914,7 +5882,7 @@
             </w:pPr>
             <w:r>
               <w:rPr>
-                <w:sz w:val="20"/>
+                <w:sz w:val="19"/>
               </w:rPr>
               <w:t>Uniform Resource Locator</w:t>
             </w:r>
@@ -5936,8 +5904,7 @@
             </w:pPr>
             <w:r>
               <w:rPr>
-                <w:b/>
-                <w:sz w:val="20"/>
+                <w:sz w:val="19"/>
               </w:rPr>
               <w:t>UTC</w:t>
             </w:r>
@@ -5953,7 +5920,7 @@
             </w:pPr>
             <w:r>
               <w:rPr>
-                <w:sz w:val="20"/>
+                <w:sz w:val="19"/>
               </w:rPr>
               <w:t>Coordinated Universal Time</w:t>
             </w:r>
@@ -5975,8 +5942,7 @@
             </w:pPr>
             <w:r>
               <w:rPr>
-                <w:b/>
-                <w:sz w:val="20"/>
+                <w:sz w:val="19"/>
               </w:rPr>
               <w:t>UUID</w:t>
             </w:r>
@@ -5992,7 +5958,7 @@
             </w:pPr>
             <w:r>
               <w:rPr>
-                <w:sz w:val="20"/>
+                <w:sz w:val="19"/>
               </w:rPr>
               <w:t>Universally Unique Identifier</w:t>
             </w:r>
@@ -6014,8 +5980,7 @@
             </w:pPr>
             <w:r>
               <w:rPr>
-                <w:b/>
-                <w:sz w:val="20"/>
+                <w:sz w:val="19"/>
               </w:rPr>
               <w:t>W3C</w:t>
             </w:r>
@@ -6031,7 +5996,7 @@
             </w:pPr>
             <w:r>
               <w:rPr>
-                <w:sz w:val="20"/>
+                <w:sz w:val="19"/>
               </w:rPr>
               <w:t>World Wide Web Consortium</w:t>
             </w:r>
@@ -6053,8 +6018,7 @@
             </w:pPr>
             <w:r>
               <w:rPr>
-                <w:b/>
-                <w:sz w:val="20"/>
+                <w:sz w:val="19"/>
               </w:rPr>
               <w:t>XSS</w:t>
             </w:r>
@@ -6070,7 +6034,7 @@
             </w:pPr>
             <w:r>
               <w:rPr>
-                <w:sz w:val="20"/>
+                <w:sz w:val="19"/>
               </w:rPr>
               <w:t>Cross-Site Scripting</w:t>
             </w:r>
@@ -6092,8 +6056,7 @@
             </w:pPr>
             <w:r>
               <w:rPr>
-                <w:b/>
-                <w:sz w:val="20"/>
+                <w:sz w:val="19"/>
               </w:rPr>
               <w:t>ZTA</w:t>
             </w:r>
@@ -6109,7 +6072,7 @@
             </w:pPr>
             <w:r>
               <w:rPr>
-                <w:sz w:val="20"/>
+                <w:sz w:val="19"/>
               </w:rPr>
               <w:t>Zero Trust Architecture</w:t>
             </w:r>
@@ -6140,7 +6103,7 @@
       <w:pPr>
         <w:pStyle w:val="Heading1"/>
       </w:pPr>
-      <w:bookmarkStart w:id="7" w:name="_Toc244294010"/>
+      <w:bookmarkStart w:id="7" w:name="_Toc244294424"/>
       <w:r>
         <w:lastRenderedPageBreak/>
         <w:t>1. Introduction</w:t>
@@ -6151,7 +6114,7 @@
       <w:pPr>
         <w:pStyle w:val="Heading2"/>
       </w:pPr>
-      <w:bookmarkStart w:id="8" w:name="_Toc244294011"/>
+      <w:bookmarkStart w:id="8" w:name="_Toc244294425"/>
       <w:r>
         <w:t>1.1 Background</w:t>
       </w:r>
@@ -6174,7 +6137,7 @@
       <w:pPr>
         <w:pStyle w:val="Heading2"/>
       </w:pPr>
-      <w:bookmarkStart w:id="9" w:name="_Toc244294012"/>
+      <w:bookmarkStart w:id="9" w:name="_Toc244294426"/>
       <w:r>
         <w:t>1.2 Motivation</w:t>
       </w:r>
@@ -6269,7 +6232,7 @@
       <w:pPr>
         <w:pStyle w:val="Heading2"/>
       </w:pPr>
-      <w:bookmarkStart w:id="10" w:name="_Toc244294013"/>
+      <w:bookmarkStart w:id="10" w:name="_Toc244294427"/>
       <w:r>
         <w:t>1.3 Problem Statement</w:t>
       </w:r>
@@ -6376,7 +6339,7 @@
       <w:pPr>
         <w:pStyle w:val="Heading2"/>
       </w:pPr>
-      <w:bookmarkStart w:id="11" w:name="_Toc244294014"/>
+      <w:bookmarkStart w:id="11" w:name="_Toc244294428"/>
       <w:r>
         <w:t>1.4 Objectives</w:t>
       </w:r>
@@ -6491,7 +6454,7 @@
       <w:pPr>
         <w:pStyle w:val="Heading2"/>
       </w:pPr>
-      <w:bookmarkStart w:id="12" w:name="_Toc244294015"/>
+      <w:bookmarkStart w:id="12" w:name="_Toc244294429"/>
       <w:r>
         <w:t>1.5 Scope of the Seminar</w:t>
       </w:r>
@@ -6553,7 +6516,7 @@
       <w:pPr>
         <w:pStyle w:val="Heading1"/>
       </w:pPr>
-      <w:bookmarkStart w:id="13" w:name="_Toc244294016"/>
+      <w:bookmarkStart w:id="13" w:name="_Toc244294430"/>
       <w:r>
         <w:lastRenderedPageBreak/>
         <w:t>2. Literature Survey</w:t>
@@ -6564,7 +6527,7 @@
       <w:pPr>
         <w:pStyle w:val="Heading2"/>
       </w:pPr>
-      <w:bookmarkStart w:id="14" w:name="_Toc244294017"/>
+      <w:bookmarkStart w:id="14" w:name="_Toc244294431"/>
       <w:r>
         <w:t>2.1 Existing Work and Related Studies</w:t>
       </w:r>
@@ -6608,7 +6571,7 @@
       <w:pPr>
         <w:pStyle w:val="Heading2"/>
       </w:pPr>
-      <w:bookmarkStart w:id="15" w:name="_Toc244294018"/>
+      <w:bookmarkStart w:id="15" w:name="_Toc244294432"/>
       <w:r>
         <w:t>2.2 Summary of Research Papers</w:t>
       </w:r>
@@ -7548,7 +7511,7 @@
       <w:pPr>
         <w:pStyle w:val="Heading2"/>
       </w:pPr>
-      <w:bookmarkStart w:id="17" w:name="_Toc244294019"/>
+      <w:bookmarkStart w:id="17" w:name="_Toc244294433"/>
       <w:r>
         <w:t>2.3 Research Gaps</w:t>
       </w:r>
@@ -7684,7 +7647,7 @@
       <w:pPr>
         <w:pStyle w:val="Heading1"/>
       </w:pPr>
-      <w:bookmarkStart w:id="18" w:name="_Toc244294020"/>
+      <w:bookmarkStart w:id="18" w:name="_Toc244294434"/>
       <w:r>
         <w:lastRenderedPageBreak/>
         <w:t>3. Overview of the ChainGuard v2 Control Plane</w:t>
@@ -7695,7 +7658,7 @@
       <w:pPr>
         <w:pStyle w:val="Heading2"/>
       </w:pPr>
-      <w:bookmarkStart w:id="19" w:name="_Toc244294021"/>
+      <w:bookmarkStart w:id="19" w:name="_Toc244294435"/>
       <w:r>
         <w:t>3.1 Definition and Concept</w:t>
       </w:r>
@@ -7875,7 +7838,7 @@
       <w:pPr>
         <w:pStyle w:val="Heading2"/>
       </w:pPr>
-      <w:bookmarkStart w:id="20" w:name="_Toc244294022"/>
+      <w:bookmarkStart w:id="20" w:name="_Toc244294436"/>
       <w:r>
         <w:t>3.2 Architecture / Block Diagram</w:t>
       </w:r>
@@ -7892,7 +7855,7 @@
           <w:noProof/>
         </w:rPr>
         <w:drawing>
-          <wp:inline distT="0" distB="0" distL="0" distR="0" wp14:anchorId="0E7EF65D" wp14:editId="37BE03BC">
+          <wp:inline distT="0" distB="0" distL="0" distR="0" wp14:anchorId="1215BB9B" wp14:editId="66CAED44">
             <wp:extent cx="4572000" cy="3304515"/>
             <wp:effectExtent l="0" t="0" r="0" b="0"/>
             <wp:docPr id="5" name="Picture 5"/>
@@ -8064,7 +8027,7 @@
       <w:pPr>
         <w:pStyle w:val="Heading2"/>
       </w:pPr>
-      <w:bookmarkStart w:id="22" w:name="_Toc244294023"/>
+      <w:bookmarkStart w:id="22" w:name="_Toc244294437"/>
       <w:r>
         <w:t>3.3 Key Components and Technologies</w:t>
       </w:r>
@@ -8271,7 +8234,7 @@
           <w:noProof/>
         </w:rPr>
         <w:drawing>
-          <wp:inline distT="0" distB="0" distL="0" distR="0" wp14:anchorId="0FA214BF" wp14:editId="5802A7DF">
+          <wp:inline distT="0" distB="0" distL="0" distR="0" wp14:anchorId="11FD403E" wp14:editId="3B964BA3">
             <wp:extent cx="4572000" cy="2942376"/>
             <wp:effectExtent l="0" t="0" r="0" b="0"/>
             <wp:docPr id="6" name="Picture 6"/>
@@ -9186,7 +9149,7 @@
       <w:pPr>
         <w:pStyle w:val="Heading1"/>
       </w:pPr>
-      <w:bookmarkStart w:id="25" w:name="_Toc244294024"/>
+      <w:bookmarkStart w:id="25" w:name="_Toc244294438"/>
       <w:r>
         <w:lastRenderedPageBreak/>
         <w:t>4. Working / Methodology</w:t>
@@ -9197,7 +9160,7 @@
       <w:pPr>
         <w:pStyle w:val="Heading2"/>
       </w:pPr>
-      <w:bookmarkStart w:id="26" w:name="_Toc244294025"/>
+      <w:bookmarkStart w:id="26" w:name="_Toc244294439"/>
       <w:r>
         <w:t>4.1 Working Principle</w:t>
       </w:r>
@@ -9219,7 +9182,7 @@
           <w:noProof/>
         </w:rPr>
         <w:drawing>
-          <wp:inline distT="0" distB="0" distL="0" distR="0" wp14:anchorId="78EEF099" wp14:editId="01910E94">
+          <wp:inline distT="0" distB="0" distL="0" distR="0" wp14:anchorId="0FE08023" wp14:editId="32A082FA">
             <wp:extent cx="4572000" cy="3213980"/>
             <wp:effectExtent l="0" t="0" r="0" b="0"/>
             <wp:docPr id="7" name="Picture 7"/>
@@ -9495,7 +9458,7 @@
       <w:pPr>
         <w:pStyle w:val="Heading2"/>
       </w:pPr>
-      <w:bookmarkStart w:id="28" w:name="_Toc244294026"/>
+      <w:bookmarkStart w:id="28" w:name="_Toc244294440"/>
       <w:r>
         <w:t>4.2 Algorithms / Techniques Used</w:t>
       </w:r>
@@ -9881,7 +9844,7 @@
         </w:rPr>
         <w:lastRenderedPageBreak/>
         <w:drawing>
-          <wp:inline distT="0" distB="0" distL="0" distR="0" wp14:anchorId="34E8F3F2" wp14:editId="67E35CE2">
+          <wp:inline distT="0" distB="0" distL="0" distR="0" wp14:anchorId="52CD7681" wp14:editId="2F4809DB">
             <wp:extent cx="4572000" cy="3224463"/>
             <wp:effectExtent l="0" t="0" r="0" b="0"/>
             <wp:docPr id="8" name="Picture 8"/>
@@ -10263,7 +10226,7 @@
       <w:pPr>
         <w:pStyle w:val="Heading2"/>
       </w:pPr>
-      <w:bookmarkStart w:id="30" w:name="_Toc244294027"/>
+      <w:bookmarkStart w:id="30" w:name="_Toc244294441"/>
       <w:r>
         <w:t>4.3 Tools and Platforms</w:t>
       </w:r>
@@ -11707,7 +11670,7 @@
       <w:pPr>
         <w:pStyle w:val="Heading1"/>
       </w:pPr>
-      <w:bookmarkStart w:id="33" w:name="_Toc244294028"/>
+      <w:bookmarkStart w:id="33" w:name="_Toc244294442"/>
       <w:r>
         <w:lastRenderedPageBreak/>
         <w:t>5. Applications</w:t>
@@ -11718,7 +11681,7 @@
       <w:pPr>
         <w:pStyle w:val="Heading2"/>
       </w:pPr>
-      <w:bookmarkStart w:id="34" w:name="_Toc244294029"/>
+      <w:bookmarkStart w:id="34" w:name="_Toc244294443"/>
       <w:r>
         <w:t>5.1 Real-World Use Cases</w:t>
       </w:r>
@@ -11858,7 +11821,7 @@
       <w:pPr>
         <w:pStyle w:val="Heading2"/>
       </w:pPr>
-      <w:bookmarkStart w:id="35" w:name="_Toc244294030"/>
+      <w:bookmarkStart w:id="35" w:name="_Toc244294444"/>
       <w:r>
         <w:t>5.2 Case Study</w:t>
       </w:r>
@@ -11952,7 +11915,7 @@
       <w:pPr>
         <w:pStyle w:val="Heading1"/>
       </w:pPr>
-      <w:bookmarkStart w:id="36" w:name="_Toc244294031"/>
+      <w:bookmarkStart w:id="36" w:name="_Toc244294445"/>
       <w:r>
         <w:lastRenderedPageBreak/>
         <w:t>6. Advantages and Limitations</w:t>
@@ -11963,7 +11926,7 @@
       <w:pPr>
         <w:pStyle w:val="Heading2"/>
       </w:pPr>
-      <w:bookmarkStart w:id="37" w:name="_Toc244294032"/>
+      <w:bookmarkStart w:id="37" w:name="_Toc244294446"/>
       <w:r>
         <w:t>6.1 Advantages</w:t>
       </w:r>
@@ -12153,7 +12116,7 @@
       <w:pPr>
         <w:pStyle w:val="Heading2"/>
       </w:pPr>
-      <w:bookmarkStart w:id="38" w:name="_Toc244294033"/>
+      <w:bookmarkStart w:id="38" w:name="_Toc244294447"/>
       <w:r>
         <w:t>6.2 Limitations / Challenges</w:t>
       </w:r>
@@ -12449,7 +12412,7 @@
       <w:pPr>
         <w:pStyle w:val="Heading1"/>
       </w:pPr>
-      <w:bookmarkStart w:id="39" w:name="_Toc244294034"/>
+      <w:bookmarkStart w:id="39" w:name="_Toc244294448"/>
       <w:r>
         <w:lastRenderedPageBreak/>
         <w:t>7. Comparison with Existing Technologies</w:t>
@@ -13521,7 +13484,7 @@
       <w:pPr>
         <w:pStyle w:val="Heading1"/>
       </w:pPr>
-      <w:bookmarkStart w:id="41" w:name="_Toc244294035"/>
+      <w:bookmarkStart w:id="41" w:name="_Toc244294449"/>
       <w:r>
         <w:lastRenderedPageBreak/>
         <w:t>8. Future Scope</w:t>
@@ -13718,7 +13681,7 @@
       <w:pPr>
         <w:pStyle w:val="Heading1"/>
       </w:pPr>
-      <w:bookmarkStart w:id="42" w:name="_Toc244294036"/>
+      <w:bookmarkStart w:id="42" w:name="_Toc244294450"/>
       <w:r>
         <w:lastRenderedPageBreak/>
         <w:t>9. Conclusion</w:t>
@@ -13767,7 +13730,7 @@
         <w:spacing w:after="360"/>
         <w:jc w:val="center"/>
       </w:pPr>
-      <w:bookmarkStart w:id="43" w:name="_Toc244294037"/>
+      <w:bookmarkStart w:id="43" w:name="_Toc244294451"/>
       <w:r>
         <w:rPr>
           <w:rFonts w:ascii="Times New Roman" w:eastAsia="Times New Roman" w:hAnsi="Times New Roman" w:cs="Times New Roman"/>
@@ -16077,31 +16040,31 @@
       </w:rPr>
     </w:lvl>
   </w:abstractNum>
-  <w:num w:numId="1" w16cid:durableId="121271064">
+  <w:num w:numId="1" w16cid:durableId="345644860">
     <w:abstractNumId w:val="8"/>
   </w:num>
-  <w:num w:numId="2" w16cid:durableId="1771315012">
+  <w:num w:numId="2" w16cid:durableId="1397239438">
     <w:abstractNumId w:val="6"/>
   </w:num>
-  <w:num w:numId="3" w16cid:durableId="1558470182">
+  <w:num w:numId="3" w16cid:durableId="1903563432">
     <w:abstractNumId w:val="5"/>
   </w:num>
-  <w:num w:numId="4" w16cid:durableId="1450397859">
+  <w:num w:numId="4" w16cid:durableId="1814979379">
     <w:abstractNumId w:val="4"/>
   </w:num>
-  <w:num w:numId="5" w16cid:durableId="1926525915">
+  <w:num w:numId="5" w16cid:durableId="1798446279">
     <w:abstractNumId w:val="7"/>
   </w:num>
-  <w:num w:numId="6" w16cid:durableId="611088935">
+  <w:num w:numId="6" w16cid:durableId="34473922">
     <w:abstractNumId w:val="3"/>
   </w:num>
-  <w:num w:numId="7" w16cid:durableId="2070298663">
+  <w:num w:numId="7" w16cid:durableId="1824278002">
     <w:abstractNumId w:val="2"/>
   </w:num>
-  <w:num w:numId="8" w16cid:durableId="1401757502">
+  <w:num w:numId="8" w16cid:durableId="213975499">
     <w:abstractNumId w:val="1"/>
   </w:num>
-  <w:num w:numId="9" w16cid:durableId="1518157285">
+  <w:num w:numId="9" w16cid:durableId="1475759390">
     <w:abstractNumId w:val="0"/>
   </w:num>
 </w:numbering>
@@ -27533,7 +27496,7 @@
     <w:autoRedefine/>
     <w:uiPriority w:val="39"/>
     <w:unhideWhenUsed/>
-    <w:rsid w:val="00B23A6D"/>
+    <w:rsid w:val="00410099"/>
     <w:pPr>
       <w:spacing w:after="40" w:line="240" w:lineRule="auto"/>
     </w:pPr>
@@ -27549,7 +27512,7 @@
     <w:autoRedefine/>
     <w:uiPriority w:val="39"/>
     <w:unhideWhenUsed/>
-    <w:rsid w:val="00B23A6D"/>
+    <w:rsid w:val="00410099"/>
     <w:pPr>
       <w:spacing w:after="40" w:line="240" w:lineRule="auto"/>
       <w:ind w:left="210"/>

</xml_diff>

<commit_message>
docs: fix acknowledgement page to match template structure
</commit_message>
<xml_diff>
--- a/ChainGuard_v2_Technical_Seminar_Report.docx
+++ b/ChainGuard_v2_Technical_Seminar_Report.docx
@@ -45,7 +45,7 @@
                 <w:noProof/>
               </w:rPr>
               <w:drawing>
-                <wp:inline distT="0" distB="0" distL="0" distR="0" wp14:anchorId="2CF23864" wp14:editId="636A26EF">
+                <wp:inline distT="0" distB="0" distL="0" distR="0" wp14:anchorId="5EDB5398" wp14:editId="1F22CC7B">
                   <wp:extent cx="566928" cy="566928"/>
                   <wp:effectExtent l="0" t="0" r="0" b="0"/>
                   <wp:docPr id="1" name="Picture 1"/>
@@ -155,7 +155,7 @@
                 <w:noProof/>
               </w:rPr>
               <w:drawing>
-                <wp:inline distT="0" distB="0" distL="0" distR="0" wp14:anchorId="7A6495C5" wp14:editId="7FD2A125">
+                <wp:inline distT="0" distB="0" distL="0" distR="0" wp14:anchorId="150B517E" wp14:editId="6E421B33">
                   <wp:extent cx="530352" cy="590495"/>
                   <wp:effectExtent l="0" t="0" r="0" b="0"/>
                   <wp:docPr id="2" name="Picture 2"/>
@@ -538,7 +538,7 @@
               </w:rPr>
               <w:lastRenderedPageBreak/>
               <w:drawing>
-                <wp:inline distT="0" distB="0" distL="0" distR="0" wp14:anchorId="4E7D0EF0" wp14:editId="2EB2E8D4">
+                <wp:inline distT="0" distB="0" distL="0" distR="0" wp14:anchorId="791A57DA" wp14:editId="02A94ECB">
                   <wp:extent cx="566928" cy="566928"/>
                   <wp:effectExtent l="0" t="0" r="0" b="0"/>
                   <wp:docPr id="3" name="Picture 3"/>
@@ -648,7 +648,7 @@
                 <w:noProof/>
               </w:rPr>
               <w:drawing>
-                <wp:inline distT="0" distB="0" distL="0" distR="0" wp14:anchorId="209AC61D" wp14:editId="6CAF09BE">
+                <wp:inline distT="0" distB="0" distL="0" distR="0" wp14:anchorId="34407A51" wp14:editId="28A15497">
                   <wp:extent cx="530352" cy="590495"/>
                   <wp:effectExtent l="0" t="0" r="0" b="0"/>
                   <wp:docPr id="4" name="Picture 4"/>
@@ -1126,7 +1126,7 @@
         <w:spacing w:after="200"/>
       </w:pPr>
       <w:r>
-        <w:t>I would like to express my sincere gratitude to our seminar guide, Miss. Sakshi Ambadkar, for her continuous guidance, patient review and constructive criticism throughout the preparation of this report. Her questions repeatedly pushed us to separate what the prototype actually demonstrates from what we hoped it would demonstrate.</w:t>
+        <w:t>I take this opportunity to express my sincere gratitude to my seminar guide, Miss. Sakshi Ambadkar, for her valuable guidance, constant encouragement and helpful suggestions throughout the preparation of this seminar on “ChainGuard v2: A Tamper-Evident Last-Mile Logistics Control Plane for Sealed Dispatch, Customer-Authorised Custody Breaks and Unit-Exact Shrinkage Reconciliation”.</w:t>
       </w:r>
     </w:p>
     <w:p>
@@ -1134,7 +1134,7 @@
         <w:spacing w:after="200"/>
       </w:pPr>
       <w:r>
-        <w:t>I am thankful to the faculty members and the Department of Computer Science and Engineering at NMIET for providing the infrastructure, laboratory access and academic freedom needed to design, build and deploy this project. I also acknowledge the open-source communities behind React, TypeScript, Vite, Tailwind CSS, Zustand and the Python libraries used to prepare this document; their documentation made a small, independent implementation possible.</w:t>
+        <w:t>I am thankful to the Head of the Department of Computer Science and Engineering, Dr. Mahesh Wankhade, and to the Principal of Nutan Maharashtra Institute of Engineering and Technology, Talegaon, Dr. Pramod Patil, for providing the facilities and the academic environment needed to complete this work. I also thank the Subject Incharge and all the teaching and non-teaching staff of the department for their support.</w:t>
       </w:r>
     </w:p>
     <w:p>
@@ -1142,19 +1142,31 @@
         <w:spacing w:after="560"/>
       </w:pPr>
       <w:r>
-        <w:t>Finally, I extend my heartfelt thanks to my family, teammates and peers for their constant motivation, honest feedback and support during the completion of this seminar. The working prototype, the deployment and the demonstration dataset were built collaboratively, and the credit for anything that works belongs to the team.</w:t>
-      </w:r>
-    </w:p>
-    <w:p>
-      <w:pPr>
-        <w:spacing w:line="288" w:lineRule="auto"/>
+        <w:t>I am grateful to the researchers and technical resources that helped me understand custody control planes, tamper-evident dispatch, unit-exact shrinkage reconciliation and last-mile logistics workflows. Finally, I am grateful to my parents and friends for their motivation and support during the preparation of this report.</w:t>
+      </w:r>
+    </w:p>
+    <w:p>
+      <w:pPr>
+        <w:spacing w:after="20" w:line="288" w:lineRule="auto"/>
         <w:jc w:val="right"/>
       </w:pPr>
       <w:r>
         <w:rPr>
           <w:sz w:val="22"/>
         </w:rPr>
-        <w:t>Vivek Rathod (B49)</w:t>
+        <w:t>Vivek Rathod</w:t>
+      </w:r>
+    </w:p>
+    <w:p>
+      <w:pPr>
+        <w:spacing w:after="20" w:line="288" w:lineRule="auto"/>
+        <w:jc w:val="right"/>
+      </w:pPr>
+      <w:r>
+        <w:rPr>
+          <w:sz w:val="22"/>
+        </w:rPr>
+        <w:t>Roll No: B49</w:t>
       </w:r>
     </w:p>
     <w:p>
@@ -1167,7 +1179,7 @@
           <w:i/>
           <w:sz w:val="22"/>
         </w:rPr>
-        <w:t>(T.Y. B.E., NMIET)</w:t>
+        <w:t>Third Year Computer Science and Engineering</w:t>
       </w:r>
     </w:p>
     <w:p>
@@ -1695,7 +1707,7 @@
           <w:noProof/>
           <w:webHidden/>
         </w:rPr>
-        <w:instrText xml:space="preserve"> PAGEREF _Toc244294424 \h </w:instrText>
+        <w:instrText xml:space="preserve"> PAGEREF _Toc244297341 \h </w:instrText>
       </w:r>
       <w:r>
         <w:rPr>
@@ -1767,7 +1779,7 @@
           <w:noProof/>
           <w:webHidden/>
         </w:rPr>
-        <w:instrText xml:space="preserve"> PAGEREF _Toc244294425 \h </w:instrText>
+        <w:instrText xml:space="preserve"> PAGEREF _Toc244297342 \h </w:instrText>
       </w:r>
       <w:r>
         <w:rPr>
@@ -1839,7 +1851,7 @@
           <w:noProof/>
           <w:webHidden/>
         </w:rPr>
-        <w:instrText xml:space="preserve"> PAGEREF _Toc244294426 \h </w:instrText>
+        <w:instrText xml:space="preserve"> PAGEREF _Toc244297343 \h </w:instrText>
       </w:r>
       <w:r>
         <w:rPr>
@@ -1911,7 +1923,7 @@
           <w:noProof/>
           <w:webHidden/>
         </w:rPr>
-        <w:instrText xml:space="preserve"> PAGEREF _Toc244294427 \h </w:instrText>
+        <w:instrText xml:space="preserve"> PAGEREF _Toc244297344 \h </w:instrText>
       </w:r>
       <w:r>
         <w:rPr>
@@ -1983,7 +1995,7 @@
           <w:noProof/>
           <w:webHidden/>
         </w:rPr>
-        <w:instrText xml:space="preserve"> PAGEREF _Toc244294428 \h </w:instrText>
+        <w:instrText xml:space="preserve"> PAGEREF _Toc244297345 \h </w:instrText>
       </w:r>
       <w:r>
         <w:rPr>
@@ -2055,7 +2067,7 @@
           <w:noProof/>
           <w:webHidden/>
         </w:rPr>
-        <w:instrText xml:space="preserve"> PAGEREF _Toc244294429 \h </w:instrText>
+        <w:instrText xml:space="preserve"> PAGEREF _Toc244297346 \h </w:instrText>
       </w:r>
       <w:r>
         <w:rPr>
@@ -2127,7 +2139,7 @@
           <w:noProof/>
           <w:webHidden/>
         </w:rPr>
-        <w:instrText xml:space="preserve"> PAGEREF _Toc244294430 \h </w:instrText>
+        <w:instrText xml:space="preserve"> PAGEREF _Toc244297347 \h </w:instrText>
       </w:r>
       <w:r>
         <w:rPr>
@@ -2199,7 +2211,7 @@
           <w:noProof/>
           <w:webHidden/>
         </w:rPr>
-        <w:instrText xml:space="preserve"> PAGEREF _Toc244294431 \h </w:instrText>
+        <w:instrText xml:space="preserve"> PAGEREF _Toc244297348 \h </w:instrText>
       </w:r>
       <w:r>
         <w:rPr>
@@ -2271,7 +2283,7 @@
           <w:noProof/>
           <w:webHidden/>
         </w:rPr>
-        <w:instrText xml:space="preserve"> PAGEREF _Toc244294432 \h </w:instrText>
+        <w:instrText xml:space="preserve"> PAGEREF _Toc244297349 \h </w:instrText>
       </w:r>
       <w:r>
         <w:rPr>
@@ -2343,7 +2355,7 @@
           <w:noProof/>
           <w:webHidden/>
         </w:rPr>
-        <w:instrText xml:space="preserve"> PAGEREF _Toc244294433 \h </w:instrText>
+        <w:instrText xml:space="preserve"> PAGEREF _Toc244297350 \h </w:instrText>
       </w:r>
       <w:r>
         <w:rPr>
@@ -2415,7 +2427,7 @@
           <w:noProof/>
           <w:webHidden/>
         </w:rPr>
-        <w:instrText xml:space="preserve"> PAGEREF _Toc244294434 \h </w:instrText>
+        <w:instrText xml:space="preserve"> PAGEREF _Toc244297351 \h </w:instrText>
       </w:r>
       <w:r>
         <w:rPr>
@@ -2487,7 +2499,7 @@
           <w:noProof/>
           <w:webHidden/>
         </w:rPr>
-        <w:instrText xml:space="preserve"> PAGEREF _Toc244294435 \h </w:instrText>
+        <w:instrText xml:space="preserve"> PAGEREF _Toc244297352 \h </w:instrText>
       </w:r>
       <w:r>
         <w:rPr>
@@ -2559,7 +2571,7 @@
           <w:noProof/>
           <w:webHidden/>
         </w:rPr>
-        <w:instrText xml:space="preserve"> PAGEREF _Toc244294436 \h </w:instrText>
+        <w:instrText xml:space="preserve"> PAGEREF _Toc244297353 \h </w:instrText>
       </w:r>
       <w:r>
         <w:rPr>
@@ -2631,7 +2643,7 @@
           <w:noProof/>
           <w:webHidden/>
         </w:rPr>
-        <w:instrText xml:space="preserve"> PAGEREF _Toc244294437 \h </w:instrText>
+        <w:instrText xml:space="preserve"> PAGEREF _Toc244297354 \h </w:instrText>
       </w:r>
       <w:r>
         <w:rPr>
@@ -2703,7 +2715,7 @@
           <w:noProof/>
           <w:webHidden/>
         </w:rPr>
-        <w:instrText xml:space="preserve"> PAGEREF _Toc244294438 \h </w:instrText>
+        <w:instrText xml:space="preserve"> PAGEREF _Toc244297355 \h </w:instrText>
       </w:r>
       <w:r>
         <w:rPr>
@@ -2775,7 +2787,7 @@
           <w:noProof/>
           <w:webHidden/>
         </w:rPr>
-        <w:instrText xml:space="preserve"> PAGEREF _Toc244294439 \h </w:instrText>
+        <w:instrText xml:space="preserve"> PAGEREF _Toc244297356 \h </w:instrText>
       </w:r>
       <w:r>
         <w:rPr>
@@ -2847,7 +2859,7 @@
           <w:noProof/>
           <w:webHidden/>
         </w:rPr>
-        <w:instrText xml:space="preserve"> PAGEREF _Toc244294440 \h </w:instrText>
+        <w:instrText xml:space="preserve"> PAGEREF _Toc244297357 \h </w:instrText>
       </w:r>
       <w:r>
         <w:rPr>
@@ -2919,7 +2931,7 @@
           <w:noProof/>
           <w:webHidden/>
         </w:rPr>
-        <w:instrText xml:space="preserve"> PAGEREF _Toc244294441 \h </w:instrText>
+        <w:instrText xml:space="preserve"> PAGEREF _Toc244297358 \h </w:instrText>
       </w:r>
       <w:r>
         <w:rPr>
@@ -2991,7 +3003,7 @@
           <w:noProof/>
           <w:webHidden/>
         </w:rPr>
-        <w:instrText xml:space="preserve"> PAGEREF _Toc244294442 \h </w:instrText>
+        <w:instrText xml:space="preserve"> PAGEREF _Toc244297359 \h </w:instrText>
       </w:r>
       <w:r>
         <w:rPr>
@@ -3063,7 +3075,7 @@
           <w:noProof/>
           <w:webHidden/>
         </w:rPr>
-        <w:instrText xml:space="preserve"> PAGEREF _Toc244294443 \h </w:instrText>
+        <w:instrText xml:space="preserve"> PAGEREF _Toc244297360 \h </w:instrText>
       </w:r>
       <w:r>
         <w:rPr>
@@ -3135,7 +3147,7 @@
           <w:noProof/>
           <w:webHidden/>
         </w:rPr>
-        <w:instrText xml:space="preserve"> PAGEREF _Toc244294444 \h </w:instrText>
+        <w:instrText xml:space="preserve"> PAGEREF _Toc244297361 \h </w:instrText>
       </w:r>
       <w:r>
         <w:rPr>
@@ -3207,7 +3219,7 @@
           <w:noProof/>
           <w:webHidden/>
         </w:rPr>
-        <w:instrText xml:space="preserve"> PAGEREF _Toc244294445 \h </w:instrText>
+        <w:instrText xml:space="preserve"> PAGEREF _Toc244297362 \h </w:instrText>
       </w:r>
       <w:r>
         <w:rPr>
@@ -3279,7 +3291,7 @@
           <w:noProof/>
           <w:webHidden/>
         </w:rPr>
-        <w:instrText xml:space="preserve"> PAGEREF _Toc244294446 \h </w:instrText>
+        <w:instrText xml:space="preserve"> PAGEREF _Toc244297363 \h </w:instrText>
       </w:r>
       <w:r>
         <w:rPr>
@@ -3351,7 +3363,7 @@
           <w:noProof/>
           <w:webHidden/>
         </w:rPr>
-        <w:instrText xml:space="preserve"> PAGEREF _Toc244294447 \h </w:instrText>
+        <w:instrText xml:space="preserve"> PAGEREF _Toc244297364 \h </w:instrText>
       </w:r>
       <w:r>
         <w:rPr>
@@ -3423,7 +3435,7 @@
           <w:noProof/>
           <w:webHidden/>
         </w:rPr>
-        <w:instrText xml:space="preserve"> PAGEREF _Toc244294448 \h </w:instrText>
+        <w:instrText xml:space="preserve"> PAGEREF _Toc244297365 \h </w:instrText>
       </w:r>
       <w:r>
         <w:rPr>
@@ -3495,7 +3507,7 @@
           <w:noProof/>
           <w:webHidden/>
         </w:rPr>
-        <w:instrText xml:space="preserve"> PAGEREF _Toc244294449 \h </w:instrText>
+        <w:instrText xml:space="preserve"> PAGEREF _Toc244297366 \h </w:instrText>
       </w:r>
       <w:r>
         <w:rPr>
@@ -3567,7 +3579,7 @@
           <w:noProof/>
           <w:webHidden/>
         </w:rPr>
-        <w:instrText xml:space="preserve"> PAGEREF _Toc244294450 \h </w:instrText>
+        <w:instrText xml:space="preserve"> PAGEREF _Toc244297367 \h </w:instrText>
       </w:r>
       <w:r>
         <w:rPr>
@@ -3640,7 +3652,7 @@
           <w:noProof/>
           <w:webHidden/>
         </w:rPr>
-        <w:instrText xml:space="preserve"> PAGEREF _Toc244294451 \h </w:instrText>
+        <w:instrText xml:space="preserve"> PAGEREF _Toc244297368 \h </w:instrText>
       </w:r>
       <w:r>
         <w:rPr>
@@ -6103,7 +6115,7 @@
       <w:pPr>
         <w:pStyle w:val="Heading1"/>
       </w:pPr>
-      <w:bookmarkStart w:id="7" w:name="_Toc244294424"/>
+      <w:bookmarkStart w:id="7" w:name="_Toc244297341"/>
       <w:r>
         <w:lastRenderedPageBreak/>
         <w:t>1. Introduction</w:t>
@@ -6114,7 +6126,7 @@
       <w:pPr>
         <w:pStyle w:val="Heading2"/>
       </w:pPr>
-      <w:bookmarkStart w:id="8" w:name="_Toc244294425"/>
+      <w:bookmarkStart w:id="8" w:name="_Toc244297342"/>
       <w:r>
         <w:t>1.1 Background</w:t>
       </w:r>
@@ -6137,7 +6149,7 @@
       <w:pPr>
         <w:pStyle w:val="Heading2"/>
       </w:pPr>
-      <w:bookmarkStart w:id="9" w:name="_Toc244294426"/>
+      <w:bookmarkStart w:id="9" w:name="_Toc244297343"/>
       <w:r>
         <w:t>1.2 Motivation</w:t>
       </w:r>
@@ -6232,7 +6244,7 @@
       <w:pPr>
         <w:pStyle w:val="Heading2"/>
       </w:pPr>
-      <w:bookmarkStart w:id="10" w:name="_Toc244294427"/>
+      <w:bookmarkStart w:id="10" w:name="_Toc244297344"/>
       <w:r>
         <w:t>1.3 Problem Statement</w:t>
       </w:r>
@@ -6339,7 +6351,7 @@
       <w:pPr>
         <w:pStyle w:val="Heading2"/>
       </w:pPr>
-      <w:bookmarkStart w:id="11" w:name="_Toc244294428"/>
+      <w:bookmarkStart w:id="11" w:name="_Toc244297345"/>
       <w:r>
         <w:t>1.4 Objectives</w:t>
       </w:r>
@@ -6454,7 +6466,7 @@
       <w:pPr>
         <w:pStyle w:val="Heading2"/>
       </w:pPr>
-      <w:bookmarkStart w:id="12" w:name="_Toc244294429"/>
+      <w:bookmarkStart w:id="12" w:name="_Toc244297346"/>
       <w:r>
         <w:t>1.5 Scope of the Seminar</w:t>
       </w:r>
@@ -6516,7 +6528,7 @@
       <w:pPr>
         <w:pStyle w:val="Heading1"/>
       </w:pPr>
-      <w:bookmarkStart w:id="13" w:name="_Toc244294430"/>
+      <w:bookmarkStart w:id="13" w:name="_Toc244297347"/>
       <w:r>
         <w:lastRenderedPageBreak/>
         <w:t>2. Literature Survey</w:t>
@@ -6527,7 +6539,7 @@
       <w:pPr>
         <w:pStyle w:val="Heading2"/>
       </w:pPr>
-      <w:bookmarkStart w:id="14" w:name="_Toc244294431"/>
+      <w:bookmarkStart w:id="14" w:name="_Toc244297348"/>
       <w:r>
         <w:t>2.1 Existing Work and Related Studies</w:t>
       </w:r>
@@ -6571,7 +6583,7 @@
       <w:pPr>
         <w:pStyle w:val="Heading2"/>
       </w:pPr>
-      <w:bookmarkStart w:id="15" w:name="_Toc244294432"/>
+      <w:bookmarkStart w:id="15" w:name="_Toc244297349"/>
       <w:r>
         <w:t>2.2 Summary of Research Papers</w:t>
       </w:r>
@@ -7511,7 +7523,7 @@
       <w:pPr>
         <w:pStyle w:val="Heading2"/>
       </w:pPr>
-      <w:bookmarkStart w:id="17" w:name="_Toc244294433"/>
+      <w:bookmarkStart w:id="17" w:name="_Toc244297350"/>
       <w:r>
         <w:t>2.3 Research Gaps</w:t>
       </w:r>
@@ -7647,7 +7659,7 @@
       <w:pPr>
         <w:pStyle w:val="Heading1"/>
       </w:pPr>
-      <w:bookmarkStart w:id="18" w:name="_Toc244294434"/>
+      <w:bookmarkStart w:id="18" w:name="_Toc244297351"/>
       <w:r>
         <w:lastRenderedPageBreak/>
         <w:t>3. Overview of the ChainGuard v2 Control Plane</w:t>
@@ -7658,7 +7670,7 @@
       <w:pPr>
         <w:pStyle w:val="Heading2"/>
       </w:pPr>
-      <w:bookmarkStart w:id="19" w:name="_Toc244294435"/>
+      <w:bookmarkStart w:id="19" w:name="_Toc244297352"/>
       <w:r>
         <w:t>3.1 Definition and Concept</w:t>
       </w:r>
@@ -7838,7 +7850,7 @@
       <w:pPr>
         <w:pStyle w:val="Heading2"/>
       </w:pPr>
-      <w:bookmarkStart w:id="20" w:name="_Toc244294436"/>
+      <w:bookmarkStart w:id="20" w:name="_Toc244297353"/>
       <w:r>
         <w:t>3.2 Architecture / Block Diagram</w:t>
       </w:r>
@@ -7855,7 +7867,7 @@
           <w:noProof/>
         </w:rPr>
         <w:drawing>
-          <wp:inline distT="0" distB="0" distL="0" distR="0" wp14:anchorId="1215BB9B" wp14:editId="66CAED44">
+          <wp:inline distT="0" distB="0" distL="0" distR="0" wp14:anchorId="5036E332" wp14:editId="64B6D3CC">
             <wp:extent cx="4572000" cy="3304515"/>
             <wp:effectExtent l="0" t="0" r="0" b="0"/>
             <wp:docPr id="5" name="Picture 5"/>
@@ -8027,7 +8039,7 @@
       <w:pPr>
         <w:pStyle w:val="Heading2"/>
       </w:pPr>
-      <w:bookmarkStart w:id="22" w:name="_Toc244294437"/>
+      <w:bookmarkStart w:id="22" w:name="_Toc244297354"/>
       <w:r>
         <w:t>3.3 Key Components and Technologies</w:t>
       </w:r>
@@ -8234,7 +8246,7 @@
           <w:noProof/>
         </w:rPr>
         <w:drawing>
-          <wp:inline distT="0" distB="0" distL="0" distR="0" wp14:anchorId="11FD403E" wp14:editId="3B964BA3">
+          <wp:inline distT="0" distB="0" distL="0" distR="0" wp14:anchorId="54E822C2" wp14:editId="688A4AA9">
             <wp:extent cx="4572000" cy="2942376"/>
             <wp:effectExtent l="0" t="0" r="0" b="0"/>
             <wp:docPr id="6" name="Picture 6"/>
@@ -9149,7 +9161,7 @@
       <w:pPr>
         <w:pStyle w:val="Heading1"/>
       </w:pPr>
-      <w:bookmarkStart w:id="25" w:name="_Toc244294438"/>
+      <w:bookmarkStart w:id="25" w:name="_Toc244297355"/>
       <w:r>
         <w:lastRenderedPageBreak/>
         <w:t>4. Working / Methodology</w:t>
@@ -9160,7 +9172,7 @@
       <w:pPr>
         <w:pStyle w:val="Heading2"/>
       </w:pPr>
-      <w:bookmarkStart w:id="26" w:name="_Toc244294439"/>
+      <w:bookmarkStart w:id="26" w:name="_Toc244297356"/>
       <w:r>
         <w:t>4.1 Working Principle</w:t>
       </w:r>
@@ -9182,7 +9194,7 @@
           <w:noProof/>
         </w:rPr>
         <w:drawing>
-          <wp:inline distT="0" distB="0" distL="0" distR="0" wp14:anchorId="0FE08023" wp14:editId="32A082FA">
+          <wp:inline distT="0" distB="0" distL="0" distR="0" wp14:anchorId="1C5F1B99" wp14:editId="07B28D22">
             <wp:extent cx="4572000" cy="3213980"/>
             <wp:effectExtent l="0" t="0" r="0" b="0"/>
             <wp:docPr id="7" name="Picture 7"/>
@@ -9458,7 +9470,7 @@
       <w:pPr>
         <w:pStyle w:val="Heading2"/>
       </w:pPr>
-      <w:bookmarkStart w:id="28" w:name="_Toc244294440"/>
+      <w:bookmarkStart w:id="28" w:name="_Toc244297357"/>
       <w:r>
         <w:t>4.2 Algorithms / Techniques Used</w:t>
       </w:r>
@@ -9844,7 +9856,7 @@
         </w:rPr>
         <w:lastRenderedPageBreak/>
         <w:drawing>
-          <wp:inline distT="0" distB="0" distL="0" distR="0" wp14:anchorId="52CD7681" wp14:editId="2F4809DB">
+          <wp:inline distT="0" distB="0" distL="0" distR="0" wp14:anchorId="67DD0EF1" wp14:editId="2693193B">
             <wp:extent cx="4572000" cy="3224463"/>
             <wp:effectExtent l="0" t="0" r="0" b="0"/>
             <wp:docPr id="8" name="Picture 8"/>
@@ -10226,7 +10238,7 @@
       <w:pPr>
         <w:pStyle w:val="Heading2"/>
       </w:pPr>
-      <w:bookmarkStart w:id="30" w:name="_Toc244294441"/>
+      <w:bookmarkStart w:id="30" w:name="_Toc244297358"/>
       <w:r>
         <w:t>4.3 Tools and Platforms</w:t>
       </w:r>
@@ -11670,7 +11682,7 @@
       <w:pPr>
         <w:pStyle w:val="Heading1"/>
       </w:pPr>
-      <w:bookmarkStart w:id="33" w:name="_Toc244294442"/>
+      <w:bookmarkStart w:id="33" w:name="_Toc244297359"/>
       <w:r>
         <w:lastRenderedPageBreak/>
         <w:t>5. Applications</w:t>
@@ -11681,7 +11693,7 @@
       <w:pPr>
         <w:pStyle w:val="Heading2"/>
       </w:pPr>
-      <w:bookmarkStart w:id="34" w:name="_Toc244294443"/>
+      <w:bookmarkStart w:id="34" w:name="_Toc244297360"/>
       <w:r>
         <w:t>5.1 Real-World Use Cases</w:t>
       </w:r>
@@ -11821,7 +11833,7 @@
       <w:pPr>
         <w:pStyle w:val="Heading2"/>
       </w:pPr>
-      <w:bookmarkStart w:id="35" w:name="_Toc244294444"/>
+      <w:bookmarkStart w:id="35" w:name="_Toc244297361"/>
       <w:r>
         <w:t>5.2 Case Study</w:t>
       </w:r>
@@ -11915,7 +11927,7 @@
       <w:pPr>
         <w:pStyle w:val="Heading1"/>
       </w:pPr>
-      <w:bookmarkStart w:id="36" w:name="_Toc244294445"/>
+      <w:bookmarkStart w:id="36" w:name="_Toc244297362"/>
       <w:r>
         <w:lastRenderedPageBreak/>
         <w:t>6. Advantages and Limitations</w:t>
@@ -11926,7 +11938,7 @@
       <w:pPr>
         <w:pStyle w:val="Heading2"/>
       </w:pPr>
-      <w:bookmarkStart w:id="37" w:name="_Toc244294446"/>
+      <w:bookmarkStart w:id="37" w:name="_Toc244297363"/>
       <w:r>
         <w:t>6.1 Advantages</w:t>
       </w:r>
@@ -12116,7 +12128,7 @@
       <w:pPr>
         <w:pStyle w:val="Heading2"/>
       </w:pPr>
-      <w:bookmarkStart w:id="38" w:name="_Toc244294447"/>
+      <w:bookmarkStart w:id="38" w:name="_Toc244297364"/>
       <w:r>
         <w:t>6.2 Limitations / Challenges</w:t>
       </w:r>
@@ -12412,7 +12424,7 @@
       <w:pPr>
         <w:pStyle w:val="Heading1"/>
       </w:pPr>
-      <w:bookmarkStart w:id="39" w:name="_Toc244294448"/>
+      <w:bookmarkStart w:id="39" w:name="_Toc244297365"/>
       <w:r>
         <w:lastRenderedPageBreak/>
         <w:t>7. Comparison with Existing Technologies</w:t>
@@ -13484,7 +13496,7 @@
       <w:pPr>
         <w:pStyle w:val="Heading1"/>
       </w:pPr>
-      <w:bookmarkStart w:id="41" w:name="_Toc244294449"/>
+      <w:bookmarkStart w:id="41" w:name="_Toc244297366"/>
       <w:r>
         <w:lastRenderedPageBreak/>
         <w:t>8. Future Scope</w:t>
@@ -13681,7 +13693,7 @@
       <w:pPr>
         <w:pStyle w:val="Heading1"/>
       </w:pPr>
-      <w:bookmarkStart w:id="42" w:name="_Toc244294450"/>
+      <w:bookmarkStart w:id="42" w:name="_Toc244297367"/>
       <w:r>
         <w:lastRenderedPageBreak/>
         <w:t>9. Conclusion</w:t>
@@ -13730,7 +13742,7 @@
         <w:spacing w:after="360"/>
         <w:jc w:val="center"/>
       </w:pPr>
-      <w:bookmarkStart w:id="43" w:name="_Toc244294451"/>
+      <w:bookmarkStart w:id="43" w:name="_Toc244297368"/>
       <w:r>
         <w:rPr>
           <w:rFonts w:ascii="Times New Roman" w:eastAsia="Times New Roman" w:hAnsi="Times New Roman" w:cs="Times New Roman"/>
@@ -16040,31 +16052,31 @@
       </w:rPr>
     </w:lvl>
   </w:abstractNum>
-  <w:num w:numId="1" w16cid:durableId="345644860">
+  <w:num w:numId="1" w16cid:durableId="1434784098">
     <w:abstractNumId w:val="8"/>
   </w:num>
-  <w:num w:numId="2" w16cid:durableId="1397239438">
+  <w:num w:numId="2" w16cid:durableId="249120681">
     <w:abstractNumId w:val="6"/>
   </w:num>
-  <w:num w:numId="3" w16cid:durableId="1903563432">
+  <w:num w:numId="3" w16cid:durableId="1443957013">
     <w:abstractNumId w:val="5"/>
   </w:num>
-  <w:num w:numId="4" w16cid:durableId="1814979379">
+  <w:num w:numId="4" w16cid:durableId="659817472">
     <w:abstractNumId w:val="4"/>
   </w:num>
-  <w:num w:numId="5" w16cid:durableId="1798446279">
+  <w:num w:numId="5" w16cid:durableId="1159539209">
     <w:abstractNumId w:val="7"/>
   </w:num>
-  <w:num w:numId="6" w16cid:durableId="34473922">
+  <w:num w:numId="6" w16cid:durableId="1983845951">
     <w:abstractNumId w:val="3"/>
   </w:num>
-  <w:num w:numId="7" w16cid:durableId="1824278002">
+  <w:num w:numId="7" w16cid:durableId="1451633729">
     <w:abstractNumId w:val="2"/>
   </w:num>
-  <w:num w:numId="8" w16cid:durableId="213975499">
+  <w:num w:numId="8" w16cid:durableId="2041589048">
     <w:abstractNumId w:val="1"/>
   </w:num>
-  <w:num w:numId="9" w16cid:durableId="1475759390">
+  <w:num w:numId="9" w16cid:durableId="841701686">
     <w:abstractNumId w:val="0"/>
   </w:num>
 </w:numbering>
@@ -27496,7 +27508,7 @@
     <w:autoRedefine/>
     <w:uiPriority w:val="39"/>
     <w:unhideWhenUsed/>
-    <w:rsid w:val="00410099"/>
+    <w:rsid w:val="0024229F"/>
     <w:pPr>
       <w:spacing w:after="40" w:line="240" w:lineRule="auto"/>
     </w:pPr>
@@ -27512,7 +27524,7 @@
     <w:autoRedefine/>
     <w:uiPriority w:val="39"/>
     <w:unhideWhenUsed/>
-    <w:rsid w:val="00410099"/>
+    <w:rsid w:val="0024229F"/>
     <w:pPr>
       <w:spacing w:after="40" w:line="240" w:lineRule="auto"/>
       <w:ind w:left="210"/>

</xml_diff>